<commit_message>
paper: BK21 acknowledgment in 후기, author romanization Hyunyong Jung
후기: 4단계 BK21사업(2120240815267), 국문, single acknowledgment so the
conditional '부분적으로' is omitted per the program's own instruction.
Su-Won Lee's romanization is still unverified.
</commit_message>
<xml_diff>
--- a/paper/ksas_2026_fall/manuscript.docx
+++ b/paper/ksas_2026_fall/manuscript.docx
@@ -1,6 +1,6 @@
 
 <file path=word/document.xml><?xml version="1.0" encoding="utf-8"?>
-<w:document xmlns:ns1="http://schemas.openxmlformats.org/markup-compatibility/2006" xmlns:ns2="http://schemas.microsoft.com/office/word/2010/wordml" xmlns:ns3="http://schemas.openxmlformats.org/officeDocument/2006/relationships" xmlns:w="http://schemas.openxmlformats.org/wordprocessingml/2006/main" ns1:Ignorable="w14 w15 w16se w16cid w16 w16cex w16sdtdh w16sdtfl w16du wp14">
+<w:document xmlns:ns1="http://schemas.openxmlformats.org/markup-compatibility/2006" xmlns:ns2="http://schemas.microsoft.com/office/word/2010/wordml" xmlns:ns3="http://schemas.openxmlformats.org/officeDocument/2006/relationships" xmlns:ns4="http://schemas.openxmlformats.org/drawingml/2006/wordprocessingDrawing" xmlns:ns5="http://schemas.openxmlformats.org/drawingml/2006/main" xmlns:ns6="http://schemas.openxmlformats.org/drawingml/2006/picture" xmlns:w="http://schemas.openxmlformats.org/wordprocessingml/2006/main" ns1:Ignorable="w14 w15 w16se w16cid w16 w16cex w16sdtdh w16sdtfl w16du wp14">
   <w:body>
     <w:p ns2:paraId="5D7AF68C" ns2:textId="4DEAD5F6">
       <w:pPr>
@@ -54,7 +54,7 @@
         </w:rPr>
       </w:pPr>
       <w:r>
-        <w:t xml:space="preserve">Hyeon-Yong Jeong1*, Su-Won Lee1</w:t>
+        <w:t xml:space="preserve">Hyunyong Jung1*, Su-Won Lee1</w:t>
       </w:r>
     </w:p>
     <w:p ns2:paraId="7F3B6F09" ns2:textId="77777777">
@@ -386,37 +386,37 @@
       </w:pPr>
       <w:r>
         <w:drawing>
-          <wp:inline xmlns:wp="http://schemas.openxmlformats.org/drawingml/2006/wordprocessingDrawing" distT="0" distB="0" distL="0" distR="0">
-            <wp:extent cx="2879725" cy="1087896"/>
-            <wp:effectExtent l="0" t="0" r="0" b="0"/>
-            <wp:docPr id="1001" name="Picture 1" descr="occlusion figure"/>
-            <wp:cNvGraphicFramePr/>
-            <a:graphic xmlns:a="http://schemas.openxmlformats.org/drawingml/2006/main">
-              <a:graphicData uri="http://schemas.openxmlformats.org/drawingml/2006/picture">
-                <pic:pic xmlns:pic="http://schemas.openxmlformats.org/drawingml/2006/picture">
-                  <pic:nvPicPr>
-                    <pic:cNvPr id="1001" name="occlusion_figure.png"/>
-                    <pic:cNvPicPr/>
-                  </pic:nvPicPr>
-                  <pic:blipFill>
-                    <a:blip ns3:embed="rId100"/>
-                    <a:stretch>
-                      <a:fillRect/>
-                    </a:stretch>
-                  </pic:blipFill>
-                  <pic:spPr>
-                    <a:xfrm>
-                      <a:off x="0" y="0"/>
-                      <a:ext cx="2879725" cy="1087896"/>
-                    </a:xfrm>
-                    <a:prstGeom prst="rect">
-                      <a:avLst/>
-                    </a:prstGeom>
-                  </pic:spPr>
-                </pic:pic>
-              </a:graphicData>
-            </a:graphic>
-          </wp:inline>
+          <ns4:inline distT="0" distB="0" distL="0" distR="0">
+            <ns4:extent cx="2879725" cy="1087896"/>
+            <ns4:effectExtent l="0" t="0" r="0" b="0"/>
+            <ns4:docPr id="1001" name="Picture 1" descr="occlusion figure"/>
+            <ns4:cNvGraphicFramePr/>
+            <ns5:graphic>
+              <ns5:graphicData uri="http://schemas.openxmlformats.org/drawingml/2006/picture">
+                <ns6:pic>
+                  <ns6:nvPicPr>
+                    <ns6:cNvPr id="1001" name="occlusion_figure.png"/>
+                    <ns6:cNvPicPr/>
+                  </ns6:nvPicPr>
+                  <ns6:blipFill>
+                    <ns5:blip ns3:embed="rId100"/>
+                    <ns5:stretch>
+                      <ns5:fillRect/>
+                    </ns5:stretch>
+                  </ns6:blipFill>
+                  <ns6:spPr>
+                    <ns5:xfrm>
+                      <ns5:off x="0" y="0"/>
+                      <ns5:ext cx="2879725" cy="1087896"/>
+                    </ns5:xfrm>
+                    <ns5:prstGeom prst="rect">
+                      <ns5:avLst/>
+                    </ns5:prstGeom>
+                  </ns6:spPr>
+                </ns6:pic>
+              </ns5:graphicData>
+            </ns5:graphic>
+          </ns4:inline>
         </w:drawing>
       </w:r>
     </w:p>
@@ -493,6 +493,14 @@
           <w:rFonts w:hint="eastAsia"/>
         </w:rPr>
         <w:t xml:space="preserve">후 기</w:t>
+      </w:r>
+    </w:p>
+    <w:p ns2:paraId="7547031E" ns2:textId="77777777">
+      <w:pPr>
+        <w:pStyle w:val="ab"/>
+      </w:pPr>
+      <w:r>
+        <w:t xml:space="preserve">본 연구는 대한민국 정부(교육부)의 재원으로 한국연구재단의 4단계 BK21사업(2120240815267)의 지원을 받았음.</w:t>
       </w:r>
     </w:p>
     <w:p ns2:paraId="6A07DDCF" ns2:textId="77777777">

</xml_diff>

<commit_message>
paper(A2): §2.3 states the wall the code builds, §2.4 the loiter demo
</commit_message>
<xml_diff>
--- a/paper/ksas_2026_fall/manuscript.docx
+++ b/paper/ksas_2026_fall/manuscript.docx
@@ -140,7 +140,7 @@
         <w:pStyle w:val="ab"/>
       </w:pPr>
       <w:r>
-        <w:t xml:space="preserve">기존 접근은 크게 두 갈래이다. 볼록 최적화 계열은 자유 공간을 볼록 영역으로 미리 분할한 뒤 어느 영역을 지날지 고르는 조합적 계층을 둔다</w:t>
+        <w:t xml:space="preserve">기존 접근은 크게 두 갈래이다. 볼록 최적화 계열은 자유 공간을 볼록 영역으로 미리 분할한 뒤, 어느 영역을 지날지를 혼합정수계획이나 그래프 탐색으로 먼저 고르는 단계를 둔다</w:t>
       </w:r>
       <w:r>
         <w:rPr>
@@ -149,7 +149,7 @@
         <w:t xml:space="preserve">(2)</w:t>
       </w:r>
       <w:r>
-        <w:t xml:space="preserve">. 분할과 선택이 최적화 이전에 고정되므로, 이동 장애물을 다루려면 공간-시간에서 영역의 수가 늘어난다</w:t>
+        <w:t xml:space="preserve">. 분할과 선택이 최적화 이전에 고정되므로, 이동 장애물을 다루려면 공간-시간에서 미리 만들어 둘 볼록 영역의 수가 늘어난다</w:t>
       </w:r>
       <w:r>
         <w:rPr>
@@ -158,7 +158,7 @@
         <w:t xml:space="preserve">(1)</w:t>
       </w:r>
       <w:r>
-        <w:t xml:space="preserve">. 시간을 곡선의 매개변수로 두는 통로 기반 기법은 시간 배분이 매듭에 의해 고정되고, 볼록 껍질 성질을 얻기 위해 별도의 충분조건을 필요로 한다</w:t>
+        <w:t xml:space="preserve">. 시간을 곡선의 매개변수로 두는 통로 기반 기법은 시간 배분이 스플라인의 매듭(knot) 벡터에 의해 미리 고정되고, 볼록 껍질 성질을 얻기 위해 별도의 충분조건이 필요하다</w:t>
       </w:r>
       <w:r>
         <w:rPr>
@@ -167,7 +167,7 @@
         <w:t xml:space="preserve">(3,5)</w:t>
       </w:r>
       <w:r>
-        <w:t xml:space="preserve">. 표본 기반 공간-시간 계획법은 도착 시각을 자유롭게 두지만 매끄러운 곡선을 직접 산출하지는 않는다</w:t>
+        <w:t xml:space="preserve">. 표본추출 기반(sampling-based) 공간-시간 계획법은 도착 시각을 자유롭게 두지만 매끄러운 곡선을 직접 산출하지는 않는다</w:t>
       </w:r>
       <w:r>
         <w:rPr>
@@ -184,7 +184,7 @@
         <w:pStyle w:val="ab"/>
       </w:pPr>
       <w:r>
-        <w:t xml:space="preserve">본 논문은 이동 장애물의 볼록 외부 근사를 풀기 전에 고정하지 않고, 리프팅된 공간에서 현재 반복점의 국소 이웃 위에 순차 볼록 최적화(sequential convex programming, SCP) 반복마다 다시 구성하는 궤적 최적화 정식화를 제안한다. 자유 공간을 볼록 영역으로 미리 분할하지 않으며, 어느 영역을 지날지 고르는 조합적 계층도 두지 않는다. 기여는 세 가지이다. 첫째, 장애물의 운동이 임의로 주어져 KOZ 관이 휘더라도 관 전체가 볼록일 필요가 없다. 관을 분할구간 둘레의 구로 잘라 얻은 클리핑된 KOZ 볼륨에 대한 지지 반공간(supporting half-space)만 세우면 되고, 집합과 그 볼록 껍질의 지지 함수가 모든 방향에서 같으므로 볼록 껍질을 실제로 만들 필요도 없다. 둘째, 그 반공간을 분할구간과 장애물과 클리핑된 볼륨의 연결 성분마다 하나씩 두고 해당 분할구간의 모든 제어점에 부과하면 연속 시간에 대한 볼록 껍질 보장이 유지되며, 제어점마다 다른 평면을 부과하면 이 보장은 유한 개의 점 조건으로 약해진다. 셋째, 동일한 구성이 휘어진 KOZ 관과 움직이는 차폐체의 그림자를 함께 처리한다. 시간을 곡선의 좌표로 두는 것 자체는 선행 연구가 이미 제시한 부분이며</w:t>
+        <w:t xml:space="preserve">본 논문은 이동 장애물의 볼록 외부 근사를 풀기 전에 고정하는 대신, 리프팅된 공간에서 현재 반복점의 국소 이웃에 대해 순차 볼록 계획법(sequential convex programming, SCP) 반복마다 다시 구성하는 궤적 최적화 정식화를 제안한다. 자유 공간을 볼록 영역으로 미리 분할하지 않으며, 어느 영역을 지날지 먼저 고르는 단계도 두지 않는다. 기여는 다음 세 가지이다. 첫째, 움직이는 장애물의 keep-out zone(KOZ)은 리프팅된 공간에서 하나의 관이 되며, 운동이 임의로 주어져 이 관이 휘더라도 관 전체가 볼록일 필요가 없다. 분할구간의 무게중심을 중심으로 하는 구로 관을 잘라 얻은 클리핑된 KOZ 볼륨에 대한 지지 반공간(supporting half-space)만 세우면 되고, 집합과 그 볼록 껍질의 지지 함수가 모든 방향에서 같으므로 볼록 껍질을 실제로 만들 필요도 없다. 둘째, 그 반공간을 분할구간과 장애물의 조합마다, 장애물의 국소 접근 하나에 하나씩 두고 해당 분할구간의 모든 제어점에 부과하면 연속 시간에 대한 볼록 껍질 보장이 유지되며, 제어점마다 다른 평면을 부과하면 이 보장은 유한 개의 점 조건으로 약해진다. 셋째, 동일한 구성이 휘어진 KOZ 관과 움직이는 장애물의 그림자를 함께 처리한다. 시간을 곡선의 좌표로 두는 구성 자체는 선행 연구에서 이미 제시되었으며</w:t>
       </w:r>
       <w:r>
         <w:rPr>
@@ -230,7 +230,7 @@
         <w:pStyle w:val="ab"/>
       </w:pPr>
       <w:r>
-        <w:t xml:space="preserve">시간을 곡선의 좌표로 포함하면, 등속으로 움직이는 구형 keep-out zone(KOZ)은 리프팅된 공간에서 기울어진 정적인 관이 된다. 시간이 매개변수가 아니라 좌표이므로 Bézier 곡선의 볼록 껍질 성질이 추가 조건 없이 그대로 성립한다. 결정 변수는 제어점이며, De Casteljau 분할로 얻은 각 분할구간이 제약을 부과하는 단위이다. 각 분할구간에 대하여 그 제어점들의 평균을 분할구간의 중심으로, 중심에서 제어점까지의 최대 거리를 분할구간의 반지름으로 정의한다. 시간 좌표에는 단조 증가와 최소 시간 간격을 부과한다.</w:t>
+        <w:t xml:space="preserve">시간을 곡선의 좌표로 포함하면, 등속으로 움직이는 구형 KOZ(또는 장애물)는 리프팅된 공간에서 기울어진 정적인 관이 된다. 시간이 매개변수가 아니라 좌표이므로 Bézier 곡선의 볼록 껍질 성질이 추가 조건 없이 그대로 성립한다. 결정 변수는 제어점이며, De Casteljau 분할로 얻은 각 분할구간이 제약을 부과하는 단위이다. 각 분할구간에 대하여 그 제어점들의 평균을 분할구간의 무게중심으로, 무게중심에서 제어점까지의 최대 거리를 분할구간의 반지름으로 정의한다. 시간 좌표에는 단조 증가와 최소 시간 간격을 부과한다.</w:t>
       </w:r>
     </w:p>
     <w:p>
@@ -246,39 +246,36 @@
         <w:pStyle w:val="ab"/>
       </w:pPr>
       <w:r>
-        <w:t xml:space="preserve">장애물의 운동이 등속이 아니면 리프팅된 공간에서 KOZ 관이 휘어 비볼록이 되고, 관 전체를 지지하는 반공간은 존재하지 않는다. 제안 기법은 관 전체가 아니라 관의 일부만 다룬다. 분할구간의 중심을 중심으로 하고 KOZ 중심선까지의 최단 거리를 반지름으로 하는 구를 잡아, KOZ와 이 구의 교집합을 클리핑된 KOZ 볼륨으로 정의한다. 구가 중심선에 접하므로 교집합은 접점 부근에 놓이고, 관의 가장 가까운 물질이 분할구간의 중심에서 장애물 반지름만큼 떨어진 곳에 있으므로 교집합은 항상 비어 있지 않다. 반지름이 거리에 따라 스스로 정해지므로 분할구간이 관에서 멀면 구가 커지고, 가까우면 제약이 실제로 작용하는 자리에서 작아진다.</w:t>
-      </w:r>
-    </w:p>
-    <w:p ns2:paraId="7547031E" ns2:textId="77777777">
-      <w:pPr>
-        <w:pStyle w:val="ab"/>
-      </w:pPr>
-      <w:r>
-        <w:t xml:space="preserve">반지름에는 상한을 둔다. 장애물의 반지름과 분할구간 자신의 반지름과 한 번의 신뢰 구간 이동이 제어점을 옮길 수 있는 최대 거리를 더한 값이 상한이며, 이를 넘는 분할구간은 한 번의 반복 안에 관에 닿을 수 없으므로 제약을 만들지 않는다. 이 상한은 멀리 있는 장애물을 계산에서 제외하기 위한 것이고, 제약이 구속될 수 없는 곳에서만 작용하므로 보장을 약화시키지 않는다.</w:t>
-      </w:r>
-    </w:p>
-    <w:p ns2:paraId="7547031E" ns2:textId="77777777">
-      <w:pPr>
-        <w:pStyle w:val="ab"/>
-      </w:pPr>
-      <w:r>
-        <w:t xml:space="preserve">여기서 잘라내는 대상은 중심선의 시간 구간이 아니라 볼륨 자체이다. 중심선의 매개변수 구간을 골라 그 구간의 볼록 껍질을 장애물 반지름만큼 부풀리는 구성은 이 교집합을 재현하지 못한다. 교집합은 볼록화에 대해서도 부풀림에 대해서도 분배되지 않으므로 그렇게 얻은 집합은 클리핑된 KOZ 볼륨을 진부분집합으로 포함하고, 무엇보다 구가 관을 두 군데에서 자르는 경우에 두 조각을 하나로 합쳐 버린다.</w:t>
-      </w:r>
+        <w:t xml:space="preserve">장애물의 운동이 등속이 아니면 리프팅된 공간에서 KOZ 관이 휘어 비볼록이 되고, 관 전체를 지지하는 반공간은 존재하지 않는다. 제안 기법은 이 비볼록 회피 조건을 현재 반복점 주변에서 국소적으로 선형화한다. 분할구간의 무게중심을 중심으로 하고 KOZ 중심선까지의 최단 거리를 반지름으로 하는 구를 잡아, KOZ와 이 구의 교집합을 클리핑된 KOZ 볼륨으로 정의한다. 구가 중심선에 접하고, 무게중심에서 관 표면까지의 거리는 중심선까지의 거리에서 장애물 반지름을 뺀 값이므로, 교집합은 항상 비어 있지 않다. 반지름이 거리에 따라 스스로 정해지므로 분할구간이 관에서 멀면 구가 커지고, 가까우면 제약이 구속되는 곳에서 작아진다.</w:t>
+      </w:r>
+    </w:p>
+    <w:p ns2:paraId="7547031E" ns2:textId="77777777">
+      <w:pPr>
+        <w:pStyle w:val="ab"/>
+      </w:pPr>
+      <w:r>
+        <w:t xml:space="preserve">반지름에는 상한과 하한을 둔다. 상한은 장애물의 반지름, 분할구간 자신의 반지름, 한 번의 신뢰 구간(trust region) 이동이 제어점을 옮길 수 있는 최대 거리를 더한 값이며, 반지름이 이 상한을 넘는 분할구간은 한 번의 반복 안에 관에 닿을 수 없으므로 제약을 만들지 않는다. 상한은 멀리 있는 장애물을 계산에서 제외하기 위한 것이며, 제약이 구속될 수 없는 곳에서만 작용하므로 보장은 약해지지 않는다. 하한은 장애물의 반지름으로, 구가 장애물보다 작아지지 않게 하며 무게중심이 KOZ 안에 있을 때에만 구속된다.</w:t>
+      </w:r>
+    </w:p>
+    <w:p ns2:paraId="7547031E" ns2:textId="77777777">
+      <w:pPr>
+        <w:pStyle w:val="ab"/>
+      </w:pPr>
     </w:p>
     <w:p>
       <w:pPr>
         <w:pStyle w:val="a4"/>
       </w:pPr>
       <w:r>
-        <w:t xml:space="preserve">2.3 지지 반공간과 성분마다의 벽</w:t>
-      </w:r>
-    </w:p>
-    <w:p ns2:paraId="7547031E" ns2:textId="77777777">
-      <w:pPr>
-        <w:pStyle w:val="ab"/>
-      </w:pPr>
-      <w:r>
-        <w:t xml:space="preserve">클리핑된 KOZ 볼륨 가운데 분할구간의 중심에 가장 가까운 점을 찾고, 그 점에서 중심으로 향하는 단위 벡터를 외향 법선으로 둔다. 평면의 위치는 이 법선 방향으로 클리핑된 KOZ 볼륨이 가장 멀리 뻗는 값, 즉 그 볼륨의 지지 함수 값으로 정한다. 평면이 중심에 가장 가까운 점이 아니라 법선 방향으로 가장 많이 튀어나온 점 위에 놓이므로 볼륨 전체가 금지 쪽에 남는다. 이렇게 얻은 반공간을 그 분할구간의 모든 제어점에 부과하면, 볼록 껍질 성질에 의해 그 분할구간의 곡선 전체가 같은 반공간에 놓인다.</w:t>
+        <w:t xml:space="preserve">2.3 지지 반공간과 접근별 벽</w:t>
+      </w:r>
+    </w:p>
+    <w:p ns2:paraId="7547031E" ns2:textId="77777777">
+      <w:pPr>
+        <w:pStyle w:val="ab"/>
+      </w:pPr>
+      <w:r>
+        <w:t xml:space="preserve">반공간은 장애물이 분할구간에 가까워졌다가 멀어지는 국소 접근마다 하나씩 세운다. KOZ 중심선 위의 점에서 분할구간의 무게중심까지의 거리를 곡선 매개변수의 함수로 보고, 이 함수의 내부 극대점마다 매개변수 구간을 잘라 접근을 나눈다. 각 접근에서 무게중심에 가장 가까운 중심선의 점을 찾아 그 점에서 무게중심으로 향하는 단위 벡터를 외향 법선으로 두고, 평면의 위치는 클리핑된 KOZ 볼륨 가운데 그 접근에 속하는 부분이 법선 방향으로 가장 멀리 뻗는 값, 즉 그 부분의 지지 함수 값으로 정한다. 평면이 법선 방향으로 가장 많이 튀어나온 점 위에 놓이므로 그 부분 전체가 금지 쪽에 남고, 이 반공간을 분할구간의 모든 제어점에 부과하면 볼록 껍질 성질에 의해 분할구간의 곡선 전체가 같은 반공간에 놓인다. 접근의 경계를 거리의 극대점으로 두는 이유는 다음과 같다. 관이 굽어 무게중심을 감싸면 클리핑된 KOZ 볼륨은 하나의 연결 성분이지만 무게중심이 그 볼록 껍질 안에 들어가므로, 성분 전체를 지지하는 반공간은 존재하지 않는다. 극대점에서 자르면 같은 성분이 두 접근으로 나뉘어 각각 유효한 반공간을 얻고, 두 접근 사이의 통로로 굽은 관의 안쪽을 지나는 해가 남는다.</w:t>
       </w:r>
     </w:p>
     <w:p ns2:paraId="7547031E" ns2:textId="77777777">
@@ -294,31 +291,28 @@
         <w:pStyle w:val="ab"/>
       </w:pPr>
       <w:r>
-        <w:t xml:space="preserve">구가 관을 두 군데에서 자르면 클리핑된 KOZ 볼륨은 연결 성분 두 개가 되고, 성분마다 반공간을 하나씩 세운다. 성분을 하나로 합치면 두 성분 사이의 통로가 사라져 굽은 관의 안쪽으로 지나가는 해가 처음부터 제외되므로, 반공간의 개수를 성분의 개수에 맞추는 것이 관을 자르는 이유이다.</w:t>
-      </w:r>
-    </w:p>
-    <w:p ns2:paraId="7547031E" ns2:textId="77777777">
-      <w:pPr>
-        <w:pStyle w:val="ab"/>
-      </w:pPr>
-      <w:r>
-        <w:t xml:space="preserve">법선의 시간 성분은 0이 아니다. 리프팅된 공간에서 중심선이 기울어져 있으므로 이 항을 0으로 두면 평면이 관을 지지하지 못하며, 장애물이 등속인 특수한 경우에 한해 이 값은 공간 법선과 장애물 속도의 내적에 음의 부호를 붙인 값으로 환원된다. 반대로 제어점마다 다른 평면을 부과하면 볼록 껍질 성질을 쓸 수 없고, 보장이 유한 개의 점 조건으로 약해진다.</w:t>
-      </w:r>
-    </w:p>
-    <w:p ns2:paraId="7547031E" ns2:textId="77777777">
-      <w:pPr>
-        <w:pStyle w:val="ab"/>
-      </w:pPr>
-      <w:r>
-        <w:t xml:space="preserve">분할구간의 중심이 KOZ 안에 들어간 경우에는 가장 가까운 점이 중심 자신이 되어 법선의 방향이 정해지지 않는다. 이때에는 중심을 부풀리지 않은 중심선의 볼록 껍질 위로 사영하고 평면을 장애물 반지름만큼 밀어낸다. 이 평면은 클리핑된 KOZ 볼륨의 지지 평면보다 보수적이지만 중심이 안에 있을 때에도 정의되므로, 침범이 가장 깊은 자리에서 제약이 사라지는 것을 막는다.</w:t>
-      </w:r>
-    </w:p>
-    <w:p ns2:paraId="7547031E" ns2:textId="77777777">
-      <w:pPr>
-        <w:pStyle w:val="ab"/>
-      </w:pPr>
-      <w:r>
-        <w:t xml:space="preserve">회피는 목적함수의 페널티 항이 아니라 이 반공간에 의한 제약으로만 이루어진다. 목적함수는 매개변수 영역의 매끄러움 정규화 항과 도착 시각에 대한 선형 페널티 항으로 두고, 속도 제한은 제어 다각형의 변마다 부과하는 기울기 제한으로 처리한다. SCP에서 쓰는 여유 변수(slack variable)와 그 페널티 항은 하위 문제의 실현 가능성을 유지하기 위한 수치적 장치이며, 회피 기제가 아니다.</w:t>
+        <w:t xml:space="preserve">법선의 시간 성분은 0이 아니다. 리프팅된 공간에서 중심선이 기울어져 있으므로 이 성분을 0으로 두면 평면이 관을 지지하지 못하며, 장애물이 등속인 특수한 경우에 한해 이 값은 공간 법선과 장애물 속도의 내적에 음의 부호를 붙인 값으로 환원된다. 평면은 분할구간, 장애물, 접근의 조합마다 하나이며, 제어점마다 다른 평면을 부과하면 볼록 껍질 성질을 쓸 수 없어 보장이 유한 개의 점 조건으로 약해진다.</w:t>
+      </w:r>
+    </w:p>
+    <w:p ns2:paraId="7547031E" ns2:textId="77777777">
+      <w:pPr>
+        <w:pStyle w:val="ab"/>
+      </w:pPr>
+      <w:r>
+        <w:t xml:space="preserve">분할구간의 무게중심이 KOZ 안에 들어간 경우에도 같은 구성이 그대로 이어지며, 법선의 방향은 여전히 그 접근에서 무게중심에 가장 가까운 중심선의 점으로부터 얻는다. 이때 반공간의 여유는 음수가 되고, 제약은 곡선을 침범한 깊이만큼 법선 방향으로 밀어내는 조건으로 작동한다.</w:t>
+      </w:r>
+    </w:p>
+    <w:p ns2:paraId="7547031E" ns2:textId="77777777">
+      <w:pPr>
+        <w:pStyle w:val="ab"/>
+      </w:pPr>
+    </w:p>
+    <w:p ns2:paraId="7547031E" ns2:textId="77777777">
+      <w:pPr>
+        <w:pStyle w:val="ab"/>
+      </w:pPr>
+      <w:r>
+        <w:t xml:space="preserve">회피는 이 반공간 제약만으로 이루어지며, 목적함수의 페널티 항에 의존하지 않는다. 목적함수는 매개변수 영역의 매끄러움 정규화 항과 도착 시각에 대한 선형 페널티 항으로 두고, 속도 제한은 제어 다각형의 변마다 부과하는 기울기 제한으로 처리한다. SCP에서 쓰는 여유 변수(slack variable)와 그 페널티 항은 하위 문제의 실현 가능성을 보완해 줄 뿐이며, 회피 기제가 아니다.</w:t>
       </w:r>
     </w:p>
     <w:p>
@@ -334,24 +328,21 @@
         <w:pStyle w:val="ab"/>
       </w:pPr>
       <w:r>
-        <w:t xml:space="preserve">무인기가 지상국의 직접 통신 범위 안에서 임무를 수행할 때, 원격 조종과 실시간 데이터 전송은 시선이 유지되는 동안에만 성립한다. 시선이 끊기면 그 구간 동안 기체가 자율 판단에 맡겨지므로, 차폐를 사후에 확인하는 대신 궤적을 계획하는 단계에서 제약으로 부과할 필요가 있다. 본 논문은 지상국을 하나의 점으로 두고, 시선이 장애물에 가려지는 위치들의 집합을 차폐 영역으로 정의한다.</w:t>
-      </w:r>
-    </w:p>
-    <w:p ns2:paraId="7547031E" ns2:textId="77777777">
-      <w:pPr>
-        <w:pStyle w:val="ab"/>
-      </w:pPr>
-      <w:r>
-        <w:t xml:space="preserve">관측자가 점이고 장애물이 관측자를 포함하지 않는 볼록체이면 차폐 영역은 볼록이다. 관측자를 원점으로 삼으면 차폐 위치는 장애물의 어떤 점을 1 이상의 배율로 늘인 점이고, 두 차폐 위치의 볼록 결합을 배율의 같은 볼록 결합으로 나누면 장애물의 점이 되므로 그 결합 역시 차폐 위치이다. 이 성질은 차원에 무관하므로 3차원 공간의 구형 장애물에도 그대로 적용된다.</w:t>
-      </w:r>
-    </w:p>
-    <w:p ns2:paraId="7547031E" ns2:textId="77777777">
-      <w:pPr>
-        <w:pStyle w:val="ab"/>
-      </w:pPr>
-      <w:r>
-        <w:t xml:space="preserve">그러나 장애물이 움직이면 차폐 원뿔이 회전하므로 리프팅된 공간에서 차폐 영역은 볼록이 아니다. 이 비볼록성은 관측자까지의 거리 변화보다 원뿔의 회전이 지배하며, 시선을 가로지르는 접선 방향 운동에서 가장 크게 나타나고 장애물이 정지해 있으면 사라진다. 따라서 차폐 영역에는 KOZ 관과 동일한 구성을 그대로 적용한다. 같은 구로 차폐 영역을 잘라 클리핑된 차폐 볼륨을 얻고, 그 볼륨에서 분할구간의 중심에 가장 가까운 점과 그 방향의 지지 함수 값으로 반공간을 정하며, 연결 성분마다 하나씩 그 분할구간의 모든 제어점에 부과한다. 비볼록이고 시간에 따라 변하는 임무 제약을 하나 더 추가하는 비용은 분할구간과 차폐체와 지상국의 조합마다 반공간 한 줄이다.</w:t>
-      </w:r>
+        <w:t xml:space="preserve">기체가 지상국 상공의 회랑 층을 가로질러 통과할 때, 원격 조종과 실시간 데이터 전송은 지상국과의 가시선이 유지되는 동안에만 성립한다. 회랑과 지상국 사이에서 선회하는 장애물이 이 가시선을 끊을 수 있으므로, 차폐를 사후에 확인하는 대신 궤적을 계획하는 단계에서 제약으로 부과한다. 본 논문은 지상국을 하나의 점으로 두고, 가시선이 장애물에 가려지는 위치의 집합을 차폐 영역으로 정의한다.</w:t>
+      </w:r>
+    </w:p>
+    <w:p ns2:paraId="7547031E" ns2:textId="77777777">
+      <w:pPr>
+        <w:pStyle w:val="ab"/>
+      </w:pPr>
+      <w:r>
+        <w:t xml:space="preserve">차폐 영역은 장애물과 그 그림자가 리프팅된 공간에서 이루는 또 하나의 KOZ이다. 장애물이 움직이면 차폐 원뿔이 회전하여 이 영역도 휘어진 KOZ 관처럼 비볼록이 되므로, 2.2절과 2.3절의 클리핑·지지 반공간 구성을 그대로 적용한다. 분할구간마다 같은 구로 차폐 영역을 잘라 클리핑된 차폐 볼륨을 얻고, 장애물의 접근마다 지지 반공간을 하나씩 해당 분할구간의 모든 제어점에 부과한다. 비볼록이고 시간에 따라 변하는 임무 제약을 하나 더 추가하는 비용은 분할구간·장애물·지상국의 조합마다 반공간 부등식 하나이다.</w:t>
+      </w:r>
+    </w:p>
+    <w:p ns2:paraId="7547031E" ns2:textId="77777777">
+      <w:pPr>
+        <w:pStyle w:val="ab"/>
+      </w:pPr>
     </w:p>
     <w:p>
       <w:pPr>
@@ -366,15 +357,15 @@
         <w:pStyle w:val="ab"/>
       </w:pPr>
       <w:r>
-        <w:t xml:space="preserve">3차원 공간과 시간에서 실험하였다. 지상국은 원점에 있고, 차폐체는 그 상공 고도 5에서 반지름 3의 원을 그리며 주기 8로 선회하는 반지름 0.6의 구형 물체이다. 기체는 고도 6.0에서 6.5 사이의 회랑 층을 따라 지상국 상공을 가로질러 통과하며, 도착 시각은 자유로 두고 속도 제한과 도착 시각에 대한 선형 페널티 항을 함께 부과하였다. 회랑 층은 선회체가 닿는 높이보다 위에, 그림자가 쓸고 지나가는 범위 안에 놓이도록 정하였다. 따라서 keep-out 제약은 부과되어 있으나 구속되지 않으며, 통과 시점을 결정하는 것은 차폐 제약뿐이다. 차폐 제약만 켜고 끈 두 실행을 비교하였다.</w:t>
-      </w:r>
-    </w:p>
-    <w:p ns2:paraId="7547031E" ns2:textId="77777777">
-      <w:pPr>
-        <w:pStyle w:val="ab"/>
-      </w:pPr>
-      <w:r>
-        <w:t xml:space="preserve">차폐 제약을 제거한 기준 실행은 속도 상한에 붙어 곧장 통과하여 시각 4.00에 도착하였고, 선회체의 그림자가 회랑을 지나는 1.14초부터 1.41초까지 시선을 잃었다(최소 가시선 여유 -0.428). 차폐 제약을 부과한 실행은 같은 경로를 시각 4.74 도착으로 늦추어 그림자가 지나간 뒤에 교차하였고, 최소 가시선 여유 +0.830으로 전 구간 시선을 유지하였다(차폐 위반양 0.000). 장애물의 실제 궤적에 대해 재검증한 최소 여유 거리는 +2.313이었다. 두 실행의 경로는 공간에서 거의 겹치며 통과 시점만 다르다. 시간 배분이 결정 변수라는 본 논문의 주장이 이 차이 그대로이다.</w:t>
+        <w:t xml:space="preserve">제안 정식화를 3차원 공간과 시간의 시나리오로 검증하였다. 지상국은 원점에 있고, 장애물은 그 상공 고도 5에서 반지름 3의 원을 그리며 주기 8로 선회하는 반지름 0.6의 구형 물체이다. 기체는 고도 6.0에서 6.5 사이의 회랑 층을 따라 지상국 상공을 가로질러 통과하며, 도착 시각은 자유롭게 두고 속도 제한과 도착 시각에 대한 선형 페널티 항을 함께 부과하였다. 회랑 층은 장애물이 닿는 높이보다 위에, 그림자가 쓸고 지나가는 범위 안에 놓이도록 정하였다. 따라서 KOZ 제약은 부과되어 있으나 구속되지 않으며, 통과 시점을 결정하는 것은 차폐 제약뿐이다. 차폐 제약의 유무만 다른 두 실행을 비교하였다.</w:t>
+      </w:r>
+    </w:p>
+    <w:p ns2:paraId="7547031E" ns2:textId="77777777">
+      <w:pPr>
+        <w:pStyle w:val="ab"/>
+      </w:pPr>
+      <w:r>
+        <w:t xml:space="preserve">차폐 제약을 제거한 기준 실행은 속도 상한에 붙어 곧장 통과하여 시각 4.00에 도착하였고, 장애물의 그림자가 회랑을 지나는 1.14초부터 1.41초까지 가시선을 잃었다(최소 가시선 여유 -0.428). 차폐 제약을 부과한 실행은 같은 경로를 시각 4.74 도착으로 늦추어 그림자가 지나간 뒤에 교차하였고, 최소 가시선 여유 +0.830으로 전 구간 가시선을 유지하였다(차폐 위반양 0.000). 장애물의 실제 궤적에 대해 재검증한 최소 여유 거리는 +2.313이었다. 두 실행의 경로는 공간에서 거의 겹치며 통과 시점만 다르다. 시간 배분이 결정 변수라는 본 논문의 주장이 이 차이로 나타난다.</w:t>
       </w:r>
     </w:p>
     <w:p>
@@ -425,7 +416,7 @@
         <w:pStyle w:val="ad"/>
       </w:pPr>
       <w:r>
-        <w:t xml:space="preserve">Fig. 1 Transit through a corridor layer over a loitering occluder (left), and the line-of-sight margin over time (right): the unconstrained run crosses early and loses the link (shaded); the constrained run delays its crossing and keeps it.</w:t>
+        <w:t xml:space="preserve">Fig. 1 Transit through a corridor layer over a loitering obstacle (left), and the line-of-sight margin over time (right): the unconstrained run crosses early and loses the link (shaded); the constrained run delays its crossing and keeps it.</w:t>
       </w:r>
     </w:p>
     <w:p ns2:paraId="72CF0A2A" ns2:textId="06969B16">
@@ -454,24 +445,15 @@
         <w:pStyle w:val="ab"/>
       </w:pPr>
       <w:r>
-        <w:t xml:space="preserve">본 논문은 이동 장애물의 볼록 외부 근사를 풀기 전에 고정하지 않고, 분할구간 둘레의 구로 KOZ를 잘라 얻은 클리핑된 KOZ 볼륨에 대한 지지 반공간을 SCP 반복마다 다시 세우는 궤적 최적화 정식화를 제시하였다. 자유 공간을 미리 볼록 영역으로 분할하지 않고도, 이동 장애물 회피와 지상국 가시선 유지를 하나의 연속 최적화로 얻었다.</w:t>
-      </w:r>
-    </w:p>
-    <w:p ns2:paraId="7547031E" ns2:textId="77777777">
-      <w:pPr>
-        <w:pStyle w:val="ab"/>
-      </w:pPr>
-      <w:r>
-        <w:t xml:space="preserve">한계는 다음과 같다. 얻는 해는 국소해이며 초기값에 의존한다. 장애물의 운동이 결정적이고 알려져 있다고 가정한다. 반공간은 클리핑 구 안의 관에 대해서만 성립하므로, 구 밖에 있으면서 반공간의 허용 쪽에 놓인 관은 보호되지 않으며 굽은 관의 먼 쪽 팔이 이에 해당한다. 클리핑 반지름을 분할구간의 반지름과 한 번의 신뢰 구간 이동 거리의 합 이상으로 두면 이 구멍은 닫히지만, 제약이 실제로 구속되는 자리에서 반공간이 보수적이 된다. 본 논문은 접점까지의 거리를 반지름으로 쓰고, 대신 얻은 궤적 전체를 장애물의 실제 궤적에 대해 조밀하게 재검증하여 침범 여부를 판정한다. 즉 이 구성은 안전이 구조적으로 보장되는 구성이 아니라 실패가 검출 가능한 구성이다. 전역 최적성과 초기값 없이 푸는 성질은 선행 연구 쪽이 낫다</w:t>
-      </w:r>
-      <w:r>
-        <w:rPr>
-          <w:vertAlign w:val="superscript"/>
-        </w:rPr>
-        <w:t xml:space="preserve">(1)</w:t>
-      </w:r>
-      <w:r>
-        <w:t xml:space="preserve">. 향후 장애물 위치의 불확실성을 반영한 확률적 keep-out zone과 receding horizon 구성으로 확장한다.</w:t>
+        <w:t xml:space="preserve">본 논문은 이동 장애물의 볼록 외부 근사를 풀기 전에 고정하는 대신, 분할구간 둘레의 구로 KOZ를 잘라 얻은 클리핑된 KOZ 볼륨에 대한 지지 반공간을 SCP 반복마다 다시 세우는 궤적 최적화 정식화를 제시하였다. 자유 공간을 미리 볼록 영역으로 분할하지 않고도, 이동 장애물 회피와 지상국 가시선 유지를 하나의 연속 최적화로 얻었다.</w:t>
+      </w:r>
+    </w:p>
+    <w:p ns2:paraId="7547031E" ns2:textId="77777777">
+      <w:pPr>
+        <w:pStyle w:val="ab"/>
+      </w:pPr>
+      <w:r>
+        <w:t xml:space="preserve">한계는 다음과 같다. 얻는 해는 초기값에 의존하는 국소해이며, 장애물의 운동은 결정적이고 알려져 있다는 가정에 의존한다. 지지 반공간은 클리핑 구 안에서만 성립하므로, 얻은 궤적은 장애물의 실제 궤적에 대해 조밀하게 재검증하여 판정한다. 향후 장애물 위치의 불확실성을 반영한 확률적 KOZ와 receding horizon 구성으로 확장하고자 한다.</w:t>
       </w:r>
     </w:p>
     <w:p ns2:paraId="1F174735" ns2:textId="77777777">

</xml_diff>

<commit_message>
paper(A2): the frontier run (46.6 s vs 43.0 s bound), reviewers' verified fixes, 4D stated, 3D scene figure at 600 dpi
The loiter figure now comes from N8 / 48 segments / time weight 40 / trust
radius 1 m: arrival 46.6 s against the true-shadow axis bound of 43.0 s,
which the figure tool computes and records in the sidecar. The 3.6 s gap
is the time thickening of the lifted zone at axis scale 1. The old run's
12.75 s gap was mostly the clip floor through fat segments.

Manuscript: title B, KOZ as body ball plus shadow, the tube as a union of
balls, L per approach, the n_t identity, MADER positioned correctly,
corridor tangency stated, the lifted space named as four-dimensional.
render_paper.py exports the PDF lossless with no image downsampling; the
scene panel is 3D at 600 dpi.
</commit_message>
<xml_diff>
--- a/paper/ksas_2026_fall/manuscript.docx
+++ b/paper/ksas_2026_fall/manuscript.docx
@@ -8,7 +8,7 @@
         <w:spacing w:after="80" w:line="276" w:lineRule="auto"/>
       </w:pPr>
       <w:r>
-        <w:t xml:space="preserve">지상국 가시선을 유지하며 이동 장애물을 회피하는 3차원 궤적 최적화</w:t>
+        <w:t xml:space="preserve">볼록 분해 없는 공간-시간 궤적 최적화: 이동 장애물 회피와 가시선 제약의 동시 처리</w:t>
       </w:r>
     </w:p>
     <w:p ns2:paraId="51514DAC" ns2:textId="21B44746">
@@ -37,7 +37,7 @@
         <w:spacing w:after="80"/>
       </w:pPr>
       <w:r>
-        <w:t xml:space="preserve">Three-Dimensional Trajectory Optimization for Moving Obstacle Avoidance under a Ground Station Line-of-Sight Constraint</w:t>
+        <w:t xml:space="preserve">Space-Time Trajectory Optimization without Convex Decomposition: Simultaneous Handling of Moving-Obstacle Avoidance and Line-of-Sight Constraints</w:t>
       </w:r>
     </w:p>
     <w:p ns2:paraId="791394AB" ns2:textId="0B039C73">
@@ -82,7 +82,7 @@
         <w:rPr>
           <w:b/>
         </w:rPr>
-        <w:t xml:space="preserve">Key Words : Trajectory Optimization(궤적 최적화), Space-Time Bezier Curve(공간-시간 베지어 곡선), Line-of-Sight Constraint(가시선 제약), Sequential Convex Programming(순차 볼록 계획법)</w:t>
+        <w:t xml:space="preserve">Key Words : Trajectory Optimization(궤적 최적화), Space-Time Bezier Curve(공간-시간 베지어 곡선), Line-of-Sight Constraint(가시선 제약)</w:t>
       </w:r>
     </w:p>
     <w:p ns2:paraId="015089DF" ns2:textId="77777777">
@@ -117,7 +117,7 @@
         <w:pStyle w:val="ab"/>
       </w:pPr>
       <w:r>
-        <w:t xml:space="preserve">이동 장애물이 있는 환경에서는 경로와 통과 시점을 따로 정할 수 없다. 같은 경로라도 언제 지나가느냐에 따라 충돌 여부가 달라지기 때문이다. 지상국과의 가시선이 유지되어야 원격 조종과 데이터 전송이 성립하므로, 선회하는 장애물이 가시선을 끊는 상황도 같은 성질의 제약이다.</w:t>
+        <w:t xml:space="preserve">이동 장애물이 있는 환경에서는 경로와 통과 시점을 따로 정할 수 없다. 지상국과의 가시선을 끊는 장애물의 그림자도 같은 성질의 제약이다.</w:t>
       </w:r>
     </w:p>
     <w:p ns2:paraId="7547031E" ns2:textId="77777777">
@@ -125,7 +125,7 @@
         <w:pStyle w:val="ab"/>
       </w:pPr>
       <w:r>
-        <w:t xml:space="preserve">기존 접근은 자유 공간을 볼록한 셀로 분해하고 어느 셀을 지날지를 혼합정수 문제로 푼다</w:t>
+        <w:t xml:space="preserve">기존 접근은 자유 공간을 볼록한 셀로 분해하고, 어느 셀을 지날지를 혼합정수 문제의 볼록 완화로 푼다</w:t>
       </w:r>
       <w:r>
         <w:rPr>
@@ -143,13 +143,22 @@
         <w:t xml:space="preserve">(1)</w:t>
       </w:r>
       <w:r>
-        <w:t xml:space="preserve">, 분해는 여전히 최적화 이전에 고정된다. 시간을 매개변수로 두는 통로 기반 기법은 시간 배분이 매듭 벡터에 고정되고 볼록 껍질 성질에 별도의 충분조건이 필요하다</w:t>
+        <w:t xml:space="preserve">, 분해를 최적화 전에 확정하며 등속 장애물만 다룬다. 분리 평면을 결정 변수로 두어 분해를 피하는 계획법은 시간 배분이 매듭 벡터에 고정되고</w:t>
       </w:r>
       <w:r>
         <w:rPr>
           <w:vertAlign w:val="superscript"/>
         </w:rPr>
-        <w:t xml:space="preserve">(3,4)</w:t>
+        <w:t xml:space="preserve">(4)</w:t>
+      </w:r>
+      <w:r>
+        <w:t xml:space="preserve">, 시간을 매개변수로 두는 시공간 회랑에서 볼록 껍질 성질이 성립하려면 별도의 충분조건이 필요하다</w:t>
+      </w:r>
+      <w:r>
+        <w:rPr>
+          <w:vertAlign w:val="superscript"/>
+        </w:rPr>
+        <w:t xml:space="preserve">(3)</w:t>
       </w:r>
       <w:r>
         <w:t xml:space="preserve">.</w:t>
@@ -160,7 +169,7 @@
         <w:pStyle w:val="ab"/>
       </w:pPr>
       <w:r>
-        <w:t xml:space="preserve">본 논문은 같은 리프팅 위에서 이동 장애물의 볼록 외부 근사를 현재 반복점의 국소 이웃에 대해 순차 볼록 계획법(sequential convex programming, SCP) 반복마다 다시 구성한다. 자유 공간을 미리 분해하지 않고 이산 결정도 두지 않는다. 기여는 세 가지이다. 첫째, 움직이는 장애물의 keep-out zone(KOZ)은 리프팅된 공간에서 휘어진 관이 되는데, 분할구간의 무게중심 둘레의 구로 잘라낸 부분만 가두는 supporting half-space(지지 반공간)를 세우므로 관 전체가 볼록일 필요가 없다. 둘째, 장애물이 한 번 가까워졌다 멀어지는 근접 구간마다 반공간을 하나씩 세워, 관이 무게중심을 감싸는 경우에도 유효한 벽을 얻는다. 셋째, 같은 구성이 장애물의 그림자를 함께 처리한다.</w:t>
+        <w:t xml:space="preserve">본 논문은 같은 리프팅 위에서 KOZ의 국소 볼록 외부 근사를 순차 볼록 계획법(sequential convex programming, SCP) 반복마다 현재 반복점 둘레에 다시 세운다. 자유 공간을 미리 분해하지 않고 이산 결정도 두지 않는다. 기여는 세 가지이다. 첫째, 움직이는 장애물의 keep-out zone(KOZ)은 리프팅된 공간에서 휘어진 관이 되는데, 분할구간 둘레의 구로 잘라낸 부분의 supporting half-space(지지 반공간)만 세우므로 관이 볼록일 필요가 없다. 둘째, 근접 구간마다 반공간을 하나씩 세워 관이 굽어 감싸는 경우도 다룬다. 셋째, 지상국을 점광원으로 두면 장애물과 그 그림자가 하나의 KOZ가 되어, 같은 구성이 가시선 제약을 함께 처리한다.</w:t>
       </w:r>
     </w:p>
     <w:p ns2:paraId="65F13D71" ns2:textId="77777777">
@@ -187,7 +196,16 @@
         <w:pStyle w:val="ab"/>
       </w:pPr>
       <w:r>
-        <w:t xml:space="preserve">시간을 곡선의 좌표로 포함하면 등속으로 움직이는 구형 KOZ는 리프팅된 공간에서 기울어진 정적인 관이 되고, 시간이 매개변수가 아니라 좌표이므로 Bézier 곡선의 볼록 껍질 성질이 추가 조건 없이 성립한다. 결정 변수는 제어점이며, De Casteljau 분할로 얻은 분할구간이 제약을 부과하는 단위이다. 분할구간마다 제어점의 평균을 무게중심 c로, c에서 제어점까지의 최대 거리를 반지름 E로 둔다. 시간 좌표에는 단조 증가와 최소 시간 간격을 부과한다.</w:t>
+        <w:t xml:space="preserve">시간을 네 번째 좌표로 더해 공간 3차원을 4차원으로 리프팅하면 등속으로 움직이는 구형 KOZ는 리프팅된 공간에서 기울어진 정적인 관, 곧 중심선 위의 각 점을 중심으로 하는 반지름 rₘ의 구를 합친 집합이 된다. 장애물이 정적이므로 Bézier 곡선의 볼록 껍질 성질을 충돌 조건에 바로 쓸 수 있다. 리프팅된 공간의 거리는 1 s를 1 m로 환산한다. 결정 변수는 공간 좌표와 시간 좌표를 함께 가진 제어점이며, De Casteljau 분할로 얻은 분할구간이 제약을 부과하는 단위이다. 분할구간마다 제어점의 평균을 무게중심 c로, c에서 제어점까지의 최대 거리를 반지름 E로 둔다. 시간 좌표에는 </w:t>
+      </w:r>
+      <w:r>
+        <w:rPr>
+          <w:vertAlign w:val="superscript"/>
+        </w:rPr>
+        <w:t xml:space="preserve">(1)</w:t>
+      </w:r>
+      <w:r>
+        <w:t xml:space="preserve">과 같이 단조 증가와 최소 시간 간격을 부과한다.</w:t>
       </w:r>
     </w:p>
     <w:p ns2:paraId="7547031E" ns2:textId="77777777">
@@ -195,7 +213,7 @@
         <w:pStyle w:val="ab"/>
       </w:pPr>
       <w:r>
-        <w:t xml:space="preserve">장애물의 운동이 등속이 아니면 관이 휘어 비볼록이 되므로, 회피 조건을 현재 반복점 주변에서 국소적으로 선형화한다. c를 중심으로 반지름 r의 구를 잡아 KOZ와의 교집합을 클리핑된 KOZ 볼륨으로 정의한다. c에서 KOZ 중심선까지의 거리를 d, 한 번의 반복(iteration)에서 제어점이 움직일 수 있는 최대 거리를 δ라 하면(δ는 신뢰 구간의 크기로 정해진다) 반지름은 다음과 같다.</w:t>
+        <w:t xml:space="preserve">관이 휘어 비볼록이면 회피 조건을 현재 반복점 주변에서 선형화한다. c를 중심으로 반지름 r의 구를 잡아 KOZ와의 교집합을 클리핑된 KOZ 볼륨으로 정의한다. c에서 KOZ 중심선까지의 거리를 d, 한 번의 반복에서 신뢰영역이 각 제어점의 이동을 허용하는 최대 거리를 δ라 하면 반지름은 다음과 같다.</w:t>
       </w:r>
     </w:p>
     <w:p>
@@ -212,7 +230,7 @@
         <w:pStyle w:val="ab"/>
       </w:pPr>
       <w:r>
-        <w:t xml:space="preserve">닿을 수 없는 쌍에는 제약을 세우지 않는다. 하한 E + δ는 다음 반복점의 분할구간 전체를 구 안에 머무르게 하므로, 클리핑된 볼륨에 대한 반공간이 KOZ 전체에 대한 조건이 된다.</w:t>
+        <w:t xml:space="preserve">d가 rₘ + E + δ를 넘는 (분할구간, 장애물) 쌍은 닿을 수 없으므로 제약을 세우지 않는다. 하한 E + δ는 다음 반복점의 분할구간 전체를 구 안에 머무르게 하므로, 클리핑된 볼륨에 대한 반공간이 KOZ 전체에 대한 조건이 된다.</w:t>
       </w:r>
     </w:p>
     <w:p>
@@ -228,7 +246,7 @@
         <w:pStyle w:val="ab"/>
       </w:pPr>
       <w:r>
-        <w:t xml:space="preserve">근접 구간마다 반공간을 하나씩 세운다. KOZ 중심선 위의 점에서 c까지의 거리를 중심선의 매개변수, 곧 시간의 함수로 보고 이 함수의 극대점마다 구간을 자르면, 장애물이 한 번 가까워졌다 멀어지는 조각이 근접 구간이다. 한 근접 구간에서 c에 가장 가까운 중심선의 점을 p, 그 근접 구간에 속하는 클리핑된 KOZ 볼륨을 L, 분할구간의 제어점을 Q라 하고 최댓값을 L 위에서 취하면</w:t>
+        <w:t xml:space="preserve">근접 구간마다 반공간을 하나씩 세운다. 중심선 위의 점에서 c까지의 거리를 시간의 함수로 보고 그 극대점마다 자른 조각이 근접 구간이다. 한 근접 구간에서 c에 가장 가까운 중심선의 점을 p, 그 근접 구간의 중심선이 만드는 클리핑된 KOZ 볼륨을 L, 분할구간의 제어점을 Qᵢ라 하면</w:t>
       </w:r>
     </w:p>
     <w:p>
@@ -237,7 +255,7 @@
         <w:jc w:val="center"/>
       </w:pPr>
       <w:r>
-        <w:t xml:space="preserve">n = (c − p)/‖c − p‖, b = max n·x, n·Q ≥ b</w:t>
+        <w:t xml:space="preserve">n = (c − p)/‖c − p‖,  b = max{n·x : x ∈ L},  n·Qᵢ ≥ b</w:t>
       </w:r>
     </w:p>
     <w:p ns2:paraId="7547031E" ns2:textId="77777777">
@@ -245,7 +263,7 @@
         <w:pStyle w:val="ab"/>
       </w:pPr>
       <w:r>
-        <w:t xml:space="preserve">b가 L의 지지값이므로 L 전체가 반공간 밖에 남고, 같은 반공간을 모든 제어점에 부과하므로 볼록 껍질 성질에 의해 분할구간의 곡선 전체가 반공간 안에 놓인다. n의 시간 성분은 0이 아니다. 관이 굽어 c를 감싸면 c가 클리핑된 볼륨의 볼록 껍질 안에 들어가 하나의 평면으로는 c를 허용 쪽에 둘 수 없지만, 극대점에서 자르면 두 근접 구간이 각각 유효한 평면을 얻어 그 사이로 굽은 관의 안쪽을 지나는 해가 남는다.</w:t>
+        <w:t xml:space="preserve">b가 L의 지지값이므로 L은 반공간 밖에 남고, 같은 반공간을 모든 제어점에 부과하면 볼록 껍질 성질에 의해 곡선 전체가 반공간 안에 놓인다. 등속 장애물이면 n의 시간 성분은 공간 성분과 장애물 속도의 내적의 음수이다. 관이 굽어 c를 감싸면 하나의 평면으로는 c를 허용 쪽에 둘 수 없지만, 극대점에서 자르면 근접 구간마다 반공간이 하나씩 생겨 그 사이의 틈이 허용 영역으로 남는다.</w:t>
       </w:r>
     </w:p>
     <w:p ns2:paraId="7547031E" ns2:textId="77777777">
@@ -253,7 +271,16 @@
         <w:pStyle w:val="ab"/>
       </w:pPr>
       <w:r>
-        <w:t xml:space="preserve">회피는 이 반공간 제약만으로 이루어진다. 목적함수는 매개변수 영역의 매끄러움 정규화 항과 도착 시각에 대한 선형 페널티 항이고, 속도 제한은 제어 다각형의 변마다 부과하는 기울기 제한이다. 여유 변수(slack variable)와 그 페널티 항은 하위 문제의 실현 가능성을 보완할 뿐 회피 기제가 아니다.</w:t>
+        <w:t xml:space="preserve">회피는 이 반공간 제약만으로 이루어진다. 목적함수는 매개변수 영역의 매끄러움 정규화 항과 도착 시각에 대한 선형 페널티 항이고, 속도 제한은 </w:t>
+      </w:r>
+      <w:r>
+        <w:rPr>
+          <w:vertAlign w:val="superscript"/>
+        </w:rPr>
+        <w:t xml:space="preserve">(1)</w:t>
+      </w:r>
+      <w:r>
+        <w:t xml:space="preserve">과 같이 제어 다각형의 변마다 부과하는 기울기 제한이다. 여유 변수(slack variable)와 그 페널티 항은 하위 문제의 실현 가능성을 보완할 뿐 회피 기제가 아니다.</w:t>
       </w:r>
     </w:p>
     <w:p>
@@ -269,7 +296,7 @@
         <w:pStyle w:val="ab"/>
       </w:pPr>
       <w:r>
-        <w:t xml:space="preserve">지상국을 하나의 점으로 두고 가시선이 장애물에 가려지는 위치의 집합을 차폐 영역이라 하면, 차폐 영역은 장애물과 그 그림자가 리프팅된 공간에서 이루는 또 하나의 KOZ이다. 중심선은 지상국에서 장애물 중심을 지나는 반직선이고, 반지름은 지상국에서의 거리에 비례한다. 장애물이 움직이면 차폐 원뿔이 회전하여 이 영역도 비볼록이 되므로, 2.1절과 2.2절의 구성에서 d를 이 중심선까지의 거리로 두고 법선을 가장 가까운 중심선의 점에서 취하여 그대로 적용한다. 추가 비용은 분할구간·장애물·지상국·근접 구간의 조합마다 반공간 부등식 하나이다.</w:t>
+        <w:t xml:space="preserve">지상국을 점광원으로 두면 장애물의 KOZ는 장애물 구와 그 뒤쪽 그림자를 합친 하나의 집합이다. 중심선은 점광원에 대한 중심선의 그림자인 중심 곡면이 되고, 구의 반지름은 지상국에서의 거리에 비례한다(장애물 위치에서 rₘ). 그림자가 회전하여 비볼록이 된 이 집합에 2.1절과 2.2절의 구성을 중심선 대신 중심 곡면으로 그대로 적용한다. 이를 차폐 제약이라 하며, 비용은 분할구간·장애물·지상국·근접 구간 조합마다 부등식 하나이다.</w:t>
       </w:r>
     </w:p>
     <w:p>
@@ -285,7 +312,7 @@
         <w:pStyle w:val="ab"/>
       </w:pPr>
       <w:r>
-        <w:t xml:space="preserve">지상국은 원점에 있고, 장애물은 고도 50 m에서 반지름 30 m의 원을 주기 80 s로 선회하는 반지름 6 m의 구이다. 기체는 고도 62.5 m, 길이 200 m의 회랑(좌우 5 m, 고도 60–65 m)을 따라 지상국 상공을 통과한다. 회랑은 장애물보다 높아 KOZ 제약은 구속되지 않으며(기체와 장애물의 최소 거리 30.5 m), 통과 시점은 차폐 제약만이 정한다. 8차 Bézier 곡선을 8개 분할구간으로 나누고, 도착 시각은 자유롭게 두어 속도 상한 5 m/s와 도착 시각 페널티(가중치 10)를 함께 부과하였다(신뢰 구간 5 m, 페널티 계수 10⁵). 가시선 여유는 지상국과 기체를 잇는 선분에서 장애물 중심까지의 거리에서 장애물 반지름을 뺀 값이다. 차폐 제약의 유무만 다른 두 실행을 비교하였다.</w:t>
+        <w:t xml:space="preserve">제안 기법을 다음 장면에서 확인하였다. 지상국은 원점에 있고, 장애물은 지상국 상공 고도 50 m에서 반지름 30 m의 원을 주기 80 s로 선회하는 반지름 6 m의 구이다. 기체는 고도 62.5 m, 길이 200 m의 회랑(좌우 5 m, 고도 60–65 m)을 따라 지상국 옆을 지나며, 회랑은 그 고도에서 그림자 중심이 그리는 원에 접하도록 y = 37.5 m에 둔다. 회랑 바닥이 장애물 꼭대기보다 4 m 높아 장애물 구 부분은 침범될 수 없고, 통과 시점은 그림자 부분, 곧 차폐 제약이 정한다. 4차원 (x, y, z, t) 공간의 8차 Bézier 곡선을 48개 분할구간으로 나누고, 도착 시각은 자유롭게 두어 속도 상한 5 m/s와 도착 시각 페널티(가중치 40)를 함께 부과하였다(신뢰영역 1 m, 여유 변수 페널티 10⁵). 가시선 여유는 지상국–기체 선분에서 장애물 중심까지의 거리에서 장애물 반지름을 뺀 값이다.</w:t>
       </w:r>
     </w:p>
     <w:p ns2:paraId="7547031E" ns2:textId="77777777">
@@ -293,7 +320,7 @@
         <w:pStyle w:val="ab"/>
       </w:pPr>
       <w:r>
-        <w:t xml:space="preserve">차폐 제약이 없는 기준 실행은 속도 상한에 붙어 곧장 통과하여 40.0 s에 도착하고, 그림자가 회랑을 지나는 14.96–16.52 s에 가시선을 잃는다(최소 가시선 여유 −2.17 m). 차폐 제약을 부과한 실행은 같은 경로를 55.7 s 도착으로 늦추어 그림자가 지나간 뒤에 교차한다. 차폐 제약의 위반양은 0.0이고 12회 반복, 0.25 s(Apple M2)에 수렴하였으며, 실제 궤적을 표본추출한 독립 검사에서도 최소 가시선 여유 +10.6 m로 전 구간 가시선을 유지하였다. 두 실행의 경로는 공간에서 겹치고(횡방향 편차 0.08 m) 통과 시점만 다르며, 제약을 부과한 실행의 경로를 기준 실행의 시각 배분으로 비행하면 최소 가시선 여유가 −2.11 m로 떨어진다. 이 실험은 시간 배분이 결정 변수라는 점과 비볼록 차폐 제약이 반공간으로 부과된다는 점을 보이며, 2.2절의 두 벽 구성은 이 장면에서 필요하지 않다.</w:t>
+        <w:t xml:space="preserve">차폐 제약이 없는 기준 실행은 속도 상한으로 곧장 통과하여 40.0 s에 도착하고, 그림자에 든 14.96–16.52 s에 가시선을 잃는다(최소 가시선 여유 −2.17 m, Fig. 1). 차폐 제약을 부과한 실행은 같은 경로를 46.6 s 도착으로 늦추어 그림자 뒤에 교차한다. 반환된 궤적에서 위반량과 여유 변수는 0이고(16회 반복, 0.5 s), 궤적의 표본 검사에서도 최소 가시선 여유 +3.3 m로 전 구간 가시선을 유지하였다. 두 실행의 경로는 공간에서 겹치고(최대 횡방향 편차 0.55 m) 통과 시점만 다르며, 제약을 부과한 실행의 경로를 기준 실행의 시각 배분으로 비행하면 최소 가시선 여유가 −1.69 m로 떨어진다. 그림자만 피해 회랑 축을 따라 도달할 수 있는 시각의 하한은 43.0 s이며, 차이 3.6 s는 리프팅된 KOZ의 시간 방향 두께(시간 축 척도)가 낳는 보수성이다.</w:t>
       </w:r>
     </w:p>
     <w:p>
@@ -344,7 +371,7 @@
         <w:pStyle w:val="ad"/>
       </w:pPr>
       <w:r>
-        <w:t xml:space="preserve">Fig. 1 Left: plan view at t = 15.7 s as the shadow reaches the corridor; the baseline (off) is inside it, the constrained run (on) upstream. Right: line-of-sight margin against time.</w:t>
+        <w:t xml:space="preserve">Fig. 1 Left: scene at t = 15.7 s; green, sight lines to the baseline (off, in the shadow) and the constrained run (on); red, the body's lap. Right: sight margin vs time.</w:t>
       </w:r>
     </w:p>
     <w:p ns2:paraId="5798E127" ns2:textId="66D9C8DB">
@@ -363,7 +390,7 @@
         <w:pStyle w:val="ab"/>
       </w:pPr>
       <w:r>
-        <w:t xml:space="preserve">본 논문은 클리핑된 KOZ 볼륨의 지지 반공간을 SCP 반복마다 다시 세워, 분해 없이 이동 장애물 회피와 가시선 유지를 하나의 최적화로 얻었다.</w:t>
+        <w:t xml:space="preserve">클리핑된 KOZ 볼륨의 지지 반공간을 SCP 반복마다 다시 세워, 분해 없이 장애물과 그 그림자를 하나의 최적화로 피하였다.</w:t>
       </w:r>
     </w:p>
     <w:p ns2:paraId="7547031E" ns2:textId="77777777">
@@ -371,7 +398,7 @@
         <w:pStyle w:val="ab"/>
       </w:pPr>
       <w:r>
-        <w:t xml:space="preserve">얻는 해는 초기값에 의존하는 국소해이며, 장애물의 운동은 결정적이고 알려져 있다고 가정한다. 클리핑 반지름의 하한은 반공간이 KOZ 전체를 가리도록 보장하는 대신 제약이 구속되는 곳에서 보수적이며, 얻은 궤적은 장애물의 실제 궤적에 대해 조밀하게 표본추출한 독립 검사로 교차 확인한다.</w:t>
+        <w:t xml:space="preserve">얻는 해는 초기값에 의존하는 국소해이며, 장애물의 운동은 알려져 있다고 가정한다. 시간 축 척도와 클리핑 반지름의 하한은 모델링 선택이며 반공간의 보수성을 정한다.</w:t>
       </w:r>
     </w:p>
     <w:p ns2:paraId="151F3A2F" ns2:textId="77777777">
@@ -425,7 +452,7 @@
         </w:rPr>
       </w:pPr>
       <w:r>
-        <w:t xml:space="preserve">2)Marcucci, T., Petersen, M., von Wrangel, D., and Tedrake, R., “Motion Planning around Obstacles with Convex Optimization,” Science Robotics, Vol. 8, No. 84, 2023.</w:t>
+        <w:t xml:space="preserve">2)Marcucci, T., Petersen, M., von Wrangel, D., and Tedrake, R., “Motion Planning around Obstacles with Convex Optimization,” Science Robotics, 8(84), 2023.</w:t>
       </w:r>
     </w:p>
     <w:p ns2:paraId="7AF33532" ns2:textId="77777777">
@@ -449,7 +476,7 @@
         </w:rPr>
       </w:pPr>
       <w:r>
-        <w:t xml:space="preserve">4)Tordesillas, J., and How, J. P., “MADER: Trajectory Planner in Multi-Agent and Dynamic Environments,” IEEE Trans. Robotics, Vol. 38, No. 1, 2022.</w:t>
+        <w:t xml:space="preserve">4)Tordesillas, J., and How, J. P., “MADER: Trajectory Planner in Multi-Agent and Dynamic Environments,” IEEE Trans. Robotics, 38(1), 2022.</w:t>
       </w:r>
     </w:p>
     <w:sectPr>

</xml_diff>

<commit_message>
paper(A2): references in citation order, author markers superscript, the vehicle as subject in §2.4; cone explainer, time-component sentence and 벽 dropped
</commit_message>
<xml_diff>
--- a/paper/ksas_2026_fall/manuscript.docx
+++ b/paper/ksas_2026_fall/manuscript.docx
@@ -20,7 +20,24 @@
         </w:rPr>
       </w:pPr>
       <w:r>
-        <w:t xml:space="preserve">정현용1*, 이수원1</w:t>
+        <w:rPr/>
+        <w:t xml:space="preserve">정현용</w:t>
+      </w:r>
+      <w:r>
+        <w:rPr>
+          <w:vertAlign w:val="superscript"/>
+        </w:rPr>
+        <w:t xml:space="preserve">1*</w:t>
+      </w:r>
+      <w:r>
+        <w:rPr/>
+        <w:t xml:space="preserve">, 이수원</w:t>
+      </w:r>
+      <w:r>
+        <w:rPr>
+          <w:vertAlign w:val="superscript"/>
+        </w:rPr>
+        <w:t xml:space="preserve">1</w:t>
       </w:r>
     </w:p>
     <w:p ns2:paraId="371DA025" ns2:textId="77777777">
@@ -28,7 +45,14 @@
         <w:pStyle w:val="a8"/>
       </w:pPr>
       <w:r>
-        <w:t xml:space="preserve">국민대학교1</w:t>
+        <w:rPr/>
+        <w:t xml:space="preserve">국민대학교</w:t>
+      </w:r>
+      <w:r>
+        <w:rPr>
+          <w:vertAlign w:val="superscript"/>
+        </w:rPr>
+        <w:t xml:space="preserve">1</w:t>
       </w:r>
     </w:p>
     <w:p ns2:paraId="2D38DA18" ns2:textId="4C296537">
@@ -49,7 +73,24 @@
         </w:rPr>
       </w:pPr>
       <w:r>
-        <w:t xml:space="preserve">Hyunyong Jung1*, Su-Won Lee1</w:t>
+        <w:rPr/>
+        <w:t xml:space="preserve">Hyunyong Jung</w:t>
+      </w:r>
+      <w:r>
+        <w:rPr>
+          <w:vertAlign w:val="superscript"/>
+        </w:rPr>
+        <w:t xml:space="preserve">1*</w:t>
+      </w:r>
+      <w:r>
+        <w:rPr/>
+        <w:t xml:space="preserve">, Su-Won Lee</w:t>
+      </w:r>
+      <w:r>
+        <w:rPr>
+          <w:vertAlign w:val="superscript"/>
+        </w:rPr>
+        <w:t xml:space="preserve">1</w:t>
       </w:r>
     </w:p>
     <w:p ns2:paraId="7F3B6F09" ns2:textId="77777777">
@@ -131,19 +172,28 @@
         <w:rPr>
           <w:vertAlign w:val="superscript"/>
         </w:rPr>
+        <w:t xml:space="preserve">(1)</w:t>
+      </w:r>
+      <w:r>
+        <w:t xml:space="preserve">. 시간을 곡선의 좌표로 두는 리프팅은 선행 연구에서 제시되었으나</w:t>
+      </w:r>
+      <w:r>
+        <w:rPr>
+          <w:vertAlign w:val="superscript"/>
+        </w:rPr>
         <w:t xml:space="preserve">(2)</w:t>
       </w:r>
       <w:r>
-        <w:t xml:space="preserve">. 시간을 곡선의 좌표로 두는 리프팅은 선행 연구에서 제시되었으나</w:t>
+        <w:t xml:space="preserve">, 분해를 최적화 전에 확정하며 등속 장애물만 다룬다. 분리 평면을 결정 변수로 두어 분해를 피하는 계획법은 시간 배분이 매듭 벡터에 고정되고</w:t>
       </w:r>
       <w:r>
         <w:rPr>
           <w:vertAlign w:val="superscript"/>
         </w:rPr>
-        <w:t xml:space="preserve">(1)</w:t>
-      </w:r>
-      <w:r>
-        <w:t xml:space="preserve">, 분해를 최적화 전에 확정하며 등속 장애물만 다룬다. 분리 평면을 결정 변수로 두어 분해를 피하는 계획법은 시간 배분이 매듭 벡터에 고정되고</w:t>
+        <w:t xml:space="preserve">(3)</w:t>
+      </w:r>
+      <w:r>
+        <w:t xml:space="preserve">, 시간을 매개변수로 두는 시공간 회랑에서 볼록 껍질 성질이 성립하려면 별도의 충분조건이 필요하다</w:t>
       </w:r>
       <w:r>
         <w:rPr>
@@ -152,57 +202,48 @@
         <w:t xml:space="preserve">(4)</w:t>
       </w:r>
       <w:r>
-        <w:t xml:space="preserve">, 시간을 매개변수로 두는 시공간 회랑에서 볼록 껍질 성질이 성립하려면 별도의 충분조건이 필요하다</w:t>
+        <w:t xml:space="preserve">.</w:t>
+      </w:r>
+    </w:p>
+    <w:p ns2:paraId="7547031E" ns2:textId="77777777">
+      <w:pPr>
+        <w:pStyle w:val="ab"/>
+      </w:pPr>
+      <w:r>
+        <w:t xml:space="preserve">본 논문은 같은 리프팅 위에서 KOZ의 국소 볼록 외부 근사를 순차 볼록 계획법(sequential convex programming, SCP) 반복마다 현재 반복점 둘레에 다시 세운다. 자유 공간을 미리 분해하지 않고 이산 결정도 두지 않는다. 기여는 세 가지이다. 첫째, 움직이는 장애물의 keep-out zone(KOZ)은 리프팅된 공간에서 휘어진 관이 되는데, 분할구간 둘레의 구로 잘라낸 부분의 supporting half-space(지지 반공간)만 세우므로 관이 볼록일 필요가 없다. 둘째, 근접 구간마다 반공간을 하나씩 세워 관이 굽어 감싸는 경우도 다룬다. 셋째, 지상국을 점광원으로 두면 장애물과 그 그림자가 하나의 KOZ가 되어, 같은 구성이 가시선 제약을 함께 처리한다.</w:t>
+      </w:r>
+    </w:p>
+    <w:p ns2:paraId="65F13D71" ns2:textId="77777777">
+      <w:pPr>
+        <w:pStyle w:val="aa"/>
+      </w:pPr>
+      <w:r>
+        <w:rPr>
+          <w:rFonts w:hint="eastAsia"/>
+        </w:rPr>
+        <w:t xml:space="preserve">본 론</w:t>
+      </w:r>
+    </w:p>
+    <w:p>
+      <w:pPr>
+        <w:pStyle w:val="a4"/>
+      </w:pPr>
+      <w:r>
+        <w:t xml:space="preserve">2.1 리프팅과 클리핑된 KOZ 볼륨</w:t>
+      </w:r>
+    </w:p>
+    <w:p ns2:paraId="7547031E" ns2:textId="77777777">
+      <w:pPr>
+        <w:pStyle w:val="ab"/>
+      </w:pPr>
+      <w:r>
+        <w:t xml:space="preserve">시간을 네 번째 좌표로 더해 공간 3차원을 4차원으로 리프팅하면 등속으로 움직이는 구형 KOZ는 리프팅된 공간에서 기울어진 정적인 관, 곧 중심선 위의 각 점을 중심으로 하는 반지름 rₘ의 구를 합친 집합이 된다. 장애물이 정적이므로 Bézier 곡선의 볼록 껍질 성질을 충돌 조건에 바로 쓸 수 있다. 리프팅된 공간의 거리는 1 s를 1 m로 환산한다. 결정 변수는 공간 좌표와 시간 좌표를 함께 가진 제어점이며, De Casteljau 분할로 얻은 분할구간이 제약을 부과하는 단위이다. 분할구간마다 제어점의 평균을 무게중심 c로, c에서 제어점까지의 최대 거리를 반지름 E로 둔다. 시간 좌표에는 </w:t>
       </w:r>
       <w:r>
         <w:rPr>
           <w:vertAlign w:val="superscript"/>
         </w:rPr>
-        <w:t xml:space="preserve">(3)</w:t>
-      </w:r>
-      <w:r>
-        <w:t xml:space="preserve">.</w:t>
-      </w:r>
-    </w:p>
-    <w:p ns2:paraId="7547031E" ns2:textId="77777777">
-      <w:pPr>
-        <w:pStyle w:val="ab"/>
-      </w:pPr>
-      <w:r>
-        <w:t xml:space="preserve">본 논문은 같은 리프팅 위에서 KOZ의 국소 볼록 외부 근사를 순차 볼록 계획법(sequential convex programming, SCP) 반복마다 현재 반복점 둘레에 다시 세운다. 자유 공간을 미리 분해하지 않고 이산 결정도 두지 않는다. 기여는 세 가지이다. 첫째, 움직이는 장애물의 keep-out zone(KOZ)은 리프팅된 공간에서 휘어진 관이 되는데, 분할구간 둘레의 구로 잘라낸 부분의 supporting half-space(지지 반공간)만 세우므로 관이 볼록일 필요가 없다. 둘째, 근접 구간마다 반공간을 하나씩 세워 관이 굽어 감싸는 경우도 다룬다. 셋째, 지상국을 점광원으로 두면 장애물과 그 그림자가 하나의 KOZ가 되어, 같은 구성이 가시선 제약을 함께 처리한다.</w:t>
-      </w:r>
-    </w:p>
-    <w:p ns2:paraId="65F13D71" ns2:textId="77777777">
-      <w:pPr>
-        <w:pStyle w:val="aa"/>
-      </w:pPr>
-      <w:r>
-        <w:rPr>
-          <w:rFonts w:hint="eastAsia"/>
-        </w:rPr>
-        <w:t xml:space="preserve">본 론</w:t>
-      </w:r>
-    </w:p>
-    <w:p>
-      <w:pPr>
-        <w:pStyle w:val="a4"/>
-      </w:pPr>
-      <w:r>
-        <w:t xml:space="preserve">2.1 리프팅과 클리핑된 KOZ 볼륨</w:t>
-      </w:r>
-    </w:p>
-    <w:p ns2:paraId="7547031E" ns2:textId="77777777">
-      <w:pPr>
-        <w:pStyle w:val="ab"/>
-      </w:pPr>
-      <w:r>
-        <w:t xml:space="preserve">시간을 네 번째 좌표로 더해 공간 3차원을 4차원으로 리프팅하면 등속으로 움직이는 구형 KOZ는 리프팅된 공간에서 기울어진 정적인 관, 곧 중심선 위의 각 점을 중심으로 하는 반지름 rₘ의 구를 합친 집합이 된다. 장애물이 정적이므로 Bézier 곡선의 볼록 껍질 성질을 충돌 조건에 바로 쓸 수 있다. 리프팅된 공간의 거리는 1 s를 1 m로 환산한다. 결정 변수는 공간 좌표와 시간 좌표를 함께 가진 제어점이며, De Casteljau 분할로 얻은 분할구간이 제약을 부과하는 단위이다. 분할구간마다 제어점의 평균을 무게중심 c로, c에서 제어점까지의 최대 거리를 반지름 E로 둔다. 시간 좌표에는 </w:t>
-      </w:r>
-      <w:r>
-        <w:rPr>
-          <w:vertAlign w:val="superscript"/>
-        </w:rPr>
-        <w:t xml:space="preserve">(1)</w:t>
+        <w:t xml:space="preserve">(2)</w:t>
       </w:r>
       <w:r>
         <w:t xml:space="preserve">과 같이 단조 증가와 최소 시간 간격을 부과한다.</w:t>
@@ -238,7 +279,7 @@
         <w:pStyle w:val="a4"/>
       </w:pPr>
       <w:r>
-        <w:t xml:space="preserve">2.2 지지 반공간과 근접 구간별 벽</w:t>
+        <w:t xml:space="preserve">2.2 근접 구간별 지지 반공간</w:t>
       </w:r>
     </w:p>
     <w:p ns2:paraId="7547031E" ns2:textId="77777777">
@@ -263,7 +304,7 @@
         <w:pStyle w:val="ab"/>
       </w:pPr>
       <w:r>
-        <w:t xml:space="preserve">b가 L의 지지값이므로 L은 반공간 밖에 남고, 같은 반공간을 모든 제어점에 부과하면 볼록 껍질 성질에 의해 곡선 전체가 반공간 안에 놓인다. 등속 장애물이면 n의 시간 성분은 공간 성분과 장애물 속도의 내적의 음수이다. 관이 굽어 c를 감싸면 하나의 평면으로는 c를 허용 쪽에 둘 수 없지만, 극대점에서 자르면 근접 구간마다 반공간이 하나씩 생겨 그 사이의 틈이 허용 영역으로 남는다.</w:t>
+        <w:t xml:space="preserve">b가 L의 지지값이므로 L은 반공간 밖에 남고, 같은 반공간을 모든 제어점에 부과하면 볼록 껍질 성질에 의해 곡선 전체가 반공간 안에 놓인다. 관이 굽어 c를 감싸면 하나의 평면으로는 c를 허용 쪽에 둘 수 없지만, 극대점에서 자르면 근접 구간마다 반공간이 하나씩 생겨 그 사이의 틈이 허용 영역으로 남는다.</w:t>
       </w:r>
     </w:p>
     <w:p ns2:paraId="7547031E" ns2:textId="77777777">
@@ -277,7 +318,7 @@
         <w:rPr>
           <w:vertAlign w:val="superscript"/>
         </w:rPr>
-        <w:t xml:space="preserve">(1)</w:t>
+        <w:t xml:space="preserve">(2)</w:t>
       </w:r>
       <w:r>
         <w:t xml:space="preserve">과 같이 제어 다각형의 변마다 부과하는 기울기 제한이다. 여유 변수(slack variable)와 그 페널티 항은 하위 문제의 실현 가능성을 보완할 뿐 회피 기제가 아니다.</w:t>
@@ -296,7 +337,7 @@
         <w:pStyle w:val="ab"/>
       </w:pPr>
       <w:r>
-        <w:t xml:space="preserve">지상국을 점광원으로 두면 장애물의 KOZ는 장애물 구와 그 뒤쪽 그림자를 합친 하나의 집합이다. 중심선은 점광원에 대한 중심선의 그림자인 중심 곡면이 되고, 구의 반지름은 지상국에서의 거리에 비례한다(장애물 위치에서 rₘ). 그림자가 회전하여 비볼록이 된 이 집합에 2.1절과 2.2절의 구성을 중심선 대신 중심 곡면으로 그대로 적용한다. 이를 차폐 제약이라 하며, 비용은 분할구간·장애물·지상국·근접 구간 조합마다 부등식 하나이다.</w:t>
+        <w:t xml:space="preserve">지상국을 점광원으로 두면 장애물의 KOZ는 장애물 구와 그 뒤쪽 그림자를 합친 하나의 집합이다. 중심선은 점광원에 대한 중심선의 그림자인 중심 곡면이 된다. 그림자가 회전하여 비볼록이 된 이 집합에 2.1절과 2.2절의 구성을 중심선 대신 중심 곡면으로 그대로 적용한다. 이를 차폐 제약이라 하며, 비용은 분할구간·장애물·지상국·근접 구간 조합마다 부등식 하나이다.</w:t>
       </w:r>
     </w:p>
     <w:p>
@@ -312,7 +353,7 @@
         <w:pStyle w:val="ab"/>
       </w:pPr>
       <w:r>
-        <w:t xml:space="preserve">제안 기법을 다음 장면에서 확인하였다. 지상국은 원점에 있고, 장애물은 지상국 상공 고도 50 m에서 반지름 30 m의 원을 주기 80 s로 선회하는 반지름 6 m의 구이다. 기체는 고도 62.5 m, 길이 200 m의 회랑(좌우 5 m, 고도 60–65 m)을 따라 지상국 옆을 지나며, 회랑은 그 고도에서 그림자 중심이 그리는 원에 접하도록 y = 37.5 m에 둔다. 회랑 바닥이 장애물 꼭대기보다 4 m 높아 장애물 구 부분은 침범될 수 없고, 통과 시점은 그림자 부분, 곧 차폐 제약이 정한다. 4차원 (x, y, z, t) 공간의 8차 Bézier 곡선을 48개 분할구간으로 나누고, 도착 시각은 자유롭게 두어 속도 상한 5 m/s와 도착 시각 페널티(가중치 40)를 함께 부과하였다(신뢰영역 1 m, 여유 변수 페널티 10⁵). 가시선 여유는 지상국–기체 선분에서 장애물 중심까지의 거리에서 장애물 반지름을 뺀 값이다.</w:t>
+        <w:t xml:space="preserve">제안 기법을 다음 시나리오에서 확인하였다. 지상국은 원점에 있고, 장애물은 지상국 상공 고도 50 m에서 반지름 30 m의 원을 주기 80 s로 선회하는 반지름 6 m의 구이다. 기체는 고도 62.5 m, 길이 200 m의 회랑(좌우 5 m, 고도 60–65 m)을 따라 지상국 옆을 지나며, 회랑은 그 고도에서 그림자 중심이 그리는 원에 접하도록 y = 37.5 m에 둔다. 회랑 바닥이 장애물 꼭대기보다 4 m 높아 장애물 구 부분은 침범될 수 없고, 통과 시점은 그림자 부분, 곧 차폐 제약이 정한다. 4차원 (x, y, z, t) 공간의 8차 Bézier 곡선을 48개 분할구간으로 나누고, 도착 시각은 자유롭게 두어 속도 상한 5 m/s와 도착 시각 페널티(가중치 40)를 함께 부과하였다(신뢰영역 1 m, 여유 변수 페널티 10⁵). 가시선 여유는 지상국–기체 선분에서 장애물 중심까지의 거리에서 장애물 반지름을 뺀 값이다.</w:t>
       </w:r>
     </w:p>
     <w:p ns2:paraId="7547031E" ns2:textId="77777777">
@@ -320,7 +361,7 @@
         <w:pStyle w:val="ab"/>
       </w:pPr>
       <w:r>
-        <w:t xml:space="preserve">차폐 제약이 없는 기준 실행은 속도 상한으로 곧장 통과하여 40.0 s에 도착하고, 그림자에 든 14.96–16.52 s에 가시선을 잃는다(최소 가시선 여유 −2.17 m, Fig. 1). 차폐 제약을 부과한 실행은 같은 경로를 46.6 s 도착으로 늦추어 그림자 뒤에 교차한다. 반환된 궤적에서 위반량과 여유 변수는 0이고(16회 반복, 0.5 s), 궤적의 표본 검사에서도 최소 가시선 여유 +3.3 m로 전 구간 가시선을 유지하였다. 두 실행의 경로는 공간에서 겹치고(최대 횡방향 편차 0.55 m) 통과 시점만 다르며, 제약을 부과한 실행의 경로를 기준 실행의 시각 배분으로 비행하면 최소 가시선 여유가 −1.69 m로 떨어진다. 그림자만 피해 회랑 축을 따라 도달할 수 있는 시각의 하한은 43.0 s이며, 차이 3.6 s는 리프팅된 KOZ의 시간 방향 두께(시간 축 척도)가 낳는 보수성이다.</w:t>
+        <w:t xml:space="preserve">차폐 제약이 없는 기준 실행에서 기체는 속도 상한으로 곧장 통과하여 40.0 s에 도착하고, 그림자에 든 14.96–16.52 s에 가시선을 잃는다(최소 가시선 여유 −2.17 m, Fig. 1). 차폐 제약을 부과한 실행에서는 기체가 같은 경로를 따르되 도착이 46.6 s로 늦어지고, 그림자가 지나간 뒤에 교차 지점을 통과한다. 반환된 궤적에서 위반량과 여유 변수는 0이고(16회 반복, 0.5 s), 궤적의 표본 검사에서도 최소 가시선 여유 +3.3 m로 전 구간 가시선을 유지하였다. 두 실행의 경로는 공간에서 겹치고(최대 횡방향 편차 0.55 m) 통과 시점만 다르며, 제약을 부과한 실행의 경로를 기준 실행의 시각 배분으로 비행하면 최소 가시선 여유가 −1.69 m로 떨어진다. 그림자만 피해 회랑 축을 따라 도달할 수 있는 시각의 하한은 43.0 s이며, 차이 3.6 s는 리프팅된 KOZ의 시간 방향 두께(시간 축 척도)가 낳는 보수성이다.</w:t>
       </w:r>
     </w:p>
     <w:p>
@@ -440,7 +481,7 @@
         </w:rPr>
       </w:pPr>
       <w:r>
-        <w:t xml:space="preserve">1)Osburn, M. D., Peterson, C. K., and Salmon, J. L., “Systematic Constraint Formulation and Collision-Free Trajectory Planning Using Space-Time Graphs of Convex Sets,” arXiv:2508.10203, 2025.</w:t>
+        <w:t xml:space="preserve">1)Marcucci, T., Petersen, M., von Wrangel, D., and Tedrake, R., “Motion Planning around Obstacles with Convex Optimization,” Science Robotics, 8(84), 2023.</w:t>
       </w:r>
     </w:p>
     <w:p ns2:paraId="7AF33532" ns2:textId="77777777">
@@ -452,7 +493,7 @@
         </w:rPr>
       </w:pPr>
       <w:r>
-        <w:t xml:space="preserve">2)Marcucci, T., Petersen, M., von Wrangel, D., and Tedrake, R., “Motion Planning around Obstacles with Convex Optimization,” Science Robotics, 8(84), 2023.</w:t>
+        <w:t xml:space="preserve">2)Osburn, M. D., Peterson, C. K., and Salmon, J. L., “Systematic Constraint Formulation and Collision-Free Trajectory Planning Using Space-Time Graphs of Convex Sets,” arXiv:2508.10203, 2025.</w:t>
       </w:r>
     </w:p>
     <w:p ns2:paraId="7AF33532" ns2:textId="77777777">
@@ -464,7 +505,7 @@
         </w:rPr>
       </w:pPr>
       <w:r>
-        <w:t xml:space="preserve">3)Zhang, W., Yadmellat, P., and Gao, Z., “A Sufficient Condition for Convex Hull Property in General Convex Spatio-Temporal Corridors,” arXiv:2110.00065, 2021.</w:t>
+        <w:t xml:space="preserve">3)Tordesillas, J., and How, J. P., “MADER: Trajectory Planner in Multi-Agent and Dynamic Environments,” IEEE Trans. Robotics, 38(1), 2022.</w:t>
       </w:r>
     </w:p>
     <w:p ns2:paraId="7AF33532" ns2:textId="77777777">
@@ -476,7 +517,7 @@
         </w:rPr>
       </w:pPr>
       <w:r>
-        <w:t xml:space="preserve">4)Tordesillas, J., and How, J. P., “MADER: Trajectory Planner in Multi-Agent and Dynamic Environments,” IEEE Trans. Robotics, 38(1), 2022.</w:t>
+        <w:t xml:space="preserve">4)Zhang, W., Yadmellat, P., and Gao, Z., “A Sufficient Condition for Convex Hull Property in General Convex Spatio-Temporal Corridors,” arXiv:2110.00065, 2021.</w:t>
       </w:r>
     </w:p>
     <w:sectPr>

</xml_diff>

<commit_message>
paper(A2): the claim is the conjunction — no precomputed decomposition, no fixed time allocation; 서론 opens on the UAM mission
</commit_message>
<xml_diff>
--- a/paper/ksas_2026_fall/manuscript.docx
+++ b/paper/ksas_2026_fall/manuscript.docx
@@ -8,7 +8,7 @@
         <w:spacing w:after="80" w:line="276" w:lineRule="auto"/>
       </w:pPr>
       <w:r>
-        <w:t xml:space="preserve">볼록 분해 없는 공간-시간 궤적 최적화: 이동 장애물 회피와 가시선 제약의 동시 처리</w:t>
+        <w:t xml:space="preserve">볼록 분해와 시간 배분을 미리 정하지 않는 시공간 궤적 최적화: 이동 장애물 회피와 가시선 제약의 동시 처리</w:t>
       </w:r>
     </w:p>
     <w:p ns2:paraId="51514DAC" ns2:textId="21B44746">
@@ -61,7 +61,7 @@
         <w:spacing w:after="80"/>
       </w:pPr>
       <w:r>
-        <w:t xml:space="preserve">Space-Time Trajectory Optimization without Convex Decomposition: Simultaneous Handling of Moving-Obstacle Avoidance and Line-of-Sight Constraints</w:t>
+        <w:t xml:space="preserve">Space-Time Trajectory Optimization without Precomputed Convex Decomposition or Fixed Time Allocation: Simultaneous Handling of Moving-Obstacle Avoidance and Line-of-Sight Constraints</w:t>
       </w:r>
     </w:p>
     <w:p ns2:paraId="791394AB" ns2:textId="0B039C73">
@@ -123,7 +123,7 @@
         <w:rPr>
           <w:b/>
         </w:rPr>
-        <w:t xml:space="preserve">Key Words : Trajectory Optimization(궤적 최적화), Space-Time Bezier Curve(공간-시간 베지어 곡선), Line-of-Sight Constraint(가시선 제약)</w:t>
+        <w:t xml:space="preserve">Key Words : Trajectory Optimization(궤적 최적화), Space-Time Bezier Curve(시공간 베지어 곡선), Line-of-Sight Constraint(가시선 제약)</w:t>
       </w:r>
     </w:p>
     <w:p ns2:paraId="015089DF" ns2:textId="77777777">
@@ -158,7 +158,7 @@
         <w:pStyle w:val="ab"/>
       </w:pPr>
       <w:r>
-        <w:t xml:space="preserve">이동 장애물이 있는 환경에서는 경로와 통과 시점을 따로 정할 수 없다. 지상국과의 가시선을 끊는 장애물의 그림자도 같은 성질의 제약이다.</w:t>
+        <w:t xml:space="preserve">도심항공교통(UAM) 기체는 지상국의 관제를 받으며 정해진 회랑을 비행한다. 지상국과 기체 사이를 다른 비행체가 지나면 가시선이 끊겨 링크를 잃으므로, 기체는 장애물과 그 그림자를 함께 피해야 한다. 둘 다 시간에 따라 움직이므로 경로와 통과 시점을 따로 정할 수 없다.</w:t>
       </w:r>
     </w:p>
     <w:p ns2:paraId="7547031E" ns2:textId="77777777">
@@ -166,7 +166,7 @@
         <w:pStyle w:val="ab"/>
       </w:pPr>
       <w:r>
-        <w:t xml:space="preserve">기존 접근은 자유 공간을 볼록한 셀로 분해하고, 어느 셀을 지날지를 혼합정수 문제의 볼록 완화로 푼다</w:t>
+        <w:t xml:space="preserve">자유 공간을 볼록한 셀로 분해하는 접근은 어느 셀을 지날지를 혼합정수 문제의 볼록 완화로 푼다</w:t>
       </w:r>
       <w:r>
         <w:rPr>
@@ -175,7 +175,7 @@
         <w:t xml:space="preserve">(1)</w:t>
       </w:r>
       <w:r>
-        <w:t xml:space="preserve">. 시간을 곡선의 좌표로 두는 리프팅은 선행 연구에서 제시되었으나</w:t>
+        <w:t xml:space="preserve">. 시간을 곡선의 좌표로 두는 리프팅도 분해를 미리 확정하며 등속 장애물만 다룬다</w:t>
       </w:r>
       <w:r>
         <w:rPr>
@@ -184,7 +184,7 @@
         <w:t xml:space="preserve">(2)</w:t>
       </w:r>
       <w:r>
-        <w:t xml:space="preserve">, 분해를 최적화 전에 확정하며 등속 장애물만 다룬다. 분리 평면을 결정 변수로 두어 분해를 피하는 계획법은 시간 배분이 매듭 벡터에 고정되고</w:t>
+        <w:t xml:space="preserve">. 분리 평면을 결정 변수로 두면 분해는 피하지만, 장애물을 궤적 구간마다 볼록 껍질로 감싸고 시간 배분을 미리 고정한다</w:t>
       </w:r>
       <w:r>
         <w:rPr>
@@ -193,7 +193,7 @@
         <w:t xml:space="preserve">(3)</w:t>
       </w:r>
       <w:r>
-        <w:t xml:space="preserve">, 시간을 매개변수로 두는 시공간 회랑에서 볼록 껍질 성질이 성립하려면 별도의 충분조건이 필요하다</w:t>
+        <w:t xml:space="preserve">. 시간을 매개변수로 둔 시공간 회랑에서는 볼록 껍질 성질이 성립하려면 별도의 충분조건이 필요하다</w:t>
       </w:r>
       <w:r>
         <w:rPr>
@@ -210,7 +210,7 @@
         <w:pStyle w:val="ab"/>
       </w:pPr>
       <w:r>
-        <w:t xml:space="preserve">본 논문은 같은 리프팅 위에서 KOZ의 국소 볼록 외부 근사를 순차 볼록 계획법(sequential convex programming, SCP) 반복마다 현재 반복점 둘레에 다시 세운다. 자유 공간을 미리 분해하지 않고 이산 결정도 두지 않는다. 기여는 세 가지이다. 첫째, 움직이는 장애물의 keep-out zone(KOZ)은 리프팅된 공간에서 휘어진 관이 되는데, 분할구간 둘레의 구로 잘라낸 부분의 supporting half-space(지지 반공간)만 세우므로 관이 볼록일 필요가 없다. 둘째, 근접 구간마다 반공간을 하나씩 세워 관이 굽어 감싸는 경우도 다룬다. 셋째, 지상국을 점광원으로 두면 장애물과 그 그림자가 하나의 KOZ가 되어, 같은 구성이 가시선 제약을 함께 처리한다.</w:t>
+        <w:t xml:space="preserve">본 논문은 분해도 시간 배분도 미리 정하지 않는다. 장애물의 볼록 외부 근사를 고정된 시간 구간이 아니라 같은 리프팅된 공간에서 현재 반복점 둘레의 구 위에 순차 볼록 계획법(sequential convex programming, SCP) 반복마다 다시 세우므로, 통과 시각을 미리 정하지 않아도 근사가 정의된다. 기여는 세 가지이다. 첫째, 이동 장애물의 keep-out zone(KOZ)은 휘어진 관이지만 구로 잘라낸 부분의 supporting half-space(지지 반공간)만 세우므로 관이 볼록일 필요가 없다. 둘째, 근접 구간마다 반공간을 하나씩 세워 관이 굽어 감싸는 경우도 다룬다. 셋째, 지상국을 점광원으로 두면 장애물과 그 그림자가 하나의 KOZ가 되어 같은 구성이 가시선 제약을 함께 처리한다.</w:t>
       </w:r>
     </w:p>
     <w:p ns2:paraId="65F13D71" ns2:textId="77777777">
@@ -237,7 +237,7 @@
         <w:pStyle w:val="ab"/>
       </w:pPr>
       <w:r>
-        <w:t xml:space="preserve">시간을 네 번째 좌표로 더해 공간 3차원을 4차원으로 리프팅하면 등속으로 움직이는 구형 KOZ는 리프팅된 공간에서 기울어진 정적인 관, 곧 중심선 위의 각 점을 중심으로 하는 반지름 rₘ의 구를 합친 집합이 된다. 장애물이 정적이므로 Bézier 곡선의 볼록 껍질 성질을 충돌 조건에 바로 쓸 수 있다. 리프팅된 공간의 거리는 1 s를 1 m로 환산한다. 결정 변수는 공간 좌표와 시간 좌표를 함께 가진 제어점이며, De Casteljau 분할로 얻은 분할구간이 제약을 부과하는 단위이다. 분할구간마다 제어점의 평균을 무게중심 c로, c에서 제어점까지의 최대 거리를 반지름 E로 둔다. 시간 좌표에는 </w:t>
+        <w:t xml:space="preserve">시간을 네 번째 좌표로 더해 공간 3차원을 4차원으로 리프팅하면 등속으로 움직이는 구형 KOZ는 리프팅된 공간에서 기울어진 정적인 관, 곧 중심선 위의 각 점을 중심으로 하는 반지름 rₘ의 구를 합친 집합이 된다. 장애물이 정적이므로 볼록 껍질 성질을 충돌 조건에 바로 쓸 수 있다. 리프팅된 공간의 거리는 1 s를 1 m로 환산한다. 결정 변수는 공간 좌표와 시간 좌표를 함께 가진 제어점이며, De Casteljau 분할로 얻은 분할구간이 제약을 부과하는 단위이다. 분할구간마다 제어점의 평균을 무게중심 c로, c에서 제어점까지의 최대 거리를 반지름 E로 둔다. 시간 좌표에는 </w:t>
       </w:r>
       <w:r>
         <w:rPr>
@@ -271,7 +271,7 @@
         <w:pStyle w:val="ab"/>
       </w:pPr>
       <w:r>
-        <w:t xml:space="preserve">d가 rₘ + E + δ를 넘는 (분할구간, 장애물) 쌍은 닿을 수 없으므로 제약을 세우지 않는다. 하한 E + δ는 다음 반복점의 분할구간 전체를 구 안에 머무르게 하므로, 클리핑된 볼륨에 대한 반공간이 KOZ 전체에 대한 조건이 된다.</w:t>
+        <w:t xml:space="preserve">d가 rₘ + E + δ를 넘는 (분할구간, 장애물) 쌍은 닿을 수 없으므로 제약을 세우지 않는다. 하한 E + δ는 다음 반복점의 분할구간을 구 안에 가두므로, 클리핑된 볼륨에 대한 반공간이 KOZ 전체에 대한 조건이 된다.</w:t>
       </w:r>
     </w:p>
     <w:p>
@@ -321,7 +321,7 @@
         <w:t xml:space="preserve">(2)</w:t>
       </w:r>
       <w:r>
-        <w:t xml:space="preserve">과 같이 제어 다각형의 변마다 부과하는 기울기 제한이다. 여유 변수(slack variable)와 그 페널티 항은 하위 문제의 실현 가능성을 보완할 뿐 회피 기제가 아니다.</w:t>
+        <w:t xml:space="preserve">과 같이 제어 다각형의 변마다 부과하는 기울기 제한이다.</w:t>
       </w:r>
     </w:p>
     <w:p>
@@ -439,7 +439,7 @@
         <w:pStyle w:val="ab"/>
       </w:pPr>
       <w:r>
-        <w:t xml:space="preserve">얻는 해는 초기값에 의존하는 국소해이며, 장애물의 운동은 알려져 있다고 가정한다. 시간 축 척도와 클리핑 반지름의 하한은 모델링 선택이며 반공간의 보수성을 정한다.</w:t>
+        <w:t xml:space="preserve">해는 초기값에 의존하는 국소해이며, 장애물의 운동은 알려져 있다고 가정한다. 시간 축 척도와 클리핑 반지름의 하한은 모델링 선택이며 보수성을 정한다.</w:t>
       </w:r>
     </w:p>
     <w:p ns2:paraId="151F3A2F" ns2:textId="77777777">

</xml_diff>

<commit_message>
paper(A2): equations numbered and cited as 식 (1)/(2); SCvx cited as ref 5; solve time carries its machine and solver; 결론 states both halves of the claim
</commit_message>
<xml_diff>
--- a/paper/ksas_2026_fall/manuscript.docx
+++ b/paper/ksas_2026_fall/manuscript.docx
@@ -210,7 +210,16 @@
         <w:pStyle w:val="ab"/>
       </w:pPr>
       <w:r>
-        <w:t xml:space="preserve">본 논문은 분해도 시간 배분도 미리 정하지 않는다. 장애물의 볼록 외부 근사를 고정된 시간 구간이 아니라 같은 리프팅된 공간에서 현재 반복점 둘레의 구 위에 순차 볼록 계획법(sequential convex programming, SCP) 반복마다 다시 세우므로, 통과 시각을 미리 정하지 않아도 근사가 정의된다. 기여는 세 가지이다. 첫째, 이동 장애물의 keep-out zone(KOZ)은 휘어진 관이지만 구로 잘라낸 부분의 supporting half-space(지지 반공간)만 세우므로 관이 볼록일 필요가 없다. 둘째, 근접 구간마다 반공간을 하나씩 세워 관이 굽어 감싸는 경우도 다룬다. 셋째, 지상국을 점광원으로 두면 장애물과 그 그림자가 하나의 KOZ가 되어 같은 구성이 가시선 제약을 함께 처리한다.</w:t>
+        <w:t xml:space="preserve">본 논문은 분해도 시간 배분도 미리 정하지 않는다. 장애물의 볼록 외부 근사를 고정된 시간 구간이 아니라 같은 리프팅된 공간에서 현재 반복점 둘레의 구 위에 순차 볼록 계획법(sequential convex programming, SCP)</w:t>
+      </w:r>
+      <w:r>
+        <w:rPr>
+          <w:vertAlign w:val="superscript"/>
+        </w:rPr>
+        <w:t xml:space="preserve">(5)</w:t>
+      </w:r>
+      <w:r>
+        <w:t xml:space="preserve"> 반복마다 다시 세우므로, 통과 시각을 미리 정하지 않아도 근사가 정의된다. 첫째, 이동 장애물의 keep-out zone(KOZ)은 휘어진 관이지만 구로 잘라낸 부분의 supporting half-space(지지 반공간)만 세우므로 관이 볼록일 필요가 없다. 둘째, 근접 구간마다 반공간을 하나씩 세워 관이 굽어 감싸는 경우도 다룬다. 셋째, 지상국을 점광원으로 두면 장애물과 그 그림자가 하나의 KOZ가 되어 같은 구성이 가시선 제약을 함께 처리한다.</w:t>
       </w:r>
     </w:p>
     <w:p ns2:paraId="65F13D71" ns2:textId="77777777">
@@ -260,10 +269,19 @@
     <w:p>
       <w:pPr>
         <w:pStyle w:val="a5"/>
-        <w:jc w:val="center"/>
-      </w:pPr>
-      <w:r>
+        <w:keepLines/>
+        <w:tabs>
+          <w:tab w:val="center" w:pos="2268"/>
+          <w:tab w:val="right" w:pos="4535"/>
+        </w:tabs>
+        <w:ind w:firstLine="0"/>
+        <w:jc w:val="left"/>
+      </w:pPr>
+      <w:r>
+        <w:tab/>
         <w:t xml:space="preserve">r = max(d, E + δ)</w:t>
+        <w:tab/>
+        <w:t>(1)</w:t>
       </w:r>
     </w:p>
     <w:p ns2:paraId="7547031E" ns2:textId="77777777">
@@ -271,7 +289,7 @@
         <w:pStyle w:val="ab"/>
       </w:pPr>
       <w:r>
-        <w:t xml:space="preserve">d가 rₘ + E + δ를 넘는 (분할구간, 장애물) 쌍은 닿을 수 없으므로 제약을 세우지 않는다. 하한 E + δ는 다음 반복점의 분할구간을 구 안에 가두므로, 클리핑된 볼륨에 대한 반공간이 KOZ 전체에 대한 조건이 된다.</w:t>
+        <w:t xml:space="preserve">d가 rₘ + E + δ를 넘는 (분할구간, 장애물) 쌍은 닿을 수 없으므로 제약을 세우지 않는다. 식 (1)의 하한 E + δ는 다음 반복점의 분할구간을 구 안에 가두므로, 클리핑된 볼륨에 대한 반공간이 KOZ 전체에 대한 조건이 된다.</w:t>
       </w:r>
     </w:p>
     <w:p>
@@ -287,16 +305,25 @@
         <w:pStyle w:val="ab"/>
       </w:pPr>
       <w:r>
-        <w:t xml:space="preserve">근접 구간마다 반공간을 하나씩 세운다. 중심선 위의 점에서 c까지의 거리를 시간의 함수로 보고 그 극대점마다 자른 조각이 근접 구간이다. 한 근접 구간에서 c에 가장 가까운 중심선의 점을 p, 그 근접 구간의 중심선이 만드는 클리핑된 KOZ 볼륨을 L, 분할구간의 제어점을 Qᵢ라 하면</w:t>
+        <w:t xml:space="preserve">근접 구간마다 반공간을 하나씩 세운다. 중심선 위의 점에서 c까지의 거리를 시간의 함수로 보고 그 극대점마다 자른 조각이 근접 구간이다. 한 근접 구간에서 c에 가장 가까운 중심선의 점을 p, 법선을 n = (c − p)/‖c − p‖, 그 근접 구간의 중심선이 만드는 클리핑된 KOZ 볼륨을 L, 분할구간의 제어점을 Qᵢ라 하면</w:t>
       </w:r>
     </w:p>
     <w:p>
       <w:pPr>
         <w:pStyle w:val="a5"/>
-        <w:jc w:val="center"/>
-      </w:pPr>
-      <w:r>
-        <w:t xml:space="preserve">n = (c − p)/‖c − p‖,  b = max{n·x : x ∈ L},  n·Qᵢ ≥ b</w:t>
+        <w:keepLines/>
+        <w:tabs>
+          <w:tab w:val="center" w:pos="2268"/>
+          <w:tab w:val="right" w:pos="4535"/>
+        </w:tabs>
+        <w:ind w:firstLine="0"/>
+        <w:jc w:val="left"/>
+      </w:pPr>
+      <w:r>
+        <w:tab/>
+        <w:t xml:space="preserve">b = max{n·x : x ∈ L},  n·Qᵢ ≥ b</w:t>
+        <w:tab/>
+        <w:t>(2)</w:t>
       </w:r>
     </w:p>
     <w:p ns2:paraId="7547031E" ns2:textId="77777777">
@@ -304,7 +331,7 @@
         <w:pStyle w:val="ab"/>
       </w:pPr>
       <w:r>
-        <w:t xml:space="preserve">b가 L의 지지값이므로 L은 반공간 밖에 남고, 같은 반공간을 모든 제어점에 부과하면 볼록 껍질 성질에 의해 곡선 전체가 반공간 안에 놓인다. 관이 굽어 c를 감싸면 하나의 평면으로는 c를 허용 쪽에 둘 수 없지만, 극대점에서 자르면 근접 구간마다 반공간이 하나씩 생겨 그 사이의 틈이 허용 영역으로 남는다.</w:t>
+        <w:t xml:space="preserve">식 (2)에서 b가 L의 지지값이므로 L은 반공간 밖에 남고, 같은 반공간을 모든 제어점에 부과하면 볼록 껍질 성질에 의해 곡선 전체가 반공간 안에 놓인다. 관이 굽어 c를 감싸면 하나의 평면으로는 c를 허용 쪽에 둘 수 없지만, 극대점에서 자르면 근접 구간마다 반공간이 하나씩 생겨 그 사이의 틈이 허용 영역으로 남는다.</w:t>
       </w:r>
     </w:p>
     <w:p ns2:paraId="7547031E" ns2:textId="77777777">
@@ -312,7 +339,7 @@
         <w:pStyle w:val="ab"/>
       </w:pPr>
       <w:r>
-        <w:t xml:space="preserve">회피는 이 반공간 제약만으로 이루어진다. 목적함수는 매개변수 영역의 매끄러움 정규화 항과 도착 시각에 대한 선형 페널티 항이고, 속도 제한은 </w:t>
+        <w:t xml:space="preserve">목적함수는 매개변수 영역의 매끄러움 정규화 항과 도착 시각에 대한 선형 페널티 항이고, 속도 제한은 </w:t>
       </w:r>
       <w:r>
         <w:rPr>
@@ -361,7 +388,7 @@
         <w:pStyle w:val="ab"/>
       </w:pPr>
       <w:r>
-        <w:t xml:space="preserve">차폐 제약이 없는 기준 실행에서 기체는 속도 상한으로 곧장 통과하여 40.0 s에 도착하고, 그림자에 든 14.96–16.52 s에 가시선을 잃는다(최소 가시선 여유 −2.17 m, Fig. 1). 차폐 제약을 부과한 실행에서는 기체가 같은 경로를 따르되 도착이 46.6 s로 늦어지고, 그림자가 지나간 뒤에 교차 지점을 통과한다. 반환된 궤적에서 위반량과 여유 변수는 0이고(16회 반복, 0.5 s), 궤적의 표본 검사에서도 최소 가시선 여유 +3.3 m로 전 구간 가시선을 유지하였다. 두 실행의 경로는 공간에서 겹치고(최대 횡방향 편차 0.55 m) 통과 시점만 다르며, 제약을 부과한 실행의 경로를 기준 실행의 시각 배분으로 비행하면 최소 가시선 여유가 −1.69 m로 떨어진다. 그림자만 피해 회랑 축을 따라 도달할 수 있는 시각의 하한은 43.0 s이며, 차이 3.6 s는 리프팅된 KOZ의 시간 방향 두께(시간 축 척도)가 낳는 보수성이다.</w:t>
+        <w:t xml:space="preserve">차폐 제약이 없는 기준 실행에서 기체는 속도 상한으로 곧장 통과하여 40.0 s에 도착하고, 그림자에 든 14.96–16.52 s에 가시선을 잃는다(최소 가시선 여유 −2.17 m, Fig. 1). 차폐 제약을 부과한 실행에서는 기체가 같은 경로를 따르되 도착이 46.6 s로 늦어지고, 그림자가 지나간 뒤에 교차 지점을 통과한다. 반환된 궤적에서 위반량과 여유 변수는 0이고(16회 반복, 0.5 s; Rust 구현, Clarabel, Apple M2), 궤적의 표본 검사에서도 최소 가시선 여유 +3.3 m로 전 구간 가시선을 유지하였다. 두 실행의 경로는 공간에서 겹치고(최대 횡방향 편차 0.55 m) 통과 시점만 다르며, 제약을 부과한 실행의 경로를 기준 실행의 시각 배분으로 비행하면 최소 가시선 여유가 −1.69 m로 떨어진다. 그림자만 피해 회랑 축을 따라 도달할 수 있는 시각의 하한은 43.0 s이며, 차이 3.6 s는 리프팅된 KOZ의 시간 방향 두께(시간 축 척도)가 낳는 보수성이다.</w:t>
       </w:r>
     </w:p>
     <w:p>
@@ -412,7 +439,7 @@
         <w:pStyle w:val="ad"/>
       </w:pPr>
       <w:r>
-        <w:t xml:space="preserve">Fig. 1 Left: scene at t = 15.7 s; green, sight lines to the baseline (off, in the shadow) and the constrained run (on); red, the body's lap. Right: sight margin vs time.</w:t>
+        <w:t xml:space="preserve">Fig. 1 Scene at t = 15.7 s with sight lines (off: baseline, on: constrained); right, sight margin vs time.</w:t>
       </w:r>
     </w:p>
     <w:p ns2:paraId="5798E127" ns2:textId="66D9C8DB">
@@ -431,7 +458,7 @@
         <w:pStyle w:val="ab"/>
       </w:pPr>
       <w:r>
-        <w:t xml:space="preserve">클리핑된 KOZ 볼륨의 지지 반공간을 SCP 반복마다 다시 세워, 분해 없이 장애물과 그 그림자를 하나의 최적화로 피하였다.</w:t>
+        <w:t xml:space="preserve">클리핑된 KOZ 볼륨의 지지 반공간을 SCP 반복마다 다시 세워, 분해와 시간 배분을 미리 정하지 않고 장애물과 그 그림자를 하나의 최적화로 피하였다.</w:t>
       </w:r>
     </w:p>
     <w:p ns2:paraId="7547031E" ns2:textId="77777777">
@@ -439,7 +466,7 @@
         <w:pStyle w:val="ab"/>
       </w:pPr>
       <w:r>
-        <w:t xml:space="preserve">해는 초기값에 의존하는 국소해이며, 장애물의 운동은 알려져 있다고 가정한다. 시간 축 척도와 클리핑 반지름의 하한은 모델링 선택이며 보수성을 정한다.</w:t>
+        <w:t xml:space="preserve">해는 초기값에 의존하는 국소해이며, 장애물의 운동은 알려져 있다고 가정한다.</w:t>
       </w:r>
     </w:p>
     <w:p ns2:paraId="151F3A2F" ns2:textId="77777777">
@@ -518,6 +545,18 @@
       </w:pPr>
       <w:r>
         <w:t xml:space="preserve">4)Zhang, W., Yadmellat, P., and Gao, Z., “A Sufficient Condition for Convex Hull Property in General Convex Spatio-Temporal Corridors,” arXiv:2110.00065, 2021.</w:t>
+      </w:r>
+    </w:p>
+    <w:p ns2:paraId="7AF33532" ns2:textId="77777777">
+      <w:pPr>
+        <w:pStyle w:val="ae"/>
+        <w:rPr>
+          <w:sz w:val="18"/>
+          <w:szCs w:val="18"/>
+        </w:rPr>
+      </w:pPr>
+      <w:r>
+        <w:t xml:space="preserve">5)Mao, Y., Szmuk, M., and Açıkmeşe, B., “Successive Convexification of Non-Convex Optimal Control Problems and Its Convergence Properties,” Proc. IEEE CDC, 2016.</w:t>
       </w:r>
     </w:p>
     <w:sectPr>

</xml_diff>

<commit_message>
tools(paper): docx_edit keeps the document's namespace prefixes — Word refused every file it had written; manuscript repaired and trimmed to two pages in Word
ElementTree drops prefixes on parse and invents ns1, ns2, ... on write, so
mc:Ignorable="w14 w15 ..." named prefixes that no longer existed and Word
opened the file only through recovery. The tool now registers the prefixes
the document declares and splices the original root tag back in. The
manuscript's document.xml was rewritten once with canonical prefixes and
the template's root tag; a docx_edit round-trip now leaves it unchanged.

Word lays the template out looser than LibreOffice (four lines over on
this manuscript), so the page count is now checked in Word through
AppleScript as well: 2 pages in both.
</commit_message>
<xml_diff>
--- a/paper/ksas_2026_fall/manuscript.docx
+++ b/paper/ksas_2026_fall/manuscript.docx
@@ -1,8 +1,8 @@
 
 <file path=word/document.xml><?xml version="1.0" encoding="utf-8"?>
-<w:document xmlns:ns1="http://schemas.openxmlformats.org/markup-compatibility/2006" xmlns:ns2="http://schemas.microsoft.com/office/word/2010/wordml" xmlns:ns3="http://schemas.openxmlformats.org/officeDocument/2006/relationships" xmlns:ns4="http://schemas.openxmlformats.org/drawingml/2006/wordprocessingDrawing" xmlns:ns5="http://schemas.openxmlformats.org/drawingml/2006/main" xmlns:ns6="http://schemas.openxmlformats.org/drawingml/2006/picture" xmlns:w="http://schemas.openxmlformats.org/wordprocessingml/2006/main" ns1:Ignorable="w14 w15 w16se w16cid w16 w16cex w16sdtdh w16sdtfl w16du wp14">
+<w:document xmlns:wpc="http://schemas.microsoft.com/office/word/2010/wordprocessingCanvas" xmlns:cx="http://schemas.microsoft.com/office/drawing/2014/chartex" xmlns:cx1="http://schemas.microsoft.com/office/drawing/2015/9/8/chartex" xmlns:cx2="http://schemas.microsoft.com/office/drawing/2015/10/21/chartex" xmlns:cx3="http://schemas.microsoft.com/office/drawing/2016/5/9/chartex" xmlns:cx4="http://schemas.microsoft.com/office/drawing/2016/5/10/chartex" xmlns:cx5="http://schemas.microsoft.com/office/drawing/2016/5/11/chartex" xmlns:cx6="http://schemas.microsoft.com/office/drawing/2016/5/12/chartex" xmlns:cx7="http://schemas.microsoft.com/office/drawing/2016/5/13/chartex" xmlns:cx8="http://schemas.microsoft.com/office/drawing/2016/5/14/chartex" xmlns:mc="http://schemas.openxmlformats.org/markup-compatibility/2006" xmlns:aink="http://schemas.microsoft.com/office/drawing/2016/ink" xmlns:am3d="http://schemas.microsoft.com/office/drawing/2017/model3d" xmlns:o="urn:schemas-microsoft-com:office:office" xmlns:oel="http://schemas.microsoft.com/office/2019/extlst" xmlns:r="http://schemas.openxmlformats.org/officeDocument/2006/relationships" xmlns:m="http://schemas.openxmlformats.org/officeDocument/2006/math" xmlns:v="urn:schemas-microsoft-com:vml" xmlns:wp14="http://schemas.microsoft.com/office/word/2010/wordprocessingDrawing" xmlns:wp="http://schemas.openxmlformats.org/drawingml/2006/wordprocessingDrawing" xmlns:w10="urn:schemas-microsoft-com:office:word" xmlns:w="http://schemas.openxmlformats.org/wordprocessingml/2006/main" xmlns:w14="http://schemas.microsoft.com/office/word/2010/wordml" xmlns:w15="http://schemas.microsoft.com/office/word/2012/wordml" xmlns:w16cex="http://schemas.microsoft.com/office/word/2018/wordml/cex" xmlns:w16cid="http://schemas.microsoft.com/office/word/2016/wordml/cid" xmlns:w16="http://schemas.microsoft.com/office/word/2018/wordml" xmlns:w16du="http://schemas.microsoft.com/office/word/2023/wordml/word16du" xmlns:w16sdtdh="http://schemas.microsoft.com/office/word/2020/wordml/sdtdatahash" xmlns:w16sdtfl="http://schemas.microsoft.com/office/word/2024/wordml/sdtformatlock" xmlns:w16se="http://schemas.microsoft.com/office/word/2015/wordml/symex" xmlns:wpg="http://schemas.microsoft.com/office/word/2010/wordprocessingGroup" xmlns:wpi="http://schemas.microsoft.com/office/word/2010/wordprocessingInk" xmlns:wne="http://schemas.microsoft.com/office/word/2006/wordml" xmlns:wps="http://schemas.microsoft.com/office/word/2010/wordprocessingShape" xmlns:a="http://schemas.openxmlformats.org/drawingml/2006/main" xmlns:pic="http://schemas.openxmlformats.org/drawingml/2006/picture" mc:Ignorable="w14 w15 w16se w16cid w16 w16cex w16sdtdh w16sdtfl w16du wp14">
   <w:body>
-    <w:p ns2:paraId="5D7AF68C" ns2:textId="4DEAD5F6">
+    <w:p>
       <w:pPr>
         <w:pStyle w:val="a6"/>
         <w:spacing w:after="80" w:line="276" w:lineRule="auto"/>
@@ -11,7 +11,7 @@
         <w:t xml:space="preserve">볼록 분해와 시간 배분을 미리 정하지 않는 시공간 궤적 최적화: 이동 장애물 회피와 가시선 제약의 동시 처리</w:t>
       </w:r>
     </w:p>
-    <w:p ns2:paraId="51514DAC" ns2:textId="21B44746">
+    <w:p>
       <w:pPr>
         <w:pStyle w:val="a8"/>
         <w:spacing w:line="360" w:lineRule="auto"/>
@@ -40,7 +40,7 @@
         <w:t xml:space="preserve">1</w:t>
       </w:r>
     </w:p>
-    <w:p ns2:paraId="371DA025" ns2:textId="77777777">
+    <w:p>
       <w:pPr>
         <w:pStyle w:val="a8"/>
       </w:pPr>
@@ -55,7 +55,7 @@
         <w:t xml:space="preserve">1</w:t>
       </w:r>
     </w:p>
-    <w:p ns2:paraId="2D38DA18" ns2:textId="4C296537">
+    <w:p>
       <w:pPr>
         <w:pStyle w:val="a7"/>
         <w:spacing w:after="80"/>
@@ -64,7 +64,7 @@
         <w:t xml:space="preserve">Space-Time Trajectory Optimization without Precomputed Convex Decomposition or Fixed Time Allocation: Simultaneous Handling of Moving-Obstacle Avoidance and Line-of-Sight Constraints</w:t>
       </w:r>
     </w:p>
-    <w:p ns2:paraId="791394AB" ns2:textId="0B039C73">
+    <w:p>
       <w:pPr>
         <w:pStyle w:val="a8"/>
         <w:spacing w:after="120"/>
@@ -93,7 +93,7 @@
         <w:t xml:space="preserve">1</w:t>
       </w:r>
     </w:p>
-    <w:p ns2:paraId="7F3B6F09" ns2:textId="77777777">
+    <w:p>
       <w:pPr>
         <w:spacing w:after="0" w:line="312" w:lineRule="auto"/>
         <w:jc w:val="center"/>
@@ -110,7 +110,7 @@
         <w:t>━━━━━━━━━━━━━━━━━━━━━━━━━━━━━━━━</w:t>
       </w:r>
     </w:p>
-    <w:p ns2:paraId="261FA37B" ns2:textId="77777777">
+    <w:p>
       <w:pPr>
         <w:pStyle w:val="ac"/>
         <w:tabs>
@@ -126,7 +126,7 @@
         <w:t xml:space="preserve">Key Words : Trajectory Optimization(궤적 최적화), Space-Time Bezier Curve(시공간 베지어 곡선), Line-of-Sight Constraint(가시선 제약)</w:t>
       </w:r>
     </w:p>
-    <w:p ns2:paraId="015089DF" ns2:textId="77777777">
+    <w:p>
       <w:pPr>
         <w:spacing w:after="0"/>
         <w:rPr>
@@ -134,8 +134,8 @@
           <w:color w:val="4BACC6" w:themeColor="accent5"/>
         </w:rPr>
         <w:sectPr>
-          <w:headerReference w:type="default" ns3:id="rId7"/>
-          <w:footerReference w:type="default" ns3:id="rId8"/>
+          <w:headerReference w:type="default" r:id="rId7"/>
+          <w:footerReference w:type="default" r:id="rId8"/>
           <w:endnotePr>
             <w:numFmt w:val="decimal"/>
           </w:endnotePr>
@@ -145,7 +145,7 @@
         </w:sectPr>
       </w:pPr>
     </w:p>
-    <w:p ns2:paraId="0A1C2869" ns2:textId="77777777">
+    <w:p>
       <w:pPr>
         <w:pStyle w:val="aa"/>
       </w:pPr>
@@ -153,7 +153,7 @@
         <w:t xml:space="preserve">서 론</w:t>
       </w:r>
     </w:p>
-    <w:p ns2:paraId="7547031E" ns2:textId="77777777">
+    <w:p>
       <w:pPr>
         <w:pStyle w:val="ab"/>
       </w:pPr>
@@ -161,7 +161,7 @@
         <w:t xml:space="preserve">도심항공교통(UAM) 기체는 지상국의 관제를 받으며 정해진 회랑을 비행한다. 지상국과 기체 사이를 다른 비행체가 지나면 가시선이 끊겨 링크를 잃으므로, 기체는 장애물과 그 그림자를 함께 피해야 한다. 둘 다 시간에 따라 움직이므로 경로와 통과 시점을 따로 정할 수 없다.</w:t>
       </w:r>
     </w:p>
-    <w:p ns2:paraId="7547031E" ns2:textId="77777777">
+    <w:p>
       <w:pPr>
         <w:pStyle w:val="ab"/>
       </w:pPr>
@@ -205,7 +205,7 @@
         <w:t xml:space="preserve">.</w:t>
       </w:r>
     </w:p>
-    <w:p ns2:paraId="7547031E" ns2:textId="77777777">
+    <w:p>
       <w:pPr>
         <w:pStyle w:val="ab"/>
       </w:pPr>
@@ -222,7 +222,7 @@
         <w:t xml:space="preserve"> 반복마다 다시 세우므로, 통과 시각을 미리 정하지 않아도 근사가 정의된다. 첫째, 이동 장애물의 keep-out zone(KOZ)은 휘어진 관이지만 구로 잘라낸 부분의 supporting half-space(지지 반공간)만 세우므로 관이 볼록일 필요가 없다. 둘째, 근접 구간마다 반공간을 하나씩 세워 관이 굽어 감싸는 경우도 다룬다. 셋째, 지상국을 점광원으로 두면 장애물과 그 그림자가 하나의 KOZ가 되어 같은 구성이 가시선 제약을 함께 처리한다.</w:t>
       </w:r>
     </w:p>
-    <w:p ns2:paraId="65F13D71" ns2:textId="77777777">
+    <w:p>
       <w:pPr>
         <w:pStyle w:val="aa"/>
       </w:pPr>
@@ -241,7 +241,7 @@
         <w:t xml:space="preserve">2.1 리프팅과 클리핑된 KOZ 볼륨</w:t>
       </w:r>
     </w:p>
-    <w:p ns2:paraId="7547031E" ns2:textId="77777777">
+    <w:p>
       <w:pPr>
         <w:pStyle w:val="ab"/>
       </w:pPr>
@@ -258,7 +258,7 @@
         <w:t xml:space="preserve">과 같이 단조 증가와 최소 시간 간격을 부과한다.</w:t>
       </w:r>
     </w:p>
-    <w:p ns2:paraId="7547031E" ns2:textId="77777777">
+    <w:p>
       <w:pPr>
         <w:pStyle w:val="ab"/>
       </w:pPr>
@@ -284,7 +284,7 @@
         <w:t>(1)</w:t>
       </w:r>
     </w:p>
-    <w:p ns2:paraId="7547031E" ns2:textId="77777777">
+    <w:p>
       <w:pPr>
         <w:pStyle w:val="ab"/>
       </w:pPr>
@@ -300,7 +300,7 @@
         <w:t xml:space="preserve">2.2 근접 구간별 지지 반공간</w:t>
       </w:r>
     </w:p>
-    <w:p ns2:paraId="7547031E" ns2:textId="77777777">
+    <w:p>
       <w:pPr>
         <w:pStyle w:val="ab"/>
       </w:pPr>
@@ -326,15 +326,15 @@
         <w:t>(2)</w:t>
       </w:r>
     </w:p>
-    <w:p ns2:paraId="7547031E" ns2:textId="77777777">
+    <w:p>
       <w:pPr>
         <w:pStyle w:val="ab"/>
       </w:pPr>
       <w:r>
-        <w:t xml:space="preserve">식 (2)에서 b가 L의 지지값이므로 L은 반공간 밖에 남고, 같은 반공간을 모든 제어점에 부과하면 볼록 껍질 성질에 의해 곡선 전체가 반공간 안에 놓인다. 관이 굽어 c를 감싸면 하나의 평면으로는 c를 허용 쪽에 둘 수 없지만, 극대점에서 자르면 근접 구간마다 반공간이 하나씩 생겨 그 사이의 틈이 허용 영역으로 남는다.</w:t>
-      </w:r>
-    </w:p>
-    <w:p ns2:paraId="7547031E" ns2:textId="77777777">
+        <w:t xml:space="preserve">식 (2)에서 b가 L의 지지값이므로 L은 반공간 밖에 남고, 같은 반공간을 모든 제어점에 부과하면 볼록 껍질 성질에 의해 곡선 전체가 반공간 안에 놓인다. 관이 굽어 c를 감싸면 평면 하나로는 부족하지만, 극대점에서 자르면 근접 구간마다 반공간이 하나씩 생겨 그 사이의 틈이 허용 영역으로 남는다.</w:t>
+      </w:r>
+    </w:p>
+    <w:p>
       <w:pPr>
         <w:pStyle w:val="ab"/>
       </w:pPr>
@@ -359,12 +359,12 @@
         <w:t xml:space="preserve">2.3 가시선 차폐 제약</w:t>
       </w:r>
     </w:p>
-    <w:p ns2:paraId="7547031E" ns2:textId="77777777">
+    <w:p>
       <w:pPr>
         <w:pStyle w:val="ab"/>
       </w:pPr>
       <w:r>
-        <w:t xml:space="preserve">지상국을 점광원으로 두면 장애물의 KOZ는 장애물 구와 그 뒤쪽 그림자를 합친 하나의 집합이다. 중심선은 점광원에 대한 중심선의 그림자인 중심 곡면이 된다. 그림자가 회전하여 비볼록이 된 이 집합에 2.1절과 2.2절의 구성을 중심선 대신 중심 곡면으로 그대로 적용한다. 이를 차폐 제약이라 하며, 비용은 분할구간·장애물·지상국·근접 구간 조합마다 부등식 하나이다.</w:t>
+        <w:t xml:space="preserve">지상국을 점광원으로 두면 장애물의 KOZ는 장애물 구와 그 뒤쪽 그림자를 합친 하나의 집합이다. 중심선은 점광원에 대한 중심선의 그림자인 중심 곡면이 된다. 그림자가 회전하여 비볼록이 된 이 집합에 2.1절과 2.2절의 구성을 중심선 대신 중심 곡면으로 그대로 적용한다. 이를 차폐 제약이라 한다.</w:t>
       </w:r>
     </w:p>
     <w:p>
@@ -375,7 +375,7 @@
         <w:t xml:space="preserve">2.4 실험</w:t>
       </w:r>
     </w:p>
-    <w:p ns2:paraId="7547031E" ns2:textId="77777777">
+    <w:p>
       <w:pPr>
         <w:pStyle w:val="ab"/>
       </w:pPr>
@@ -383,7 +383,7 @@
         <w:t xml:space="preserve">제안 기법을 다음 시나리오에서 확인하였다. 지상국은 원점에 있고, 장애물은 지상국 상공 고도 50 m에서 반지름 30 m의 원을 주기 80 s로 선회하는 반지름 6 m의 구이다. 기체는 고도 62.5 m, 길이 200 m의 회랑(좌우 5 m, 고도 60–65 m)을 따라 지상국 옆을 지나며, 회랑은 그 고도에서 그림자 중심이 그리는 원에 접하도록 y = 37.5 m에 둔다. 회랑 바닥이 장애물 꼭대기보다 4 m 높아 장애물 구 부분은 침범될 수 없고, 통과 시점은 그림자 부분, 곧 차폐 제약이 정한다. 4차원 (x, y, z, t) 공간의 8차 Bézier 곡선을 48개 분할구간으로 나누고, 도착 시각은 자유롭게 두어 속도 상한 5 m/s와 도착 시각 페널티(가중치 40)를 함께 부과하였다(신뢰영역 1 m, 여유 변수 페널티 10⁵). 가시선 여유는 지상국–기체 선분에서 장애물 중심까지의 거리에서 장애물 반지름을 뺀 값이다.</w:t>
       </w:r>
     </w:p>
-    <w:p ns2:paraId="7547031E" ns2:textId="77777777">
+    <w:p>
       <w:pPr>
         <w:pStyle w:val="ab"/>
       </w:pPr>
@@ -400,37 +400,37 @@
       </w:pPr>
       <w:r>
         <w:drawing>
-          <ns4:inline distT="0" distB="0" distL="0" distR="0">
-            <ns4:extent cx="2879725" cy="1312816"/>
-            <ns4:effectExtent l="0" t="0" r="0" b="0"/>
-            <ns4:docPr id="1001" name="Picture 1" descr="occlusion figure"/>
-            <ns4:cNvGraphicFramePr/>
-            <ns5:graphic>
-              <ns5:graphicData uri="http://schemas.openxmlformats.org/drawingml/2006/picture">
-                <ns6:pic>
-                  <ns6:nvPicPr>
-                    <ns6:cNvPr id="1001" name="occlusion_figure.png"/>
-                    <ns6:cNvPicPr/>
-                  </ns6:nvPicPr>
-                  <ns6:blipFill>
-                    <ns5:blip ns3:embed="rId100"/>
-                    <ns5:stretch>
-                      <ns5:fillRect/>
-                    </ns5:stretch>
-                  </ns6:blipFill>
-                  <ns6:spPr>
-                    <ns5:xfrm>
-                      <ns5:off x="0" y="0"/>
-                      <ns5:ext cx="2879725" cy="1312816"/>
-                    </ns5:xfrm>
-                    <ns5:prstGeom prst="rect">
-                      <ns5:avLst/>
-                    </ns5:prstGeom>
-                  </ns6:spPr>
-                </ns6:pic>
-              </ns5:graphicData>
-            </ns5:graphic>
-          </ns4:inline>
+          <wp:inline distT="0" distB="0" distL="0" distR="0">
+            <wp:extent cx="2879725" cy="1312816"/>
+            <wp:effectExtent l="0" t="0" r="0" b="0"/>
+            <wp:docPr id="1001" name="Picture 1" descr="occlusion figure"/>
+            <wp:cNvGraphicFramePr/>
+            <a:graphic>
+              <a:graphicData uri="http://schemas.openxmlformats.org/drawingml/2006/picture">
+                <pic:pic>
+                  <pic:nvPicPr>
+                    <pic:cNvPr id="1001" name="occlusion_figure.png"/>
+                    <pic:cNvPicPr/>
+                  </pic:nvPicPr>
+                  <pic:blipFill>
+                    <a:blip r:embed="rId100"/>
+                    <a:stretch>
+                      <a:fillRect/>
+                    </a:stretch>
+                  </pic:blipFill>
+                  <pic:spPr>
+                    <a:xfrm>
+                      <a:off x="0" y="0"/>
+                      <a:ext cx="2879725" cy="1312816"/>
+                    </a:xfrm>
+                    <a:prstGeom prst="rect">
+                      <a:avLst/>
+                    </a:prstGeom>
+                  </pic:spPr>
+                </pic:pic>
+              </a:graphicData>
+            </a:graphic>
+          </wp:inline>
         </w:drawing>
       </w:r>
     </w:p>
@@ -439,10 +439,10 @@
         <w:pStyle w:val="ad"/>
       </w:pPr>
       <w:r>
-        <w:t xml:space="preserve">Fig. 1 Scene at t = 15.7 s with sight lines (off: baseline, on: constrained); right, sight margin vs time.</w:t>
-      </w:r>
-    </w:p>
-    <w:p ns2:paraId="5798E127" ns2:textId="66D9C8DB">
+        <w:t xml:space="preserve">Fig. 1 Scene at t = 15.7 s (left) and sight margin vs time (right).</w:t>
+      </w:r>
+    </w:p>
+    <w:p>
       <w:pPr>
         <w:pStyle w:val="aa"/>
       </w:pPr>
@@ -453,7 +453,7 @@
         <w:t xml:space="preserve">결 론</w:t>
       </w:r>
     </w:p>
-    <w:p ns2:paraId="7547031E" ns2:textId="77777777">
+    <w:p>
       <w:pPr>
         <w:pStyle w:val="ab"/>
       </w:pPr>
@@ -461,7 +461,7 @@
         <w:t xml:space="preserve">클리핑된 KOZ 볼륨의 지지 반공간을 SCP 반복마다 다시 세워, 분해와 시간 배분을 미리 정하지 않고 장애물과 그 그림자를 하나의 최적화로 피하였다.</w:t>
       </w:r>
     </w:p>
-    <w:p ns2:paraId="7547031E" ns2:textId="77777777">
+    <w:p>
       <w:pPr>
         <w:pStyle w:val="ab"/>
       </w:pPr>
@@ -469,7 +469,7 @@
         <w:t xml:space="preserve">해는 초기값에 의존하는 국소해이며, 장애물의 운동은 알려져 있다고 가정한다.</w:t>
       </w:r>
     </w:p>
-    <w:p ns2:paraId="151F3A2F" ns2:textId="77777777">
+    <w:p>
       <w:pPr>
         <w:pStyle w:val="aa"/>
       </w:pPr>
@@ -480,7 +480,7 @@
         <w:t xml:space="preserve">후 기</w:t>
       </w:r>
     </w:p>
-    <w:p ns2:paraId="7547031E" ns2:textId="77777777">
+    <w:p>
       <w:pPr>
         <w:pStyle w:val="ab"/>
       </w:pPr>
@@ -488,7 +488,7 @@
         <w:t xml:space="preserve">본 연구는 대한민국 정부(교육부)의 재원으로 한국연구재단의 4단계 BK21사업(2120240815267)의 지원을 받았음.</w:t>
       </w:r>
     </w:p>
-    <w:p ns2:paraId="73D19B3A" ns2:textId="77777777">
+    <w:p>
       <w:pPr>
         <w:pStyle w:val="aa"/>
       </w:pPr>
@@ -499,7 +499,7 @@
         <w:t xml:space="preserve">참고문헌</w:t>
       </w:r>
     </w:p>
-    <w:p ns2:paraId="7AF33532" ns2:textId="77777777">
+    <w:p>
       <w:pPr>
         <w:pStyle w:val="ae"/>
         <w:rPr>
@@ -511,7 +511,7 @@
         <w:t xml:space="preserve">1)Marcucci, T., Petersen, M., von Wrangel, D., and Tedrake, R., “Motion Planning around Obstacles with Convex Optimization,” Science Robotics, 8(84), 2023.</w:t>
       </w:r>
     </w:p>
-    <w:p ns2:paraId="7AF33532" ns2:textId="77777777">
+    <w:p>
       <w:pPr>
         <w:pStyle w:val="ae"/>
         <w:rPr>
@@ -523,7 +523,7 @@
         <w:t xml:space="preserve">2)Osburn, M. D., Peterson, C. K., and Salmon, J. L., “Systematic Constraint Formulation and Collision-Free Trajectory Planning Using Space-Time Graphs of Convex Sets,” arXiv:2508.10203, 2025.</w:t>
       </w:r>
     </w:p>
-    <w:p ns2:paraId="7AF33532" ns2:textId="77777777">
+    <w:p>
       <w:pPr>
         <w:pStyle w:val="ae"/>
         <w:rPr>
@@ -535,7 +535,7 @@
         <w:t xml:space="preserve">3)Tordesillas, J., and How, J. P., “MADER: Trajectory Planner in Multi-Agent and Dynamic Environments,” IEEE Trans. Robotics, 38(1), 2022.</w:t>
       </w:r>
     </w:p>
-    <w:p ns2:paraId="7AF33532" ns2:textId="77777777">
+    <w:p>
       <w:pPr>
         <w:pStyle w:val="ae"/>
         <w:rPr>
@@ -547,7 +547,7 @@
         <w:t xml:space="preserve">4)Zhang, W., Yadmellat, P., and Gao, Z., “A Sufficient Condition for Convex Hull Property in General Convex Spatio-Temporal Corridors,” arXiv:2110.00065, 2021.</w:t>
       </w:r>
     </w:p>
-    <w:p ns2:paraId="7AF33532" ns2:textId="77777777">
+    <w:p>
       <w:pPr>
         <w:pStyle w:val="ae"/>
         <w:rPr>
@@ -560,7 +560,7 @@
       </w:r>
     </w:p>
     <w:sectPr>
-      <w:headerReference w:type="default" ns3:id="rId11"/>
+      <w:headerReference w:type="default" r:id="rId11"/>
       <w:endnotePr>
         <w:numFmt w:val="decimal"/>
       </w:endnotePr>

</xml_diff>

<commit_message>
paper(A2): advisor's 2026-08-31 review applied — concept figure, problem stated as equations (3)/(4), parameters and results as tables, two references, short title
docx_edit lays equation paragraphs out on the template's centre/right tab stops so the equation number sits at the column edge; make_concept_figure draws the mission scene from scenario_loiter().
</commit_message>
<xml_diff>
--- a/paper/ksas_2026_fall/manuscript.docx
+++ b/paper/ksas_2026_fall/manuscript.docx
@@ -8,7 +8,7 @@
         <w:spacing w:after="80" w:line="276" w:lineRule="auto"/>
       </w:pPr>
       <w:r>
-        <w:t xml:space="preserve">볼록 분해와 시간 배분을 미리 정하지 않는 시공간 궤적 최적화: 이동 장애물 회피와 가시선 제약의 동시 처리</w:t>
+        <w:t xml:space="preserve">볼록 분해 없는 시공간 궤적 최적화: 이동 장애물 회피와 가시선 유지</w:t>
       </w:r>
     </w:p>
     <w:p>
@@ -61,7 +61,7 @@
         <w:spacing w:after="80"/>
       </w:pPr>
       <w:r>
-        <w:t xml:space="preserve">Space-Time Trajectory Optimization without Precomputed Convex Decomposition or Fixed Time Allocation: Simultaneous Handling of Moving-Obstacle Avoidance and Line-of-Sight Constraints</w:t>
+        <w:t xml:space="preserve">Decomposition-Free Space-Time Trajectory Optimization for Moving-Obstacle Avoidance and Line-of-Sight Maintenance</w:t>
       </w:r>
     </w:p>
     <w:p>
@@ -84,7 +84,7 @@
       </w:r>
       <w:r>
         <w:rPr/>
-        <w:t xml:space="preserve">, Su-Won Lee</w:t>
+        <w:t xml:space="preserve">, Suwon Lee</w:t>
       </w:r>
       <w:r>
         <w:rPr>
@@ -158,7 +158,7 @@
         <w:pStyle w:val="ab"/>
       </w:pPr>
       <w:r>
-        <w:t xml:space="preserve">도심항공교통(UAM) 기체는 지상국의 관제를 받으며 정해진 회랑을 비행한다. 지상국과 기체 사이를 다른 비행체가 지나면 가시선이 끊겨 링크를 잃으므로, 기체는 장애물과 그 그림자를 함께 피해야 한다. 둘 다 시간에 따라 움직이므로 경로와 통과 시점을 따로 정할 수 없다.</w:t>
+        <w:t xml:space="preserve">도심항공교통(UAM) 기체는 지상국과 통신 링크를 유지하며 정해진 회랑을 비행한다(Fig. 1). 다른 비행체가 지상국과 기체 사이에 들어오면 가시선이 가려져 링크가 끊기므로, 기체는 그 비행체와의 충돌뿐 아니라 지상국에서 보아 그 비행체에 가려지는 영역, 곧 그림자도 피해야 한다. 비행체와 그림자는 모두 시간에 따라 움직이므로 경로와 통과 시점을 따로 정할 수 없다.</w:t>
       </w:r>
     </w:p>
     <w:p>
@@ -166,7 +166,7 @@
         <w:pStyle w:val="ab"/>
       </w:pPr>
       <w:r>
-        <w:t xml:space="preserve">자유 공간을 볼록한 셀로 분해하는 접근은 어느 셀을 지날지를 혼합정수 문제의 볼록 완화로 푼다</w:t>
+        <w:t xml:space="preserve">이동 장애물 회피의 기존 접근은 자유 공간을 볼록한 셀로 미리 분해하고, 어느 셀을 지날지를 볼록 완화로 고른다</w:t>
       </w:r>
       <w:r>
         <w:rPr>
@@ -175,7 +175,7 @@
         <w:t xml:space="preserve">(1)</w:t>
       </w:r>
       <w:r>
-        <w:t xml:space="preserve">. 시간을 곡선의 좌표로 두는 리프팅도 분해를 미리 확정하며 등속 장애물만 다룬다</w:t>
+        <w:t xml:space="preserve">. 시간을 곡선의 좌표로 두는 리프팅은 이동 장애물을 정적인 집합으로 바꾸어 같은 분해를 등속 장애물까지 넓힌다</w:t>
       </w:r>
       <w:r>
         <w:rPr>
@@ -184,25 +184,7 @@
         <w:t xml:space="preserve">(2)</w:t>
       </w:r>
       <w:r>
-        <w:t xml:space="preserve">. 분리 평면을 결정 변수로 두면 분해는 피하지만, 장애물을 궤적 구간마다 볼록 껍질로 감싸고 시간 배분을 미리 고정한다</w:t>
-      </w:r>
-      <w:r>
-        <w:rPr>
-          <w:vertAlign w:val="superscript"/>
-        </w:rPr>
-        <w:t xml:space="preserve">(3)</w:t>
-      </w:r>
-      <w:r>
-        <w:t xml:space="preserve">. 시간을 매개변수로 둔 시공간 회랑에서는 볼록 껍질 성질이 성립하려면 별도의 충분조건이 필요하다</w:t>
-      </w:r>
-      <w:r>
-        <w:rPr>
-          <w:vertAlign w:val="superscript"/>
-        </w:rPr>
-        <w:t xml:space="preserve">(4)</w:t>
-      </w:r>
-      <w:r>
-        <w:t xml:space="preserve">.</w:t>
+        <w:t xml:space="preserve">. 두 경우 모두 분해가 최적화 이전에 고정되므로, 장애물의 궤적이 휘거나 그림자처럼 회전하면 미리 만들어 둘 셀의 수가 늘어나고 통과 시각도 그 분해에 매인다.</w:t>
       </w:r>
     </w:p>
     <w:p>
@@ -210,16 +192,58 @@
         <w:pStyle w:val="ab"/>
       </w:pPr>
       <w:r>
-        <w:t xml:space="preserve">본 논문은 분해도 시간 배분도 미리 정하지 않는다. 장애물의 볼록 외부 근사를 고정된 시간 구간이 아니라 같은 리프팅된 공간에서 현재 반복점 둘레의 구 위에 순차 볼록 계획법(sequential convex programming, SCP)</w:t>
-      </w:r>
-      <w:r>
-        <w:rPr>
-          <w:vertAlign w:val="superscript"/>
-        </w:rPr>
-        <w:t xml:space="preserve">(5)</w:t>
-      </w:r>
-      <w:r>
-        <w:t xml:space="preserve"> 반복마다 다시 세우므로, 통과 시각을 미리 정하지 않아도 근사가 정의된다. 첫째, 이동 장애물의 keep-out zone(KOZ)은 휘어진 관이지만 구로 잘라낸 부분의 supporting half-space(지지 반공간)만 세우므로 관이 볼록일 필요가 없다. 둘째, 근접 구간마다 반공간을 하나씩 세워 관이 굽어 감싸는 경우도 다룬다. 셋째, 지상국을 점광원으로 두면 장애물과 그 그림자가 하나의 KOZ가 되어 같은 구성이 가시선 제약을 함께 처리한다.</w:t>
+        <w:t xml:space="preserve">본 논문은 분해도 시간 배분도 미리 정하지 않는다. 장애물의 볼록 외부 근사를 고정된 시간 구간이 아니라 같은 리프팅된 공간에서 현재 반복점 둘레의 구 위에 순차 볼록 계획법(sequential convex programming, SCP) 반복마다 다시 세우므로, 통과 시각을 미리 정하지 않아도 근사가 정의된다. 첫째, 이동 장애물의 keep-out zone(KOZ)은 휘어진 관이지만 구로 잘라낸 부분의 supporting half-space(지지 반공간)만 세우므로 관이 볼록일 필요가 없다. 둘째, 근접 구간마다 반공간을 하나씩 세워 관이 굽어 감싸는 경우도 다룬다. 셋째, 지상국을 점광원으로 두면 장애물과 그 그림자가 하나의 KOZ가 되어 같은 구성이 가시선 제약을 함께 처리한다.</w:t>
+      </w:r>
+    </w:p>
+    <w:p>
+      <w:pPr>
+        <w:pStyle w:val="ad"/>
+        <w:spacing w:before="120" w:after="0" w:line="240" w:lineRule="auto"/>
+        <w:ind w:firstLine="0"/>
+        <w:jc w:val="center"/>
+      </w:pPr>
+      <w:r>
+        <w:drawing>
+          <wp:inline distT="0" distB="0" distL="0" distR="0">
+            <wp:extent cx="2880360" cy="1463040"/>
+            <wp:effectExtent l="0" t="0" r="0" b="0"/>
+            <wp:docPr id="1002" name="Picture 2" descr="concept figure"/>
+            <wp:cNvGraphicFramePr/>
+            <a:graphic>
+              <a:graphicData uri="http://schemas.openxmlformats.org/drawingml/2006/picture">
+                <pic:pic>
+                  <pic:nvPicPr>
+                    <pic:cNvPr id="1002" name="concept_figure.png"/>
+                    <pic:cNvPicPr/>
+                  </pic:nvPicPr>
+                  <pic:blipFill>
+                    <a:blip r:embed="rId101"/>
+                    <a:stretch>
+                      <a:fillRect/>
+                    </a:stretch>
+                  </pic:blipFill>
+                  <pic:spPr>
+                    <a:xfrm>
+                      <a:off x="0" y="0"/>
+                      <a:ext cx="2880360" cy="1463040"/>
+                    </a:xfrm>
+                    <a:prstGeom prst="rect">
+                      <a:avLst/>
+                    </a:prstGeom>
+                  </pic:spPr>
+                </pic:pic>
+              </a:graphicData>
+            </a:graphic>
+          </wp:inline>
+        </w:drawing>
+      </w:r>
+    </w:p>
+    <w:p>
+      <w:pPr>
+        <w:pStyle w:val="ad"/>
+      </w:pPr>
+      <w:r>
+        <w:t xml:space="preserve">Fig. 1 Mission scene (a) and its space-time lift with the clipped KOZ volume and supporting half-space (b); schematic.</w:t>
       </w:r>
     </w:p>
     <w:p>
@@ -246,16 +270,7 @@
         <w:pStyle w:val="ab"/>
       </w:pPr>
       <w:r>
-        <w:t xml:space="preserve">시간을 네 번째 좌표로 더해 공간 3차원을 4차원으로 리프팅하면 등속으로 움직이는 구형 KOZ는 리프팅된 공간에서 기울어진 정적인 관, 곧 중심선 위의 각 점을 중심으로 하는 반지름 rₘ의 구를 합친 집합이 된다. 장애물이 정적이므로 볼록 껍질 성질을 충돌 조건에 바로 쓸 수 있다. 리프팅된 공간의 거리는 1 s를 1 m로 환산한다. 결정 변수는 공간 좌표와 시간 좌표를 함께 가진 제어점이며, De Casteljau 분할로 얻은 분할구간이 제약을 부과하는 단위이다. 분할구간마다 제어점의 평균을 무게중심 c로, c에서 제어점까지의 최대 거리를 반지름 E로 둔다. 시간 좌표에는 </w:t>
-      </w:r>
-      <w:r>
-        <w:rPr>
-          <w:vertAlign w:val="superscript"/>
-        </w:rPr>
-        <w:t xml:space="preserve">(2)</w:t>
-      </w:r>
-      <w:r>
-        <w:t xml:space="preserve">과 같이 단조 증가와 최소 시간 간격을 부과한다.</w:t>
+        <w:t xml:space="preserve">시간을 네 번째 좌표로 더해 공간 3차원을 4차원으로 리프팅하면 등속으로 움직이는 구형 KOZ는 리프팅된 공간에서 기울어진 정적인 관, 곧 중심선 위의 각 점을 중심으로 하는 반지름 rₘ의 구를 합친 집합이 된다. 장애물이 정적이므로 볼록 껍질 성질을 충돌 조건에 바로 쓸 수 있다. 리프팅된 공간의 거리는 1 s를 1 m로 환산한다. 결정 변수는 공간 좌표 xᵢ와 시간 좌표 tᵢ를 함께 가진 n차 곡선의 제어점 Qᵢ = (xᵢ, tᵢ), i = 0, …, n이며, De Casteljau 분할로 얻은 분할구간이 제약을 부과하는 단위이다.</w:t>
       </w:r>
     </w:p>
     <w:p>
@@ -263,7 +278,7 @@
         <w:pStyle w:val="ab"/>
       </w:pPr>
       <w:r>
-        <w:t xml:space="preserve">관이 휘어 비볼록이면 회피 조건을 현재 반복점 주변에서 선형화한다. c를 중심으로 반지름 r의 구를 잡아 KOZ와의 교집합을 클리핑된 KOZ 볼륨으로 정의한다. c에서 KOZ 중심선까지의 거리를 d, 한 번의 반복에서 신뢰영역이 각 제어점의 이동을 허용하는 최대 거리를 δ라 하면 반지름은 다음과 같다.</w:t>
+        <w:t xml:space="preserve">관이 휘어 비볼록이면 회피 조건을 현재 반복점 주변에서 선형화한다. 분할구간의 제어점의 평균을 무게중심 c, c에서 그 제어점까지의 최대 거리를 E라 하자. c를 중심으로 반지름 r의 구를 잡아 KOZ와의 교집합을 클리핑된 KOZ 볼륨으로 정의한다. c에서 KOZ 중심선까지의 거리를 d, 한 번의 반복에서 신뢰영역이 각 제어점의 이동을 허용하는 최대 거리를 δ라 하면 반지름은 다음과 같다.</w:t>
       </w:r>
     </w:p>
     <w:p>
@@ -305,7 +320,7 @@
         <w:pStyle w:val="ab"/>
       </w:pPr>
       <w:r>
-        <w:t xml:space="preserve">근접 구간마다 반공간을 하나씩 세운다. 중심선 위의 점에서 c까지의 거리를 시간의 함수로 보고 그 극대점마다 자른 조각이 근접 구간이다. 한 근접 구간에서 c에 가장 가까운 중심선의 점을 p, 법선을 n = (c − p)/‖c − p‖, 그 근접 구간의 중심선이 만드는 클리핑된 KOZ 볼륨을 L, 분할구간의 제어점을 Qᵢ라 하면</w:t>
+        <w:t xml:space="preserve">근접 구간마다 반공간을 하나씩 세운다. 중심선 위의 점에서 c까지의 거리를 시간의 함수로 보고 그 극대점마다 자른 조각이 근접 구간이다. 한 근접 구간에서 c에 가장 가까운 중심선의 점을 p, 법선을 n = (c − p)/‖c − p‖, 그 근접 구간의 중심선이 만드는 클리핑된 KOZ 볼륨을 L, 분할구간의 제어점을 Qⱼ라 하면</w:t>
       </w:r>
     </w:p>
     <w:p>
@@ -321,7 +336,7 @@
       </w:pPr>
       <w:r>
         <w:tab/>
-        <w:t xml:space="preserve">b = max{n·x : x ∈ L},  n·Qᵢ ≥ b</w:t>
+        <w:t xml:space="preserve">b = max{n·ξ : ξ ∈ L}, n·Qⱼ ≥ b</w:t>
         <w:tab/>
         <w:t>(2)</w:t>
       </w:r>
@@ -331,7 +346,7 @@
         <w:pStyle w:val="ab"/>
       </w:pPr>
       <w:r>
-        <w:t xml:space="preserve">식 (2)에서 b가 L의 지지값이므로 L은 반공간 밖에 남고, 같은 반공간을 모든 제어점에 부과하면 볼록 껍질 성질에 의해 곡선 전체가 반공간 안에 놓인다. 관이 굽어 c를 감싸면 평면 하나로는 부족하지만, 극대점에서 자르면 근접 구간마다 반공간이 하나씩 생겨 그 사이의 틈이 허용 영역으로 남는다.</w:t>
+        <w:t xml:space="preserve">식 (2)에서 b가 L의 지지값이므로 L은 반공간 밖에 남고, 같은 반공간을 모든 제어점에 부과하면 볼록 껍질 성질에 의해 곡선 전체가 반공간 안에 놓인다. 관이 굽어 c를 감싸면 평면 하나로는 부족하지만, 극대점에서 자르면 근접 구간마다 반공간이 하나씩 생겨 그 사이의 틈이 허용 영역이 된다.</w:t>
       </w:r>
     </w:p>
     <w:p>
@@ -339,16 +354,51 @@
         <w:pStyle w:val="ab"/>
       </w:pPr>
       <w:r>
-        <w:t xml:space="preserve">목적함수는 매개변수 영역의 매끄러움 정규화 항과 도착 시각에 대한 선형 페널티 항이고, 속도 제한은 </w:t>
-      </w:r>
-      <w:r>
-        <w:rPr>
-          <w:vertAlign w:val="superscript"/>
-        </w:rPr>
-        <w:t xml:space="preserve">(2)</w:t>
-      </w:r>
-      <w:r>
-        <w:t xml:space="preserve">과 같이 제어 다각형의 변마다 부과하는 기울기 제한이다.</w:t>
+        <w:t xml:space="preserve">최적화 문제는 다음과 같다.</w:t>
+      </w:r>
+    </w:p>
+    <w:p>
+      <w:pPr>
+        <w:pStyle w:val="a5"/>
+        <w:keepLines/>
+        <w:tabs>
+          <w:tab w:val="center" w:pos="2268"/>
+          <w:tab w:val="right" w:pos="4535"/>
+        </w:tabs>
+        <w:ind w:firstLine="0"/>
+        <w:jc w:val="left"/>
+      </w:pPr>
+      <w:r>
+        <w:tab/>
+        <w:t xml:space="preserve">min ½∫₀¹ ‖x″(s)‖² ds + wₜ tₙ</w:t>
+        <w:tab/>
+        <w:t>(3)</w:t>
+      </w:r>
+    </w:p>
+    <w:p>
+      <w:pPr>
+        <w:pStyle w:val="a5"/>
+        <w:keepLines/>
+        <w:tabs>
+          <w:tab w:val="center" w:pos="2268"/>
+          <w:tab w:val="right" w:pos="4535"/>
+        </w:tabs>
+        <w:ind w:firstLine="0"/>
+        <w:jc w:val="left"/>
+      </w:pPr>
+      <w:r>
+        <w:tab/>
+        <w:t xml:space="preserve">tᵢ₊₁ − tᵢ ≥ τ, ‖xᵢ₊₁ − xᵢ‖ ≤ vₘₐₓ (tᵢ₊₁ − tᵢ)</w:t>
+        <w:tab/>
+        <w:t>(4)</w:t>
+      </w:r>
+    </w:p>
+    <w:p>
+      <w:pPr>
+        <w:pStyle w:val="ab"/>
+      </w:pPr>
+      <w:r>
+        <w:t xml:space="preserve">식 (3)의 첫 항은 매개변수 영역의 매끄러움 정규화 항, 둘째 항은 도착 시각 tₙ에 대한 선형 페널티 항이다. 식 (4)는 시간의 단조 증가와 최소 시간 간격 τ, 그리고 제어 다각형의 변마다 부과하는 기울기 제한이며, 여기에 식 (2)의 반공간 제약과 제어점을 회랑 안에 두는 좌표 범위 제약을 함께 부과한다. 각 반복의 하위 문제는 식 (2)에 여유 변수(slack variable)를 두어 페널티 계수 wₛ를 곱해 목적함수에 더한 볼록 문제이며, 신뢰영역 δ 안에서 푼다.</w:t>
       </w:r>
     </w:p>
     <w:p>
@@ -380,17 +430,2358 @@
         <w:pStyle w:val="ab"/>
       </w:pPr>
       <w:r>
-        <w:t xml:space="preserve">제안 기법을 다음 시나리오에서 확인하였다. 지상국은 원점에 있고, 장애물은 지상국 상공 고도 50 m에서 반지름 30 m의 원을 주기 80 s로 선회하는 반지름 6 m의 구이다. 기체는 고도 62.5 m, 길이 200 m의 회랑(좌우 5 m, 고도 60–65 m)을 따라 지상국 옆을 지나며, 회랑은 그 고도에서 그림자 중심이 그리는 원에 접하도록 y = 37.5 m에 둔다. 회랑 바닥이 장애물 꼭대기보다 4 m 높아 장애물 구 부분은 침범될 수 없고, 통과 시점은 그림자 부분, 곧 차폐 제약이 정한다. 4차원 (x, y, z, t) 공간의 8차 Bézier 곡선을 48개 분할구간으로 나누고, 도착 시각은 자유롭게 두어 속도 상한 5 m/s와 도착 시각 페널티(가중치 40)를 함께 부과하였다(신뢰영역 1 m, 여유 변수 페널티 10⁵). 가시선 여유는 지상국–기체 선분에서 장애물 중심까지의 거리에서 장애물 반지름을 뺀 값이다.</w:t>
-      </w:r>
-    </w:p>
+        <w:t xml:space="preserve">서론의 임무 상황을 Fig. 1의 시나리오로 구성하여 제안 기법을 확인하였다. 지상국을 원점에 두고, 그 상공을 선회하는 장애물의 그림자가 회랑을 따라 쓸고 지나가도록 회랑 축을 그림자 중심이 회랑 고도에서 그리는 원에 접하게(지상국에서 37.5 m) 놓았다. 파라미터는 Table 1과 같고 도착 시각은 자유롭게 두었다. 가시선 여유는 지상국–기체 선분에서 장애물 중심까지의 거리에서 장애물 반지름을 뺀 값이다.</w:t>
+      </w:r>
+    </w:p>
+    <w:p>
+      <w:pPr>
+        <w:pStyle w:val="ad"/>
+      </w:pPr>
+      <w:r>
+        <w:t xml:space="preserve">Table 1 Scenario and solver parameters.</w:t>
+      </w:r>
+    </w:p>
+    <w:tbl>
+      <w:tblPr>
+        <w:tblOverlap w:val="never"/>
+        <w:tblW w:w="4477" w:type="dxa"/>
+        <w:tblInd w:w="28" w:type="dxa"/>
+        <w:tblBorders>
+          <w:top w:val="single" w:sz="3" w:space="0" w:color="000000"/>
+          <w:left w:val="single" w:sz="3" w:space="0" w:color="000000"/>
+          <w:bottom w:val="single" w:sz="3" w:space="0" w:color="000000"/>
+          <w:right w:val="single" w:sz="3" w:space="0" w:color="000000"/>
+        </w:tblBorders>
+        <w:tblLayout w:type="fixed"/>
+        <w:tblCellMar>
+          <w:top w:w="28" w:type="dxa"/>
+          <w:left w:w="28" w:type="dxa"/>
+          <w:bottom w:w="28" w:type="dxa"/>
+          <w:right w:w="28" w:type="dxa"/>
+        </w:tblCellMar>
+        <w:tblLook w:val="0000" w:firstRow="0" w:lastRow="0" w:firstColumn="0" w:lastColumn="0" w:noHBand="0" w:noVBand="0"/>
+      </w:tblPr>
+      <w:tblGrid>
+        <w:gridCol w:w="2100"/>
+        <w:gridCol w:w="760"/>
+        <w:gridCol w:w="1617"/>
+      </w:tblGrid>
+      <w:tr>
+        <w:trPr>
+          <w:trHeight w:val="230"/>
+        </w:trPr>
+        <w:tc>
+          <w:tcPr>
+            <w:tcW w:w="2100" w:type="dxa"/>
+            <w:tcBorders>
+              <w:top w:val="single" w:sz="3" w:space="0" w:color="000000"/>
+              <w:left w:val="single" w:sz="3" w:space="0" w:color="000000"/>
+              <w:bottom w:val="single" w:sz="3" w:space="0" w:color="000000"/>
+              <w:right w:val="single" w:sz="3" w:space="0" w:color="000000"/>
+            </w:tcBorders>
+            <w:shd w:val="clear" w:color="auto" w:fill="E5E5E5"/>
+            <w:vAlign w:val="center"/>
+          </w:tcPr>
+          <w:p>
+            <w:pPr>
+              <w:wordWrap/>
+              <w:spacing w:before="0" w:after="0" w:line="240" w:lineRule="auto"/>
+              <w:jc w:val="center"/>
+              <w:rPr>
+                <w:rFonts w:ascii="굴림" w:eastAsia="굴림" w:hAnsi="굴림"/>
+                <w:sz w:val="16"/>
+                <w:szCs w:val="16"/>
+              </w:rPr>
+            </w:pPr>
+            <w:r>
+              <w:rPr>
+                <w:rFonts w:ascii="굴림" w:eastAsia="굴림" w:hAnsi="굴림"/>
+                <w:sz w:val="16"/>
+                <w:szCs w:val="16"/>
+              </w:rPr>
+              <w:t xml:space="preserve">파라미터</w:t>
+            </w:r>
+          </w:p>
+        </w:tc>
+        <w:tc>
+          <w:tcPr>
+            <w:tcW w:w="760" w:type="dxa"/>
+            <w:tcBorders>
+              <w:top w:val="single" w:sz="3" w:space="0" w:color="000000"/>
+              <w:left w:val="single" w:sz="3" w:space="0" w:color="000000"/>
+              <w:bottom w:val="single" w:sz="3" w:space="0" w:color="000000"/>
+              <w:right w:val="single" w:sz="3" w:space="0" w:color="000000"/>
+            </w:tcBorders>
+            <w:shd w:val="clear" w:color="auto" w:fill="E5E5E5"/>
+            <w:vAlign w:val="center"/>
+          </w:tcPr>
+          <w:p>
+            <w:pPr>
+              <w:wordWrap/>
+              <w:spacing w:before="0" w:after="0" w:line="240" w:lineRule="auto"/>
+              <w:jc w:val="center"/>
+              <w:rPr>
+                <w:rFonts w:ascii="굴림" w:eastAsia="굴림" w:hAnsi="굴림"/>
+                <w:sz w:val="16"/>
+                <w:szCs w:val="16"/>
+              </w:rPr>
+            </w:pPr>
+            <w:r>
+              <w:rPr>
+                <w:rFonts w:ascii="굴림" w:eastAsia="굴림" w:hAnsi="굴림"/>
+                <w:sz w:val="16"/>
+                <w:szCs w:val="16"/>
+              </w:rPr>
+              <w:t xml:space="preserve">기호</w:t>
+            </w:r>
+          </w:p>
+        </w:tc>
+        <w:tc>
+          <w:tcPr>
+            <w:tcW w:w="1617" w:type="dxa"/>
+            <w:tcBorders>
+              <w:top w:val="single" w:sz="3" w:space="0" w:color="000000"/>
+              <w:left w:val="single" w:sz="3" w:space="0" w:color="000000"/>
+              <w:bottom w:val="single" w:sz="3" w:space="0" w:color="000000"/>
+              <w:right w:val="single" w:sz="3" w:space="0" w:color="000000"/>
+            </w:tcBorders>
+            <w:shd w:val="clear" w:color="auto" w:fill="E5E5E5"/>
+            <w:vAlign w:val="center"/>
+          </w:tcPr>
+          <w:p>
+            <w:pPr>
+              <w:wordWrap/>
+              <w:spacing w:before="0" w:after="0" w:line="240" w:lineRule="auto"/>
+              <w:jc w:val="center"/>
+              <w:rPr>
+                <w:rFonts w:ascii="굴림" w:eastAsia="굴림" w:hAnsi="굴림"/>
+                <w:sz w:val="16"/>
+                <w:szCs w:val="16"/>
+              </w:rPr>
+            </w:pPr>
+            <w:r>
+              <w:rPr>
+                <w:rFonts w:ascii="굴림" w:eastAsia="굴림" w:hAnsi="굴림"/>
+                <w:sz w:val="16"/>
+                <w:szCs w:val="16"/>
+              </w:rPr>
+              <w:t xml:space="preserve">값</w:t>
+            </w:r>
+          </w:p>
+        </w:tc>
+      </w:tr>
+      <w:tr>
+        <w:trPr>
+          <w:trHeight w:val="230"/>
+        </w:trPr>
+        <w:tc>
+          <w:tcPr>
+            <w:tcW w:w="2100" w:type="dxa"/>
+            <w:tcBorders>
+              <w:top w:val="single" w:sz="3" w:space="0" w:color="000000"/>
+              <w:left w:val="single" w:sz="3" w:space="0" w:color="000000"/>
+              <w:bottom w:val="single" w:sz="3" w:space="0" w:color="000000"/>
+              <w:right w:val="single" w:sz="3" w:space="0" w:color="000000"/>
+            </w:tcBorders>
+            <w:vAlign w:val="center"/>
+          </w:tcPr>
+          <w:p>
+            <w:pPr>
+              <w:wordWrap/>
+              <w:spacing w:before="0" w:after="0" w:line="240" w:lineRule="auto"/>
+              <w:jc w:val="left"/>
+              <w:rPr>
+                <w:rFonts w:ascii="굴림" w:eastAsia="굴림" w:hAnsi="굴림"/>
+                <w:sz w:val="16"/>
+                <w:szCs w:val="16"/>
+              </w:rPr>
+            </w:pPr>
+            <w:r>
+              <w:rPr>
+                <w:rFonts w:ascii="굴림" w:eastAsia="굴림" w:hAnsi="굴림"/>
+                <w:sz w:val="16"/>
+                <w:szCs w:val="16"/>
+              </w:rPr>
+              <w:t xml:space="preserve">장애물 반지름</w:t>
+            </w:r>
+          </w:p>
+        </w:tc>
+        <w:tc>
+          <w:tcPr>
+            <w:tcW w:w="760" w:type="dxa"/>
+            <w:tcBorders>
+              <w:top w:val="single" w:sz="3" w:space="0" w:color="000000"/>
+              <w:left w:val="single" w:sz="3" w:space="0" w:color="000000"/>
+              <w:bottom w:val="single" w:sz="3" w:space="0" w:color="000000"/>
+              <w:right w:val="single" w:sz="3" w:space="0" w:color="000000"/>
+            </w:tcBorders>
+            <w:vAlign w:val="center"/>
+          </w:tcPr>
+          <w:p>
+            <w:pPr>
+              <w:wordWrap/>
+              <w:spacing w:before="0" w:after="0" w:line="240" w:lineRule="auto"/>
+              <w:jc w:val="center"/>
+              <w:rPr>
+                <w:rFonts w:ascii="굴림" w:eastAsia="굴림" w:hAnsi="굴림"/>
+                <w:sz w:val="16"/>
+                <w:szCs w:val="16"/>
+              </w:rPr>
+            </w:pPr>
+            <w:r>
+              <w:rPr>
+                <w:rFonts w:ascii="굴림" w:eastAsia="굴림" w:hAnsi="굴림"/>
+                <w:sz w:val="16"/>
+                <w:szCs w:val="16"/>
+              </w:rPr>
+              <w:t xml:space="preserve">rₘ</w:t>
+            </w:r>
+          </w:p>
+        </w:tc>
+        <w:tc>
+          <w:tcPr>
+            <w:tcW w:w="1617" w:type="dxa"/>
+            <w:tcBorders>
+              <w:top w:val="single" w:sz="3" w:space="0" w:color="000000"/>
+              <w:left w:val="single" w:sz="3" w:space="0" w:color="000000"/>
+              <w:bottom w:val="single" w:sz="3" w:space="0" w:color="000000"/>
+              <w:right w:val="single" w:sz="3" w:space="0" w:color="000000"/>
+            </w:tcBorders>
+            <w:vAlign w:val="center"/>
+          </w:tcPr>
+          <w:p>
+            <w:pPr>
+              <w:wordWrap/>
+              <w:spacing w:before="0" w:after="0" w:line="240" w:lineRule="auto"/>
+              <w:jc w:val="center"/>
+              <w:rPr>
+                <w:rFonts w:ascii="굴림" w:eastAsia="굴림" w:hAnsi="굴림"/>
+                <w:sz w:val="16"/>
+                <w:szCs w:val="16"/>
+              </w:rPr>
+            </w:pPr>
+            <w:r>
+              <w:rPr>
+                <w:rFonts w:ascii="굴림" w:eastAsia="굴림" w:hAnsi="굴림"/>
+                <w:sz w:val="16"/>
+                <w:szCs w:val="16"/>
+              </w:rPr>
+              <w:t xml:space="preserve">6 m</w:t>
+            </w:r>
+          </w:p>
+        </w:tc>
+      </w:tr>
+      <w:tr>
+        <w:trPr>
+          <w:trHeight w:val="230"/>
+        </w:trPr>
+        <w:tc>
+          <w:tcPr>
+            <w:tcW w:w="2100" w:type="dxa"/>
+            <w:tcBorders>
+              <w:top w:val="single" w:sz="3" w:space="0" w:color="000000"/>
+              <w:left w:val="single" w:sz="3" w:space="0" w:color="000000"/>
+              <w:bottom w:val="single" w:sz="3" w:space="0" w:color="000000"/>
+              <w:right w:val="single" w:sz="3" w:space="0" w:color="000000"/>
+            </w:tcBorders>
+            <w:vAlign w:val="center"/>
+          </w:tcPr>
+          <w:p>
+            <w:pPr>
+              <w:wordWrap/>
+              <w:spacing w:before="0" w:after="0" w:line="240" w:lineRule="auto"/>
+              <w:jc w:val="left"/>
+              <w:rPr>
+                <w:rFonts w:ascii="굴림" w:eastAsia="굴림" w:hAnsi="굴림"/>
+                <w:sz w:val="16"/>
+                <w:szCs w:val="16"/>
+              </w:rPr>
+            </w:pPr>
+            <w:r>
+              <w:rPr>
+                <w:rFonts w:ascii="굴림" w:eastAsia="굴림" w:hAnsi="굴림"/>
+                <w:sz w:val="16"/>
+                <w:szCs w:val="16"/>
+              </w:rPr>
+              <w:t xml:space="preserve">장애물 선회 반지름</w:t>
+            </w:r>
+          </w:p>
+        </w:tc>
+        <w:tc>
+          <w:tcPr>
+            <w:tcW w:w="760" w:type="dxa"/>
+            <w:tcBorders>
+              <w:top w:val="single" w:sz="3" w:space="0" w:color="000000"/>
+              <w:left w:val="single" w:sz="3" w:space="0" w:color="000000"/>
+              <w:bottom w:val="single" w:sz="3" w:space="0" w:color="000000"/>
+              <w:right w:val="single" w:sz="3" w:space="0" w:color="000000"/>
+            </w:tcBorders>
+            <w:vAlign w:val="center"/>
+          </w:tcPr>
+          <w:p>
+            <w:pPr>
+              <w:wordWrap/>
+              <w:spacing w:before="0" w:after="0" w:line="240" w:lineRule="auto"/>
+              <w:jc w:val="center"/>
+              <w:rPr>
+                <w:rFonts w:ascii="굴림" w:eastAsia="굴림" w:hAnsi="굴림"/>
+                <w:sz w:val="16"/>
+                <w:szCs w:val="16"/>
+              </w:rPr>
+            </w:pPr>
+          </w:p>
+        </w:tc>
+        <w:tc>
+          <w:tcPr>
+            <w:tcW w:w="1617" w:type="dxa"/>
+            <w:tcBorders>
+              <w:top w:val="single" w:sz="3" w:space="0" w:color="000000"/>
+              <w:left w:val="single" w:sz="3" w:space="0" w:color="000000"/>
+              <w:bottom w:val="single" w:sz="3" w:space="0" w:color="000000"/>
+              <w:right w:val="single" w:sz="3" w:space="0" w:color="000000"/>
+            </w:tcBorders>
+            <w:vAlign w:val="center"/>
+          </w:tcPr>
+          <w:p>
+            <w:pPr>
+              <w:wordWrap/>
+              <w:spacing w:before="0" w:after="0" w:line="240" w:lineRule="auto"/>
+              <w:jc w:val="center"/>
+              <w:rPr>
+                <w:rFonts w:ascii="굴림" w:eastAsia="굴림" w:hAnsi="굴림"/>
+                <w:sz w:val="16"/>
+                <w:szCs w:val="16"/>
+              </w:rPr>
+            </w:pPr>
+            <w:r>
+              <w:rPr>
+                <w:rFonts w:ascii="굴림" w:eastAsia="굴림" w:hAnsi="굴림"/>
+                <w:sz w:val="16"/>
+                <w:szCs w:val="16"/>
+              </w:rPr>
+              <w:t xml:space="preserve">30 m</w:t>
+            </w:r>
+          </w:p>
+        </w:tc>
+      </w:tr>
+      <w:tr>
+        <w:trPr>
+          <w:trHeight w:val="230"/>
+        </w:trPr>
+        <w:tc>
+          <w:tcPr>
+            <w:tcW w:w="2100" w:type="dxa"/>
+            <w:tcBorders>
+              <w:top w:val="single" w:sz="3" w:space="0" w:color="000000"/>
+              <w:left w:val="single" w:sz="3" w:space="0" w:color="000000"/>
+              <w:bottom w:val="single" w:sz="3" w:space="0" w:color="000000"/>
+              <w:right w:val="single" w:sz="3" w:space="0" w:color="000000"/>
+            </w:tcBorders>
+            <w:vAlign w:val="center"/>
+          </w:tcPr>
+          <w:p>
+            <w:pPr>
+              <w:wordWrap/>
+              <w:spacing w:before="0" w:after="0" w:line="240" w:lineRule="auto"/>
+              <w:jc w:val="left"/>
+              <w:rPr>
+                <w:rFonts w:ascii="굴림" w:eastAsia="굴림" w:hAnsi="굴림"/>
+                <w:sz w:val="16"/>
+                <w:szCs w:val="16"/>
+              </w:rPr>
+            </w:pPr>
+            <w:r>
+              <w:rPr>
+                <w:rFonts w:ascii="굴림" w:eastAsia="굴림" w:hAnsi="굴림"/>
+                <w:sz w:val="16"/>
+                <w:szCs w:val="16"/>
+              </w:rPr>
+              <w:t xml:space="preserve">장애물 선회 고도</w:t>
+            </w:r>
+          </w:p>
+        </w:tc>
+        <w:tc>
+          <w:tcPr>
+            <w:tcW w:w="760" w:type="dxa"/>
+            <w:tcBorders>
+              <w:top w:val="single" w:sz="3" w:space="0" w:color="000000"/>
+              <w:left w:val="single" w:sz="3" w:space="0" w:color="000000"/>
+              <w:bottom w:val="single" w:sz="3" w:space="0" w:color="000000"/>
+              <w:right w:val="single" w:sz="3" w:space="0" w:color="000000"/>
+            </w:tcBorders>
+            <w:vAlign w:val="center"/>
+          </w:tcPr>
+          <w:p>
+            <w:pPr>
+              <w:wordWrap/>
+              <w:spacing w:before="0" w:after="0" w:line="240" w:lineRule="auto"/>
+              <w:jc w:val="center"/>
+              <w:rPr>
+                <w:rFonts w:ascii="굴림" w:eastAsia="굴림" w:hAnsi="굴림"/>
+                <w:sz w:val="16"/>
+                <w:szCs w:val="16"/>
+              </w:rPr>
+            </w:pPr>
+          </w:p>
+        </w:tc>
+        <w:tc>
+          <w:tcPr>
+            <w:tcW w:w="1617" w:type="dxa"/>
+            <w:tcBorders>
+              <w:top w:val="single" w:sz="3" w:space="0" w:color="000000"/>
+              <w:left w:val="single" w:sz="3" w:space="0" w:color="000000"/>
+              <w:bottom w:val="single" w:sz="3" w:space="0" w:color="000000"/>
+              <w:right w:val="single" w:sz="3" w:space="0" w:color="000000"/>
+            </w:tcBorders>
+            <w:vAlign w:val="center"/>
+          </w:tcPr>
+          <w:p>
+            <w:pPr>
+              <w:wordWrap/>
+              <w:spacing w:before="0" w:after="0" w:line="240" w:lineRule="auto"/>
+              <w:jc w:val="center"/>
+              <w:rPr>
+                <w:rFonts w:ascii="굴림" w:eastAsia="굴림" w:hAnsi="굴림"/>
+                <w:sz w:val="16"/>
+                <w:szCs w:val="16"/>
+              </w:rPr>
+            </w:pPr>
+            <w:r>
+              <w:rPr>
+                <w:rFonts w:ascii="굴림" w:eastAsia="굴림" w:hAnsi="굴림"/>
+                <w:sz w:val="16"/>
+                <w:szCs w:val="16"/>
+              </w:rPr>
+              <w:t xml:space="preserve">50 m</w:t>
+            </w:r>
+          </w:p>
+        </w:tc>
+      </w:tr>
+      <w:tr>
+        <w:trPr>
+          <w:trHeight w:val="230"/>
+        </w:trPr>
+        <w:tc>
+          <w:tcPr>
+            <w:tcW w:w="2100" w:type="dxa"/>
+            <w:tcBorders>
+              <w:top w:val="single" w:sz="3" w:space="0" w:color="000000"/>
+              <w:left w:val="single" w:sz="3" w:space="0" w:color="000000"/>
+              <w:bottom w:val="single" w:sz="3" w:space="0" w:color="000000"/>
+              <w:right w:val="single" w:sz="3" w:space="0" w:color="000000"/>
+            </w:tcBorders>
+            <w:vAlign w:val="center"/>
+          </w:tcPr>
+          <w:p>
+            <w:pPr>
+              <w:wordWrap/>
+              <w:spacing w:before="0" w:after="0" w:line="240" w:lineRule="auto"/>
+              <w:jc w:val="left"/>
+              <w:rPr>
+                <w:rFonts w:ascii="굴림" w:eastAsia="굴림" w:hAnsi="굴림"/>
+                <w:sz w:val="16"/>
+                <w:szCs w:val="16"/>
+              </w:rPr>
+            </w:pPr>
+            <w:r>
+              <w:rPr>
+                <w:rFonts w:ascii="굴림" w:eastAsia="굴림" w:hAnsi="굴림"/>
+                <w:sz w:val="16"/>
+                <w:szCs w:val="16"/>
+              </w:rPr>
+              <w:t xml:space="preserve">장애물 선회 주기</w:t>
+            </w:r>
+          </w:p>
+        </w:tc>
+        <w:tc>
+          <w:tcPr>
+            <w:tcW w:w="760" w:type="dxa"/>
+            <w:tcBorders>
+              <w:top w:val="single" w:sz="3" w:space="0" w:color="000000"/>
+              <w:left w:val="single" w:sz="3" w:space="0" w:color="000000"/>
+              <w:bottom w:val="single" w:sz="3" w:space="0" w:color="000000"/>
+              <w:right w:val="single" w:sz="3" w:space="0" w:color="000000"/>
+            </w:tcBorders>
+            <w:vAlign w:val="center"/>
+          </w:tcPr>
+          <w:p>
+            <w:pPr>
+              <w:wordWrap/>
+              <w:spacing w:before="0" w:after="0" w:line="240" w:lineRule="auto"/>
+              <w:jc w:val="center"/>
+              <w:rPr>
+                <w:rFonts w:ascii="굴림" w:eastAsia="굴림" w:hAnsi="굴림"/>
+                <w:sz w:val="16"/>
+                <w:szCs w:val="16"/>
+              </w:rPr>
+            </w:pPr>
+          </w:p>
+        </w:tc>
+        <w:tc>
+          <w:tcPr>
+            <w:tcW w:w="1617" w:type="dxa"/>
+            <w:tcBorders>
+              <w:top w:val="single" w:sz="3" w:space="0" w:color="000000"/>
+              <w:left w:val="single" w:sz="3" w:space="0" w:color="000000"/>
+              <w:bottom w:val="single" w:sz="3" w:space="0" w:color="000000"/>
+              <w:right w:val="single" w:sz="3" w:space="0" w:color="000000"/>
+            </w:tcBorders>
+            <w:vAlign w:val="center"/>
+          </w:tcPr>
+          <w:p>
+            <w:pPr>
+              <w:wordWrap/>
+              <w:spacing w:before="0" w:after="0" w:line="240" w:lineRule="auto"/>
+              <w:jc w:val="center"/>
+              <w:rPr>
+                <w:rFonts w:ascii="굴림" w:eastAsia="굴림" w:hAnsi="굴림"/>
+                <w:sz w:val="16"/>
+                <w:szCs w:val="16"/>
+              </w:rPr>
+            </w:pPr>
+            <w:r>
+              <w:rPr>
+                <w:rFonts w:ascii="굴림" w:eastAsia="굴림" w:hAnsi="굴림"/>
+                <w:sz w:val="16"/>
+                <w:szCs w:val="16"/>
+              </w:rPr>
+              <w:t xml:space="preserve">80 s</w:t>
+            </w:r>
+          </w:p>
+        </w:tc>
+      </w:tr>
+      <w:tr>
+        <w:trPr>
+          <w:trHeight w:val="230"/>
+        </w:trPr>
+        <w:tc>
+          <w:tcPr>
+            <w:tcW w:w="2100" w:type="dxa"/>
+            <w:tcBorders>
+              <w:top w:val="single" w:sz="3" w:space="0" w:color="000000"/>
+              <w:left w:val="single" w:sz="3" w:space="0" w:color="000000"/>
+              <w:bottom w:val="single" w:sz="3" w:space="0" w:color="000000"/>
+              <w:right w:val="single" w:sz="3" w:space="0" w:color="000000"/>
+            </w:tcBorders>
+            <w:vAlign w:val="center"/>
+          </w:tcPr>
+          <w:p>
+            <w:pPr>
+              <w:wordWrap/>
+              <w:spacing w:before="0" w:after="0" w:line="240" w:lineRule="auto"/>
+              <w:jc w:val="left"/>
+              <w:rPr>
+                <w:rFonts w:ascii="굴림" w:eastAsia="굴림" w:hAnsi="굴림"/>
+                <w:sz w:val="16"/>
+                <w:szCs w:val="16"/>
+              </w:rPr>
+            </w:pPr>
+            <w:r>
+              <w:rPr>
+                <w:rFonts w:ascii="굴림" w:eastAsia="굴림" w:hAnsi="굴림"/>
+                <w:sz w:val="16"/>
+                <w:szCs w:val="16"/>
+              </w:rPr>
+              <w:t xml:space="preserve">회랑 길이</w:t>
+            </w:r>
+          </w:p>
+        </w:tc>
+        <w:tc>
+          <w:tcPr>
+            <w:tcW w:w="760" w:type="dxa"/>
+            <w:tcBorders>
+              <w:top w:val="single" w:sz="3" w:space="0" w:color="000000"/>
+              <w:left w:val="single" w:sz="3" w:space="0" w:color="000000"/>
+              <w:bottom w:val="single" w:sz="3" w:space="0" w:color="000000"/>
+              <w:right w:val="single" w:sz="3" w:space="0" w:color="000000"/>
+            </w:tcBorders>
+            <w:vAlign w:val="center"/>
+          </w:tcPr>
+          <w:p>
+            <w:pPr>
+              <w:wordWrap/>
+              <w:spacing w:before="0" w:after="0" w:line="240" w:lineRule="auto"/>
+              <w:jc w:val="center"/>
+              <w:rPr>
+                <w:rFonts w:ascii="굴림" w:eastAsia="굴림" w:hAnsi="굴림"/>
+                <w:sz w:val="16"/>
+                <w:szCs w:val="16"/>
+              </w:rPr>
+            </w:pPr>
+          </w:p>
+        </w:tc>
+        <w:tc>
+          <w:tcPr>
+            <w:tcW w:w="1617" w:type="dxa"/>
+            <w:tcBorders>
+              <w:top w:val="single" w:sz="3" w:space="0" w:color="000000"/>
+              <w:left w:val="single" w:sz="3" w:space="0" w:color="000000"/>
+              <w:bottom w:val="single" w:sz="3" w:space="0" w:color="000000"/>
+              <w:right w:val="single" w:sz="3" w:space="0" w:color="000000"/>
+            </w:tcBorders>
+            <w:vAlign w:val="center"/>
+          </w:tcPr>
+          <w:p>
+            <w:pPr>
+              <w:wordWrap/>
+              <w:spacing w:before="0" w:after="0" w:line="240" w:lineRule="auto"/>
+              <w:jc w:val="center"/>
+              <w:rPr>
+                <w:rFonts w:ascii="굴림" w:eastAsia="굴림" w:hAnsi="굴림"/>
+                <w:sz w:val="16"/>
+                <w:szCs w:val="16"/>
+              </w:rPr>
+            </w:pPr>
+            <w:r>
+              <w:rPr>
+                <w:rFonts w:ascii="굴림" w:eastAsia="굴림" w:hAnsi="굴림"/>
+                <w:sz w:val="16"/>
+                <w:szCs w:val="16"/>
+              </w:rPr>
+              <w:t xml:space="preserve">200 m</w:t>
+            </w:r>
+          </w:p>
+        </w:tc>
+      </w:tr>
+      <w:tr>
+        <w:trPr>
+          <w:trHeight w:val="230"/>
+        </w:trPr>
+        <w:tc>
+          <w:tcPr>
+            <w:tcW w:w="2100" w:type="dxa"/>
+            <w:tcBorders>
+              <w:top w:val="single" w:sz="3" w:space="0" w:color="000000"/>
+              <w:left w:val="single" w:sz="3" w:space="0" w:color="000000"/>
+              <w:bottom w:val="single" w:sz="3" w:space="0" w:color="000000"/>
+              <w:right w:val="single" w:sz="3" w:space="0" w:color="000000"/>
+            </w:tcBorders>
+            <w:vAlign w:val="center"/>
+          </w:tcPr>
+          <w:p>
+            <w:pPr>
+              <w:wordWrap/>
+              <w:spacing w:before="0" w:after="0" w:line="240" w:lineRule="auto"/>
+              <w:jc w:val="left"/>
+              <w:rPr>
+                <w:rFonts w:ascii="굴림" w:eastAsia="굴림" w:hAnsi="굴림"/>
+                <w:sz w:val="16"/>
+                <w:szCs w:val="16"/>
+              </w:rPr>
+            </w:pPr>
+            <w:r>
+              <w:rPr>
+                <w:rFonts w:ascii="굴림" w:eastAsia="굴림" w:hAnsi="굴림"/>
+                <w:sz w:val="16"/>
+                <w:szCs w:val="16"/>
+              </w:rPr>
+              <w:t xml:space="preserve">회랑 고도 범위</w:t>
+            </w:r>
+          </w:p>
+        </w:tc>
+        <w:tc>
+          <w:tcPr>
+            <w:tcW w:w="760" w:type="dxa"/>
+            <w:tcBorders>
+              <w:top w:val="single" w:sz="3" w:space="0" w:color="000000"/>
+              <w:left w:val="single" w:sz="3" w:space="0" w:color="000000"/>
+              <w:bottom w:val="single" w:sz="3" w:space="0" w:color="000000"/>
+              <w:right w:val="single" w:sz="3" w:space="0" w:color="000000"/>
+            </w:tcBorders>
+            <w:vAlign w:val="center"/>
+          </w:tcPr>
+          <w:p>
+            <w:pPr>
+              <w:wordWrap/>
+              <w:spacing w:before="0" w:after="0" w:line="240" w:lineRule="auto"/>
+              <w:jc w:val="center"/>
+              <w:rPr>
+                <w:rFonts w:ascii="굴림" w:eastAsia="굴림" w:hAnsi="굴림"/>
+                <w:sz w:val="16"/>
+                <w:szCs w:val="16"/>
+              </w:rPr>
+            </w:pPr>
+          </w:p>
+        </w:tc>
+        <w:tc>
+          <w:tcPr>
+            <w:tcW w:w="1617" w:type="dxa"/>
+            <w:tcBorders>
+              <w:top w:val="single" w:sz="3" w:space="0" w:color="000000"/>
+              <w:left w:val="single" w:sz="3" w:space="0" w:color="000000"/>
+              <w:bottom w:val="single" w:sz="3" w:space="0" w:color="000000"/>
+              <w:right w:val="single" w:sz="3" w:space="0" w:color="000000"/>
+            </w:tcBorders>
+            <w:vAlign w:val="center"/>
+          </w:tcPr>
+          <w:p>
+            <w:pPr>
+              <w:wordWrap/>
+              <w:spacing w:before="0" w:after="0" w:line="240" w:lineRule="auto"/>
+              <w:jc w:val="center"/>
+              <w:rPr>
+                <w:rFonts w:ascii="굴림" w:eastAsia="굴림" w:hAnsi="굴림"/>
+                <w:sz w:val="16"/>
+                <w:szCs w:val="16"/>
+              </w:rPr>
+            </w:pPr>
+            <w:r>
+              <w:rPr>
+                <w:rFonts w:ascii="굴림" w:eastAsia="굴림" w:hAnsi="굴림"/>
+                <w:sz w:val="16"/>
+                <w:szCs w:val="16"/>
+              </w:rPr>
+              <w:t xml:space="preserve">60–65 m</w:t>
+            </w:r>
+          </w:p>
+        </w:tc>
+      </w:tr>
+      <w:tr>
+        <w:trPr>
+          <w:trHeight w:val="230"/>
+        </w:trPr>
+        <w:tc>
+          <w:tcPr>
+            <w:tcW w:w="2100" w:type="dxa"/>
+            <w:tcBorders>
+              <w:top w:val="single" w:sz="3" w:space="0" w:color="000000"/>
+              <w:left w:val="single" w:sz="3" w:space="0" w:color="000000"/>
+              <w:bottom w:val="single" w:sz="3" w:space="0" w:color="000000"/>
+              <w:right w:val="single" w:sz="3" w:space="0" w:color="000000"/>
+            </w:tcBorders>
+            <w:vAlign w:val="center"/>
+          </w:tcPr>
+          <w:p>
+            <w:pPr>
+              <w:wordWrap/>
+              <w:spacing w:before="0" w:after="0" w:line="240" w:lineRule="auto"/>
+              <w:jc w:val="left"/>
+              <w:rPr>
+                <w:rFonts w:ascii="굴림" w:eastAsia="굴림" w:hAnsi="굴림"/>
+                <w:sz w:val="16"/>
+                <w:szCs w:val="16"/>
+              </w:rPr>
+            </w:pPr>
+            <w:r>
+              <w:rPr>
+                <w:rFonts w:ascii="굴림" w:eastAsia="굴림" w:hAnsi="굴림"/>
+                <w:sz w:val="16"/>
+                <w:szCs w:val="16"/>
+              </w:rPr>
+              <w:t xml:space="preserve">회랑 폭</w:t>
+            </w:r>
+          </w:p>
+        </w:tc>
+        <w:tc>
+          <w:tcPr>
+            <w:tcW w:w="760" w:type="dxa"/>
+            <w:tcBorders>
+              <w:top w:val="single" w:sz="3" w:space="0" w:color="000000"/>
+              <w:left w:val="single" w:sz="3" w:space="0" w:color="000000"/>
+              <w:bottom w:val="single" w:sz="3" w:space="0" w:color="000000"/>
+              <w:right w:val="single" w:sz="3" w:space="0" w:color="000000"/>
+            </w:tcBorders>
+            <w:vAlign w:val="center"/>
+          </w:tcPr>
+          <w:p>
+            <w:pPr>
+              <w:wordWrap/>
+              <w:spacing w:before="0" w:after="0" w:line="240" w:lineRule="auto"/>
+              <w:jc w:val="center"/>
+              <w:rPr>
+                <w:rFonts w:ascii="굴림" w:eastAsia="굴림" w:hAnsi="굴림"/>
+                <w:sz w:val="16"/>
+                <w:szCs w:val="16"/>
+              </w:rPr>
+            </w:pPr>
+          </w:p>
+        </w:tc>
+        <w:tc>
+          <w:tcPr>
+            <w:tcW w:w="1617" w:type="dxa"/>
+            <w:tcBorders>
+              <w:top w:val="single" w:sz="3" w:space="0" w:color="000000"/>
+              <w:left w:val="single" w:sz="3" w:space="0" w:color="000000"/>
+              <w:bottom w:val="single" w:sz="3" w:space="0" w:color="000000"/>
+              <w:right w:val="single" w:sz="3" w:space="0" w:color="000000"/>
+            </w:tcBorders>
+            <w:vAlign w:val="center"/>
+          </w:tcPr>
+          <w:p>
+            <w:pPr>
+              <w:wordWrap/>
+              <w:spacing w:before="0" w:after="0" w:line="240" w:lineRule="auto"/>
+              <w:jc w:val="center"/>
+              <w:rPr>
+                <w:rFonts w:ascii="굴림" w:eastAsia="굴림" w:hAnsi="굴림"/>
+                <w:sz w:val="16"/>
+                <w:szCs w:val="16"/>
+              </w:rPr>
+            </w:pPr>
+            <w:r>
+              <w:rPr>
+                <w:rFonts w:ascii="굴림" w:eastAsia="굴림" w:hAnsi="굴림"/>
+                <w:sz w:val="16"/>
+                <w:szCs w:val="16"/>
+              </w:rPr>
+              <w:t xml:space="preserve">±5 m</w:t>
+            </w:r>
+          </w:p>
+        </w:tc>
+      </w:tr>
+      <w:tr>
+        <w:trPr>
+          <w:trHeight w:val="230"/>
+        </w:trPr>
+        <w:tc>
+          <w:tcPr>
+            <w:tcW w:w="2100" w:type="dxa"/>
+            <w:tcBorders>
+              <w:top w:val="single" w:sz="3" w:space="0" w:color="000000"/>
+              <w:left w:val="single" w:sz="3" w:space="0" w:color="000000"/>
+              <w:bottom w:val="single" w:sz="3" w:space="0" w:color="000000"/>
+              <w:right w:val="single" w:sz="3" w:space="0" w:color="000000"/>
+            </w:tcBorders>
+            <w:vAlign w:val="center"/>
+          </w:tcPr>
+          <w:p>
+            <w:pPr>
+              <w:wordWrap/>
+              <w:spacing w:before="0" w:after="0" w:line="240" w:lineRule="auto"/>
+              <w:jc w:val="left"/>
+              <w:rPr>
+                <w:rFonts w:ascii="굴림" w:eastAsia="굴림" w:hAnsi="굴림"/>
+                <w:sz w:val="16"/>
+                <w:szCs w:val="16"/>
+              </w:rPr>
+            </w:pPr>
+            <w:r>
+              <w:rPr>
+                <w:rFonts w:ascii="굴림" w:eastAsia="굴림" w:hAnsi="굴림"/>
+                <w:sz w:val="16"/>
+                <w:szCs w:val="16"/>
+              </w:rPr>
+              <w:t xml:space="preserve">곡선 차수</w:t>
+            </w:r>
+          </w:p>
+        </w:tc>
+        <w:tc>
+          <w:tcPr>
+            <w:tcW w:w="760" w:type="dxa"/>
+            <w:tcBorders>
+              <w:top w:val="single" w:sz="3" w:space="0" w:color="000000"/>
+              <w:left w:val="single" w:sz="3" w:space="0" w:color="000000"/>
+              <w:bottom w:val="single" w:sz="3" w:space="0" w:color="000000"/>
+              <w:right w:val="single" w:sz="3" w:space="0" w:color="000000"/>
+            </w:tcBorders>
+            <w:vAlign w:val="center"/>
+          </w:tcPr>
+          <w:p>
+            <w:pPr>
+              <w:wordWrap/>
+              <w:spacing w:before="0" w:after="0" w:line="240" w:lineRule="auto"/>
+              <w:jc w:val="center"/>
+              <w:rPr>
+                <w:rFonts w:ascii="굴림" w:eastAsia="굴림" w:hAnsi="굴림"/>
+                <w:sz w:val="16"/>
+                <w:szCs w:val="16"/>
+              </w:rPr>
+            </w:pPr>
+            <w:r>
+              <w:rPr>
+                <w:rFonts w:ascii="굴림" w:eastAsia="굴림" w:hAnsi="굴림"/>
+                <w:sz w:val="16"/>
+                <w:szCs w:val="16"/>
+              </w:rPr>
+              <w:t xml:space="preserve">n</w:t>
+            </w:r>
+          </w:p>
+        </w:tc>
+        <w:tc>
+          <w:tcPr>
+            <w:tcW w:w="1617" w:type="dxa"/>
+            <w:tcBorders>
+              <w:top w:val="single" w:sz="3" w:space="0" w:color="000000"/>
+              <w:left w:val="single" w:sz="3" w:space="0" w:color="000000"/>
+              <w:bottom w:val="single" w:sz="3" w:space="0" w:color="000000"/>
+              <w:right w:val="single" w:sz="3" w:space="0" w:color="000000"/>
+            </w:tcBorders>
+            <w:vAlign w:val="center"/>
+          </w:tcPr>
+          <w:p>
+            <w:pPr>
+              <w:wordWrap/>
+              <w:spacing w:before="0" w:after="0" w:line="240" w:lineRule="auto"/>
+              <w:jc w:val="center"/>
+              <w:rPr>
+                <w:rFonts w:ascii="굴림" w:eastAsia="굴림" w:hAnsi="굴림"/>
+                <w:sz w:val="16"/>
+                <w:szCs w:val="16"/>
+              </w:rPr>
+            </w:pPr>
+            <w:r>
+              <w:rPr>
+                <w:rFonts w:ascii="굴림" w:eastAsia="굴림" w:hAnsi="굴림"/>
+                <w:sz w:val="16"/>
+                <w:szCs w:val="16"/>
+              </w:rPr>
+              <w:t xml:space="preserve">8</w:t>
+            </w:r>
+          </w:p>
+        </w:tc>
+      </w:tr>
+      <w:tr>
+        <w:trPr>
+          <w:trHeight w:val="230"/>
+        </w:trPr>
+        <w:tc>
+          <w:tcPr>
+            <w:tcW w:w="2100" w:type="dxa"/>
+            <w:tcBorders>
+              <w:top w:val="single" w:sz="3" w:space="0" w:color="000000"/>
+              <w:left w:val="single" w:sz="3" w:space="0" w:color="000000"/>
+              <w:bottom w:val="single" w:sz="3" w:space="0" w:color="000000"/>
+              <w:right w:val="single" w:sz="3" w:space="0" w:color="000000"/>
+            </w:tcBorders>
+            <w:vAlign w:val="center"/>
+          </w:tcPr>
+          <w:p>
+            <w:pPr>
+              <w:wordWrap/>
+              <w:spacing w:before="0" w:after="0" w:line="240" w:lineRule="auto"/>
+              <w:jc w:val="left"/>
+              <w:rPr>
+                <w:rFonts w:ascii="굴림" w:eastAsia="굴림" w:hAnsi="굴림"/>
+                <w:sz w:val="16"/>
+                <w:szCs w:val="16"/>
+              </w:rPr>
+            </w:pPr>
+            <w:r>
+              <w:rPr>
+                <w:rFonts w:ascii="굴림" w:eastAsia="굴림" w:hAnsi="굴림"/>
+                <w:sz w:val="16"/>
+                <w:szCs w:val="16"/>
+              </w:rPr>
+              <w:t xml:space="preserve">분할구간 수</w:t>
+            </w:r>
+          </w:p>
+        </w:tc>
+        <w:tc>
+          <w:tcPr>
+            <w:tcW w:w="760" w:type="dxa"/>
+            <w:tcBorders>
+              <w:top w:val="single" w:sz="3" w:space="0" w:color="000000"/>
+              <w:left w:val="single" w:sz="3" w:space="0" w:color="000000"/>
+              <w:bottom w:val="single" w:sz="3" w:space="0" w:color="000000"/>
+              <w:right w:val="single" w:sz="3" w:space="0" w:color="000000"/>
+            </w:tcBorders>
+            <w:vAlign w:val="center"/>
+          </w:tcPr>
+          <w:p>
+            <w:pPr>
+              <w:wordWrap/>
+              <w:spacing w:before="0" w:after="0" w:line="240" w:lineRule="auto"/>
+              <w:jc w:val="center"/>
+              <w:rPr>
+                <w:rFonts w:ascii="굴림" w:eastAsia="굴림" w:hAnsi="굴림"/>
+                <w:sz w:val="16"/>
+                <w:szCs w:val="16"/>
+              </w:rPr>
+            </w:pPr>
+          </w:p>
+        </w:tc>
+        <w:tc>
+          <w:tcPr>
+            <w:tcW w:w="1617" w:type="dxa"/>
+            <w:tcBorders>
+              <w:top w:val="single" w:sz="3" w:space="0" w:color="000000"/>
+              <w:left w:val="single" w:sz="3" w:space="0" w:color="000000"/>
+              <w:bottom w:val="single" w:sz="3" w:space="0" w:color="000000"/>
+              <w:right w:val="single" w:sz="3" w:space="0" w:color="000000"/>
+            </w:tcBorders>
+            <w:vAlign w:val="center"/>
+          </w:tcPr>
+          <w:p>
+            <w:pPr>
+              <w:wordWrap/>
+              <w:spacing w:before="0" w:after="0" w:line="240" w:lineRule="auto"/>
+              <w:jc w:val="center"/>
+              <w:rPr>
+                <w:rFonts w:ascii="굴림" w:eastAsia="굴림" w:hAnsi="굴림"/>
+                <w:sz w:val="16"/>
+                <w:szCs w:val="16"/>
+              </w:rPr>
+            </w:pPr>
+            <w:r>
+              <w:rPr>
+                <w:rFonts w:ascii="굴림" w:eastAsia="굴림" w:hAnsi="굴림"/>
+                <w:sz w:val="16"/>
+                <w:szCs w:val="16"/>
+              </w:rPr>
+              <w:t xml:space="preserve">48</w:t>
+            </w:r>
+          </w:p>
+        </w:tc>
+      </w:tr>
+      <w:tr>
+        <w:trPr>
+          <w:trHeight w:val="230"/>
+        </w:trPr>
+        <w:tc>
+          <w:tcPr>
+            <w:tcW w:w="2100" w:type="dxa"/>
+            <w:tcBorders>
+              <w:top w:val="single" w:sz="3" w:space="0" w:color="000000"/>
+              <w:left w:val="single" w:sz="3" w:space="0" w:color="000000"/>
+              <w:bottom w:val="single" w:sz="3" w:space="0" w:color="000000"/>
+              <w:right w:val="single" w:sz="3" w:space="0" w:color="000000"/>
+            </w:tcBorders>
+            <w:vAlign w:val="center"/>
+          </w:tcPr>
+          <w:p>
+            <w:pPr>
+              <w:wordWrap/>
+              <w:spacing w:before="0" w:after="0" w:line="240" w:lineRule="auto"/>
+              <w:jc w:val="left"/>
+              <w:rPr>
+                <w:rFonts w:ascii="굴림" w:eastAsia="굴림" w:hAnsi="굴림"/>
+                <w:sz w:val="16"/>
+                <w:szCs w:val="16"/>
+              </w:rPr>
+            </w:pPr>
+            <w:r>
+              <w:rPr>
+                <w:rFonts w:ascii="굴림" w:eastAsia="굴림" w:hAnsi="굴림"/>
+                <w:sz w:val="16"/>
+                <w:szCs w:val="16"/>
+              </w:rPr>
+              <w:t xml:space="preserve">속도 상한</w:t>
+            </w:r>
+          </w:p>
+        </w:tc>
+        <w:tc>
+          <w:tcPr>
+            <w:tcW w:w="760" w:type="dxa"/>
+            <w:tcBorders>
+              <w:top w:val="single" w:sz="3" w:space="0" w:color="000000"/>
+              <w:left w:val="single" w:sz="3" w:space="0" w:color="000000"/>
+              <w:bottom w:val="single" w:sz="3" w:space="0" w:color="000000"/>
+              <w:right w:val="single" w:sz="3" w:space="0" w:color="000000"/>
+            </w:tcBorders>
+            <w:vAlign w:val="center"/>
+          </w:tcPr>
+          <w:p>
+            <w:pPr>
+              <w:wordWrap/>
+              <w:spacing w:before="0" w:after="0" w:line="240" w:lineRule="auto"/>
+              <w:jc w:val="center"/>
+              <w:rPr>
+                <w:rFonts w:ascii="굴림" w:eastAsia="굴림" w:hAnsi="굴림"/>
+                <w:sz w:val="16"/>
+                <w:szCs w:val="16"/>
+              </w:rPr>
+            </w:pPr>
+            <w:r>
+              <w:rPr>
+                <w:rFonts w:ascii="굴림" w:eastAsia="굴림" w:hAnsi="굴림"/>
+                <w:sz w:val="16"/>
+                <w:szCs w:val="16"/>
+              </w:rPr>
+              <w:t xml:space="preserve">vₘₐₓ</w:t>
+            </w:r>
+          </w:p>
+        </w:tc>
+        <w:tc>
+          <w:tcPr>
+            <w:tcW w:w="1617" w:type="dxa"/>
+            <w:tcBorders>
+              <w:top w:val="single" w:sz="3" w:space="0" w:color="000000"/>
+              <w:left w:val="single" w:sz="3" w:space="0" w:color="000000"/>
+              <w:bottom w:val="single" w:sz="3" w:space="0" w:color="000000"/>
+              <w:right w:val="single" w:sz="3" w:space="0" w:color="000000"/>
+            </w:tcBorders>
+            <w:vAlign w:val="center"/>
+          </w:tcPr>
+          <w:p>
+            <w:pPr>
+              <w:wordWrap/>
+              <w:spacing w:before="0" w:after="0" w:line="240" w:lineRule="auto"/>
+              <w:jc w:val="center"/>
+              <w:rPr>
+                <w:rFonts w:ascii="굴림" w:eastAsia="굴림" w:hAnsi="굴림"/>
+                <w:sz w:val="16"/>
+                <w:szCs w:val="16"/>
+              </w:rPr>
+            </w:pPr>
+            <w:r>
+              <w:rPr>
+                <w:rFonts w:ascii="굴림" w:eastAsia="굴림" w:hAnsi="굴림"/>
+                <w:sz w:val="16"/>
+                <w:szCs w:val="16"/>
+              </w:rPr>
+              <w:t xml:space="preserve">5 m/s</w:t>
+            </w:r>
+          </w:p>
+        </w:tc>
+      </w:tr>
+      <w:tr>
+        <w:trPr>
+          <w:trHeight w:val="230"/>
+        </w:trPr>
+        <w:tc>
+          <w:tcPr>
+            <w:tcW w:w="2100" w:type="dxa"/>
+            <w:tcBorders>
+              <w:top w:val="single" w:sz="3" w:space="0" w:color="000000"/>
+              <w:left w:val="single" w:sz="3" w:space="0" w:color="000000"/>
+              <w:bottom w:val="single" w:sz="3" w:space="0" w:color="000000"/>
+              <w:right w:val="single" w:sz="3" w:space="0" w:color="000000"/>
+            </w:tcBorders>
+            <w:vAlign w:val="center"/>
+          </w:tcPr>
+          <w:p>
+            <w:pPr>
+              <w:wordWrap/>
+              <w:spacing w:before="0" w:after="0" w:line="240" w:lineRule="auto"/>
+              <w:jc w:val="left"/>
+              <w:rPr>
+                <w:rFonts w:ascii="굴림" w:eastAsia="굴림" w:hAnsi="굴림"/>
+                <w:sz w:val="16"/>
+                <w:szCs w:val="16"/>
+              </w:rPr>
+            </w:pPr>
+            <w:r>
+              <w:rPr>
+                <w:rFonts w:ascii="굴림" w:eastAsia="굴림" w:hAnsi="굴림"/>
+                <w:sz w:val="16"/>
+                <w:szCs w:val="16"/>
+              </w:rPr>
+              <w:t xml:space="preserve">최소 시간 간격</w:t>
+            </w:r>
+          </w:p>
+        </w:tc>
+        <w:tc>
+          <w:tcPr>
+            <w:tcW w:w="760" w:type="dxa"/>
+            <w:tcBorders>
+              <w:top w:val="single" w:sz="3" w:space="0" w:color="000000"/>
+              <w:left w:val="single" w:sz="3" w:space="0" w:color="000000"/>
+              <w:bottom w:val="single" w:sz="3" w:space="0" w:color="000000"/>
+              <w:right w:val="single" w:sz="3" w:space="0" w:color="000000"/>
+            </w:tcBorders>
+            <w:vAlign w:val="center"/>
+          </w:tcPr>
+          <w:p>
+            <w:pPr>
+              <w:wordWrap/>
+              <w:spacing w:before="0" w:after="0" w:line="240" w:lineRule="auto"/>
+              <w:jc w:val="center"/>
+              <w:rPr>
+                <w:rFonts w:ascii="굴림" w:eastAsia="굴림" w:hAnsi="굴림"/>
+                <w:sz w:val="16"/>
+                <w:szCs w:val="16"/>
+              </w:rPr>
+            </w:pPr>
+            <w:r>
+              <w:rPr>
+                <w:rFonts w:ascii="굴림" w:eastAsia="굴림" w:hAnsi="굴림"/>
+                <w:sz w:val="16"/>
+                <w:szCs w:val="16"/>
+              </w:rPr>
+              <w:t xml:space="preserve">τ</w:t>
+            </w:r>
+          </w:p>
+        </w:tc>
+        <w:tc>
+          <w:tcPr>
+            <w:tcW w:w="1617" w:type="dxa"/>
+            <w:tcBorders>
+              <w:top w:val="single" w:sz="3" w:space="0" w:color="000000"/>
+              <w:left w:val="single" w:sz="3" w:space="0" w:color="000000"/>
+              <w:bottom w:val="single" w:sz="3" w:space="0" w:color="000000"/>
+              <w:right w:val="single" w:sz="3" w:space="0" w:color="000000"/>
+            </w:tcBorders>
+            <w:vAlign w:val="center"/>
+          </w:tcPr>
+          <w:p>
+            <w:pPr>
+              <w:wordWrap/>
+              <w:spacing w:before="0" w:after="0" w:line="240" w:lineRule="auto"/>
+              <w:jc w:val="center"/>
+              <w:rPr>
+                <w:rFonts w:ascii="굴림" w:eastAsia="굴림" w:hAnsi="굴림"/>
+                <w:sz w:val="16"/>
+                <w:szCs w:val="16"/>
+              </w:rPr>
+            </w:pPr>
+            <w:r>
+              <w:rPr>
+                <w:rFonts w:ascii="굴림" w:eastAsia="굴림" w:hAnsi="굴림"/>
+                <w:sz w:val="16"/>
+                <w:szCs w:val="16"/>
+              </w:rPr>
+              <w:t xml:space="preserve">0.1 s</w:t>
+            </w:r>
+          </w:p>
+        </w:tc>
+      </w:tr>
+      <w:tr>
+        <w:trPr>
+          <w:trHeight w:val="230"/>
+        </w:trPr>
+        <w:tc>
+          <w:tcPr>
+            <w:tcW w:w="2100" w:type="dxa"/>
+            <w:tcBorders>
+              <w:top w:val="single" w:sz="3" w:space="0" w:color="000000"/>
+              <w:left w:val="single" w:sz="3" w:space="0" w:color="000000"/>
+              <w:bottom w:val="single" w:sz="3" w:space="0" w:color="000000"/>
+              <w:right w:val="single" w:sz="3" w:space="0" w:color="000000"/>
+            </w:tcBorders>
+            <w:vAlign w:val="center"/>
+          </w:tcPr>
+          <w:p>
+            <w:pPr>
+              <w:wordWrap/>
+              <w:spacing w:before="0" w:after="0" w:line="240" w:lineRule="auto"/>
+              <w:jc w:val="left"/>
+              <w:rPr>
+                <w:rFonts w:ascii="굴림" w:eastAsia="굴림" w:hAnsi="굴림"/>
+                <w:sz w:val="16"/>
+                <w:szCs w:val="16"/>
+              </w:rPr>
+            </w:pPr>
+            <w:r>
+              <w:rPr>
+                <w:rFonts w:ascii="굴림" w:eastAsia="굴림" w:hAnsi="굴림"/>
+                <w:sz w:val="16"/>
+                <w:szCs w:val="16"/>
+              </w:rPr>
+              <w:t xml:space="preserve">도착 시각 페널티 계수</w:t>
+            </w:r>
+          </w:p>
+        </w:tc>
+        <w:tc>
+          <w:tcPr>
+            <w:tcW w:w="760" w:type="dxa"/>
+            <w:tcBorders>
+              <w:top w:val="single" w:sz="3" w:space="0" w:color="000000"/>
+              <w:left w:val="single" w:sz="3" w:space="0" w:color="000000"/>
+              <w:bottom w:val="single" w:sz="3" w:space="0" w:color="000000"/>
+              <w:right w:val="single" w:sz="3" w:space="0" w:color="000000"/>
+            </w:tcBorders>
+            <w:vAlign w:val="center"/>
+          </w:tcPr>
+          <w:p>
+            <w:pPr>
+              <w:wordWrap/>
+              <w:spacing w:before="0" w:after="0" w:line="240" w:lineRule="auto"/>
+              <w:jc w:val="center"/>
+              <w:rPr>
+                <w:rFonts w:ascii="굴림" w:eastAsia="굴림" w:hAnsi="굴림"/>
+                <w:sz w:val="16"/>
+                <w:szCs w:val="16"/>
+              </w:rPr>
+            </w:pPr>
+            <w:r>
+              <w:rPr>
+                <w:rFonts w:ascii="굴림" w:eastAsia="굴림" w:hAnsi="굴림"/>
+                <w:sz w:val="16"/>
+                <w:szCs w:val="16"/>
+              </w:rPr>
+              <w:t xml:space="preserve">wₜ</w:t>
+            </w:r>
+          </w:p>
+        </w:tc>
+        <w:tc>
+          <w:tcPr>
+            <w:tcW w:w="1617" w:type="dxa"/>
+            <w:tcBorders>
+              <w:top w:val="single" w:sz="3" w:space="0" w:color="000000"/>
+              <w:left w:val="single" w:sz="3" w:space="0" w:color="000000"/>
+              <w:bottom w:val="single" w:sz="3" w:space="0" w:color="000000"/>
+              <w:right w:val="single" w:sz="3" w:space="0" w:color="000000"/>
+            </w:tcBorders>
+            <w:vAlign w:val="center"/>
+          </w:tcPr>
+          <w:p>
+            <w:pPr>
+              <w:wordWrap/>
+              <w:spacing w:before="0" w:after="0" w:line="240" w:lineRule="auto"/>
+              <w:jc w:val="center"/>
+              <w:rPr>
+                <w:rFonts w:ascii="굴림" w:eastAsia="굴림" w:hAnsi="굴림"/>
+                <w:sz w:val="16"/>
+                <w:szCs w:val="16"/>
+              </w:rPr>
+            </w:pPr>
+            <w:r>
+              <w:rPr>
+                <w:rFonts w:ascii="굴림" w:eastAsia="굴림" w:hAnsi="굴림"/>
+                <w:sz w:val="16"/>
+                <w:szCs w:val="16"/>
+              </w:rPr>
+              <w:t xml:space="preserve">40</w:t>
+            </w:r>
+          </w:p>
+        </w:tc>
+      </w:tr>
+      <w:tr>
+        <w:trPr>
+          <w:trHeight w:val="230"/>
+        </w:trPr>
+        <w:tc>
+          <w:tcPr>
+            <w:tcW w:w="2100" w:type="dxa"/>
+            <w:tcBorders>
+              <w:top w:val="single" w:sz="3" w:space="0" w:color="000000"/>
+              <w:left w:val="single" w:sz="3" w:space="0" w:color="000000"/>
+              <w:bottom w:val="single" w:sz="3" w:space="0" w:color="000000"/>
+              <w:right w:val="single" w:sz="3" w:space="0" w:color="000000"/>
+            </w:tcBorders>
+            <w:vAlign w:val="center"/>
+          </w:tcPr>
+          <w:p>
+            <w:pPr>
+              <w:wordWrap/>
+              <w:spacing w:before="0" w:after="0" w:line="240" w:lineRule="auto"/>
+              <w:jc w:val="left"/>
+              <w:rPr>
+                <w:rFonts w:ascii="굴림" w:eastAsia="굴림" w:hAnsi="굴림"/>
+                <w:sz w:val="16"/>
+                <w:szCs w:val="16"/>
+              </w:rPr>
+            </w:pPr>
+            <w:r>
+              <w:rPr>
+                <w:rFonts w:ascii="굴림" w:eastAsia="굴림" w:hAnsi="굴림"/>
+                <w:sz w:val="16"/>
+                <w:szCs w:val="16"/>
+              </w:rPr>
+              <w:t xml:space="preserve">여유 변수 페널티 계수</w:t>
+            </w:r>
+          </w:p>
+        </w:tc>
+        <w:tc>
+          <w:tcPr>
+            <w:tcW w:w="760" w:type="dxa"/>
+            <w:tcBorders>
+              <w:top w:val="single" w:sz="3" w:space="0" w:color="000000"/>
+              <w:left w:val="single" w:sz="3" w:space="0" w:color="000000"/>
+              <w:bottom w:val="single" w:sz="3" w:space="0" w:color="000000"/>
+              <w:right w:val="single" w:sz="3" w:space="0" w:color="000000"/>
+            </w:tcBorders>
+            <w:vAlign w:val="center"/>
+          </w:tcPr>
+          <w:p>
+            <w:pPr>
+              <w:wordWrap/>
+              <w:spacing w:before="0" w:after="0" w:line="240" w:lineRule="auto"/>
+              <w:jc w:val="center"/>
+              <w:rPr>
+                <w:rFonts w:ascii="굴림" w:eastAsia="굴림" w:hAnsi="굴림"/>
+                <w:sz w:val="16"/>
+                <w:szCs w:val="16"/>
+              </w:rPr>
+            </w:pPr>
+            <w:r>
+              <w:rPr>
+                <w:rFonts w:ascii="굴림" w:eastAsia="굴림" w:hAnsi="굴림"/>
+                <w:sz w:val="16"/>
+                <w:szCs w:val="16"/>
+              </w:rPr>
+              <w:t xml:space="preserve">wₛ</w:t>
+            </w:r>
+          </w:p>
+        </w:tc>
+        <w:tc>
+          <w:tcPr>
+            <w:tcW w:w="1617" w:type="dxa"/>
+            <w:tcBorders>
+              <w:top w:val="single" w:sz="3" w:space="0" w:color="000000"/>
+              <w:left w:val="single" w:sz="3" w:space="0" w:color="000000"/>
+              <w:bottom w:val="single" w:sz="3" w:space="0" w:color="000000"/>
+              <w:right w:val="single" w:sz="3" w:space="0" w:color="000000"/>
+            </w:tcBorders>
+            <w:vAlign w:val="center"/>
+          </w:tcPr>
+          <w:p>
+            <w:pPr>
+              <w:wordWrap/>
+              <w:spacing w:before="0" w:after="0" w:line="240" w:lineRule="auto"/>
+              <w:jc w:val="center"/>
+              <w:rPr>
+                <w:rFonts w:ascii="굴림" w:eastAsia="굴림" w:hAnsi="굴림"/>
+                <w:sz w:val="16"/>
+                <w:szCs w:val="16"/>
+              </w:rPr>
+            </w:pPr>
+            <w:r>
+              <w:rPr>
+                <w:rFonts w:ascii="굴림" w:eastAsia="굴림" w:hAnsi="굴림"/>
+                <w:sz w:val="16"/>
+                <w:szCs w:val="16"/>
+              </w:rPr>
+              <w:t xml:space="preserve">10⁵</w:t>
+            </w:r>
+          </w:p>
+        </w:tc>
+      </w:tr>
+      <w:tr>
+        <w:trPr>
+          <w:trHeight w:val="230"/>
+        </w:trPr>
+        <w:tc>
+          <w:tcPr>
+            <w:tcW w:w="2100" w:type="dxa"/>
+            <w:tcBorders>
+              <w:top w:val="single" w:sz="3" w:space="0" w:color="000000"/>
+              <w:left w:val="single" w:sz="3" w:space="0" w:color="000000"/>
+              <w:bottom w:val="single" w:sz="3" w:space="0" w:color="000000"/>
+              <w:right w:val="single" w:sz="3" w:space="0" w:color="000000"/>
+            </w:tcBorders>
+            <w:vAlign w:val="center"/>
+          </w:tcPr>
+          <w:p>
+            <w:pPr>
+              <w:wordWrap/>
+              <w:spacing w:before="0" w:after="0" w:line="240" w:lineRule="auto"/>
+              <w:jc w:val="left"/>
+              <w:rPr>
+                <w:rFonts w:ascii="굴림" w:eastAsia="굴림" w:hAnsi="굴림"/>
+                <w:sz w:val="16"/>
+                <w:szCs w:val="16"/>
+              </w:rPr>
+            </w:pPr>
+            <w:r>
+              <w:rPr>
+                <w:rFonts w:ascii="굴림" w:eastAsia="굴림" w:hAnsi="굴림"/>
+                <w:sz w:val="16"/>
+                <w:szCs w:val="16"/>
+              </w:rPr>
+              <w:t xml:space="preserve">신뢰영역 크기</w:t>
+            </w:r>
+          </w:p>
+        </w:tc>
+        <w:tc>
+          <w:tcPr>
+            <w:tcW w:w="760" w:type="dxa"/>
+            <w:tcBorders>
+              <w:top w:val="single" w:sz="3" w:space="0" w:color="000000"/>
+              <w:left w:val="single" w:sz="3" w:space="0" w:color="000000"/>
+              <w:bottom w:val="single" w:sz="3" w:space="0" w:color="000000"/>
+              <w:right w:val="single" w:sz="3" w:space="0" w:color="000000"/>
+            </w:tcBorders>
+            <w:vAlign w:val="center"/>
+          </w:tcPr>
+          <w:p>
+            <w:pPr>
+              <w:wordWrap/>
+              <w:spacing w:before="0" w:after="0" w:line="240" w:lineRule="auto"/>
+              <w:jc w:val="center"/>
+              <w:rPr>
+                <w:rFonts w:ascii="굴림" w:eastAsia="굴림" w:hAnsi="굴림"/>
+                <w:sz w:val="16"/>
+                <w:szCs w:val="16"/>
+              </w:rPr>
+            </w:pPr>
+            <w:r>
+              <w:rPr>
+                <w:rFonts w:ascii="굴림" w:eastAsia="굴림" w:hAnsi="굴림"/>
+                <w:sz w:val="16"/>
+                <w:szCs w:val="16"/>
+              </w:rPr>
+              <w:t xml:space="preserve">δ</w:t>
+            </w:r>
+          </w:p>
+        </w:tc>
+        <w:tc>
+          <w:tcPr>
+            <w:tcW w:w="1617" w:type="dxa"/>
+            <w:tcBorders>
+              <w:top w:val="single" w:sz="3" w:space="0" w:color="000000"/>
+              <w:left w:val="single" w:sz="3" w:space="0" w:color="000000"/>
+              <w:bottom w:val="single" w:sz="3" w:space="0" w:color="000000"/>
+              <w:right w:val="single" w:sz="3" w:space="0" w:color="000000"/>
+            </w:tcBorders>
+            <w:vAlign w:val="center"/>
+          </w:tcPr>
+          <w:p>
+            <w:pPr>
+              <w:wordWrap/>
+              <w:spacing w:before="0" w:after="0" w:line="240" w:lineRule="auto"/>
+              <w:jc w:val="center"/>
+              <w:rPr>
+                <w:rFonts w:ascii="굴림" w:eastAsia="굴림" w:hAnsi="굴림"/>
+                <w:sz w:val="16"/>
+                <w:szCs w:val="16"/>
+              </w:rPr>
+            </w:pPr>
+            <w:r>
+              <w:rPr>
+                <w:rFonts w:ascii="굴림" w:eastAsia="굴림" w:hAnsi="굴림"/>
+                <w:sz w:val="16"/>
+                <w:szCs w:val="16"/>
+              </w:rPr>
+              <w:t xml:space="preserve">1 m</w:t>
+            </w:r>
+          </w:p>
+        </w:tc>
+      </w:tr>
+    </w:tbl>
     <w:p>
       <w:pPr>
         <w:pStyle w:val="ab"/>
       </w:pPr>
       <w:r>
-        <w:t xml:space="preserve">차폐 제약이 없는 기준 실행에서 기체는 속도 상한으로 곧장 통과하여 40.0 s에 도착하고, 그림자에 든 14.96–16.52 s에 가시선을 잃는다(최소 가시선 여유 −2.17 m, Fig. 1). 차폐 제약을 부과한 실행에서는 기체가 같은 경로를 따르되 도착이 46.6 s로 늦어지고, 그림자가 지나간 뒤에 교차 지점을 통과한다. 반환된 궤적에서 위반량과 여유 변수는 0이고(16회 반복, 0.5 s; Rust 구현, Clarabel, Apple M2), 궤적의 표본 검사에서도 최소 가시선 여유 +3.3 m로 전 구간 가시선을 유지하였다. 두 실행의 경로는 공간에서 겹치고(최대 횡방향 편차 0.55 m) 통과 시점만 다르며, 제약을 부과한 실행의 경로를 기준 실행의 시각 배분으로 비행하면 최소 가시선 여유가 −1.69 m로 떨어진다. 그림자만 피해 회랑 축을 따라 도달할 수 있는 시각의 하한은 43.0 s이며, 차이 3.6 s는 리프팅된 KOZ의 시간 방향 두께(시간 축 척도)가 낳는 보수성이다.</w:t>
-      </w:r>
-    </w:p>
+        <w:t xml:space="preserve">결과는 Table 2와 같다. 차폐 제약이 없는 기준 실행은 속도 상한으로 곧장 통과하여 그림자에 든 동안 가시선을 잃는다(Fig. 2). 차폐 제약을 부과한 실행은 같은 경로를 따르되 도착을 늦추어 그림자가 지나간 뒤에 교차 지점을 통과하며, 반환된 궤적의 위반량과 여유 변수는 0이고 표본 검사에서도 전 구간 가시선을 유지하였다. 두 실행의 경로는 공간에서 겹치고 통과 시점만 다르며, 제약을 부과한 실행의 경로를 기준 실행의 시각 배분으로 비행하면 가시선을 잃는다. 그림자만 피해 회랑 축을 따라 도달할 수 있는 시각의 하한은 43.0 s이며, 차이 3.6 s는 리프팅된 KOZ의 시간 방향 두께(시간 축 척도)가 낳는 보수성이다.</w:t>
+      </w:r>
+    </w:p>
+    <w:p>
+      <w:pPr>
+        <w:pStyle w:val="ad"/>
+      </w:pPr>
+      <w:r>
+        <w:t xml:space="preserve">Table 2 Results of the two runs.</w:t>
+      </w:r>
+    </w:p>
+    <w:tbl>
+      <w:tblPr>
+        <w:tblOverlap w:val="never"/>
+        <w:tblW w:w="4477" w:type="dxa"/>
+        <w:tblInd w:w="28" w:type="dxa"/>
+        <w:tblBorders>
+          <w:top w:val="single" w:sz="3" w:space="0" w:color="000000"/>
+          <w:left w:val="single" w:sz="3" w:space="0" w:color="000000"/>
+          <w:bottom w:val="single" w:sz="3" w:space="0" w:color="000000"/>
+          <w:right w:val="single" w:sz="3" w:space="0" w:color="000000"/>
+        </w:tblBorders>
+        <w:tblLayout w:type="fixed"/>
+        <w:tblCellMar>
+          <w:top w:w="28" w:type="dxa"/>
+          <w:left w:w="28" w:type="dxa"/>
+          <w:bottom w:w="28" w:type="dxa"/>
+          <w:right w:w="28" w:type="dxa"/>
+        </w:tblCellMar>
+        <w:tblLook w:val="0000" w:firstRow="0" w:lastRow="0" w:firstColumn="0" w:lastColumn="0" w:noHBand="0" w:noVBand="0"/>
+      </w:tblPr>
+      <w:tblGrid>
+        <w:gridCol w:w="2277"/>
+        <w:gridCol w:w="1100"/>
+        <w:gridCol w:w="1100"/>
+      </w:tblGrid>
+      <w:tr>
+        <w:trPr>
+          <w:trHeight w:val="230"/>
+        </w:trPr>
+        <w:tc>
+          <w:tcPr>
+            <w:tcW w:w="2277" w:type="dxa"/>
+            <w:tcBorders>
+              <w:top w:val="single" w:sz="3" w:space="0" w:color="000000"/>
+              <w:left w:val="single" w:sz="3" w:space="0" w:color="000000"/>
+              <w:bottom w:val="single" w:sz="3" w:space="0" w:color="000000"/>
+              <w:right w:val="single" w:sz="3" w:space="0" w:color="000000"/>
+            </w:tcBorders>
+            <w:shd w:val="clear" w:color="auto" w:fill="E5E5E5"/>
+            <w:vAlign w:val="center"/>
+          </w:tcPr>
+          <w:p>
+            <w:pPr>
+              <w:wordWrap/>
+              <w:spacing w:before="0" w:after="0" w:line="240" w:lineRule="auto"/>
+              <w:jc w:val="center"/>
+              <w:rPr>
+                <w:rFonts w:ascii="굴림" w:eastAsia="굴림" w:hAnsi="굴림"/>
+                <w:sz w:val="16"/>
+                <w:szCs w:val="16"/>
+              </w:rPr>
+            </w:pPr>
+            <w:r>
+              <w:rPr>
+                <w:rFonts w:ascii="굴림" w:eastAsia="굴림" w:hAnsi="굴림"/>
+                <w:sz w:val="16"/>
+                <w:szCs w:val="16"/>
+              </w:rPr>
+              <w:t xml:space="preserve">항목</w:t>
+            </w:r>
+          </w:p>
+        </w:tc>
+        <w:tc>
+          <w:tcPr>
+            <w:tcW w:w="1100" w:type="dxa"/>
+            <w:tcBorders>
+              <w:top w:val="single" w:sz="3" w:space="0" w:color="000000"/>
+              <w:left w:val="single" w:sz="3" w:space="0" w:color="000000"/>
+              <w:bottom w:val="single" w:sz="3" w:space="0" w:color="000000"/>
+              <w:right w:val="single" w:sz="3" w:space="0" w:color="000000"/>
+            </w:tcBorders>
+            <w:shd w:val="clear" w:color="auto" w:fill="E5E5E5"/>
+            <w:vAlign w:val="center"/>
+          </w:tcPr>
+          <w:p>
+            <w:pPr>
+              <w:wordWrap/>
+              <w:spacing w:before="0" w:after="0" w:line="240" w:lineRule="auto"/>
+              <w:jc w:val="center"/>
+              <w:rPr>
+                <w:rFonts w:ascii="굴림" w:eastAsia="굴림" w:hAnsi="굴림"/>
+                <w:sz w:val="16"/>
+                <w:szCs w:val="16"/>
+              </w:rPr>
+            </w:pPr>
+            <w:r>
+              <w:rPr>
+                <w:rFonts w:ascii="굴림" w:eastAsia="굴림" w:hAnsi="굴림"/>
+                <w:sz w:val="16"/>
+                <w:szCs w:val="16"/>
+              </w:rPr>
+              <w:t xml:space="preserve">차폐 제약 없음</w:t>
+            </w:r>
+          </w:p>
+        </w:tc>
+        <w:tc>
+          <w:tcPr>
+            <w:tcW w:w="1100" w:type="dxa"/>
+            <w:tcBorders>
+              <w:top w:val="single" w:sz="3" w:space="0" w:color="000000"/>
+              <w:left w:val="single" w:sz="3" w:space="0" w:color="000000"/>
+              <w:bottom w:val="single" w:sz="3" w:space="0" w:color="000000"/>
+              <w:right w:val="single" w:sz="3" w:space="0" w:color="000000"/>
+            </w:tcBorders>
+            <w:shd w:val="clear" w:color="auto" w:fill="E5E5E5"/>
+            <w:vAlign w:val="center"/>
+          </w:tcPr>
+          <w:p>
+            <w:pPr>
+              <w:wordWrap/>
+              <w:spacing w:before="0" w:after="0" w:line="240" w:lineRule="auto"/>
+              <w:jc w:val="center"/>
+              <w:rPr>
+                <w:rFonts w:ascii="굴림" w:eastAsia="굴림" w:hAnsi="굴림"/>
+                <w:sz w:val="16"/>
+                <w:szCs w:val="16"/>
+              </w:rPr>
+            </w:pPr>
+            <w:r>
+              <w:rPr>
+                <w:rFonts w:ascii="굴림" w:eastAsia="굴림" w:hAnsi="굴림"/>
+                <w:sz w:val="16"/>
+                <w:szCs w:val="16"/>
+              </w:rPr>
+              <w:t xml:space="preserve">차폐 제약 부과</w:t>
+            </w:r>
+          </w:p>
+        </w:tc>
+      </w:tr>
+      <w:tr>
+        <w:trPr>
+          <w:trHeight w:val="230"/>
+        </w:trPr>
+        <w:tc>
+          <w:tcPr>
+            <w:tcW w:w="2277" w:type="dxa"/>
+            <w:tcBorders>
+              <w:top w:val="single" w:sz="3" w:space="0" w:color="000000"/>
+              <w:left w:val="single" w:sz="3" w:space="0" w:color="000000"/>
+              <w:bottom w:val="single" w:sz="3" w:space="0" w:color="000000"/>
+              <w:right w:val="single" w:sz="3" w:space="0" w:color="000000"/>
+            </w:tcBorders>
+            <w:vAlign w:val="center"/>
+          </w:tcPr>
+          <w:p>
+            <w:pPr>
+              <w:wordWrap/>
+              <w:spacing w:before="0" w:after="0" w:line="240" w:lineRule="auto"/>
+              <w:jc w:val="left"/>
+              <w:rPr>
+                <w:rFonts w:ascii="굴림" w:eastAsia="굴림" w:hAnsi="굴림"/>
+                <w:sz w:val="16"/>
+                <w:szCs w:val="16"/>
+              </w:rPr>
+            </w:pPr>
+            <w:r>
+              <w:rPr>
+                <w:rFonts w:ascii="굴림" w:eastAsia="굴림" w:hAnsi="굴림"/>
+                <w:sz w:val="16"/>
+                <w:szCs w:val="16"/>
+              </w:rPr>
+              <w:t xml:space="preserve">도착 시각 [s]</w:t>
+            </w:r>
+          </w:p>
+        </w:tc>
+        <w:tc>
+          <w:tcPr>
+            <w:tcW w:w="1100" w:type="dxa"/>
+            <w:tcBorders>
+              <w:top w:val="single" w:sz="3" w:space="0" w:color="000000"/>
+              <w:left w:val="single" w:sz="3" w:space="0" w:color="000000"/>
+              <w:bottom w:val="single" w:sz="3" w:space="0" w:color="000000"/>
+              <w:right w:val="single" w:sz="3" w:space="0" w:color="000000"/>
+            </w:tcBorders>
+            <w:vAlign w:val="center"/>
+          </w:tcPr>
+          <w:p>
+            <w:pPr>
+              <w:wordWrap/>
+              <w:spacing w:before="0" w:after="0" w:line="240" w:lineRule="auto"/>
+              <w:jc w:val="center"/>
+              <w:rPr>
+                <w:rFonts w:ascii="굴림" w:eastAsia="굴림" w:hAnsi="굴림"/>
+                <w:sz w:val="16"/>
+                <w:szCs w:val="16"/>
+              </w:rPr>
+            </w:pPr>
+            <w:r>
+              <w:rPr>
+                <w:rFonts w:ascii="굴림" w:eastAsia="굴림" w:hAnsi="굴림"/>
+                <w:sz w:val="16"/>
+                <w:szCs w:val="16"/>
+              </w:rPr>
+              <w:t xml:space="preserve">40.0</w:t>
+            </w:r>
+          </w:p>
+        </w:tc>
+        <w:tc>
+          <w:tcPr>
+            <w:tcW w:w="1100" w:type="dxa"/>
+            <w:tcBorders>
+              <w:top w:val="single" w:sz="3" w:space="0" w:color="000000"/>
+              <w:left w:val="single" w:sz="3" w:space="0" w:color="000000"/>
+              <w:bottom w:val="single" w:sz="3" w:space="0" w:color="000000"/>
+              <w:right w:val="single" w:sz="3" w:space="0" w:color="000000"/>
+            </w:tcBorders>
+            <w:vAlign w:val="center"/>
+          </w:tcPr>
+          <w:p>
+            <w:pPr>
+              <w:wordWrap/>
+              <w:spacing w:before="0" w:after="0" w:line="240" w:lineRule="auto"/>
+              <w:jc w:val="center"/>
+              <w:rPr>
+                <w:rFonts w:ascii="굴림" w:eastAsia="굴림" w:hAnsi="굴림"/>
+                <w:sz w:val="16"/>
+                <w:szCs w:val="16"/>
+              </w:rPr>
+            </w:pPr>
+            <w:r>
+              <w:rPr>
+                <w:rFonts w:ascii="굴림" w:eastAsia="굴림" w:hAnsi="굴림"/>
+                <w:sz w:val="16"/>
+                <w:szCs w:val="16"/>
+              </w:rPr>
+              <w:t xml:space="preserve">46.6</w:t>
+            </w:r>
+          </w:p>
+        </w:tc>
+      </w:tr>
+      <w:tr>
+        <w:trPr>
+          <w:trHeight w:val="230"/>
+        </w:trPr>
+        <w:tc>
+          <w:tcPr>
+            <w:tcW w:w="2277" w:type="dxa"/>
+            <w:tcBorders>
+              <w:top w:val="single" w:sz="3" w:space="0" w:color="000000"/>
+              <w:left w:val="single" w:sz="3" w:space="0" w:color="000000"/>
+              <w:bottom w:val="single" w:sz="3" w:space="0" w:color="000000"/>
+              <w:right w:val="single" w:sz="3" w:space="0" w:color="000000"/>
+            </w:tcBorders>
+            <w:vAlign w:val="center"/>
+          </w:tcPr>
+          <w:p>
+            <w:pPr>
+              <w:wordWrap/>
+              <w:spacing w:before="0" w:after="0" w:line="240" w:lineRule="auto"/>
+              <w:jc w:val="left"/>
+              <w:rPr>
+                <w:rFonts w:ascii="굴림" w:eastAsia="굴림" w:hAnsi="굴림"/>
+                <w:sz w:val="16"/>
+                <w:szCs w:val="16"/>
+              </w:rPr>
+            </w:pPr>
+            <w:r>
+              <w:rPr>
+                <w:rFonts w:ascii="굴림" w:eastAsia="굴림" w:hAnsi="굴림"/>
+                <w:sz w:val="16"/>
+                <w:szCs w:val="16"/>
+              </w:rPr>
+              <w:t xml:space="preserve">최소 가시선 여유 [m]</w:t>
+            </w:r>
+          </w:p>
+        </w:tc>
+        <w:tc>
+          <w:tcPr>
+            <w:tcW w:w="1100" w:type="dxa"/>
+            <w:tcBorders>
+              <w:top w:val="single" w:sz="3" w:space="0" w:color="000000"/>
+              <w:left w:val="single" w:sz="3" w:space="0" w:color="000000"/>
+              <w:bottom w:val="single" w:sz="3" w:space="0" w:color="000000"/>
+              <w:right w:val="single" w:sz="3" w:space="0" w:color="000000"/>
+            </w:tcBorders>
+            <w:vAlign w:val="center"/>
+          </w:tcPr>
+          <w:p>
+            <w:pPr>
+              <w:wordWrap/>
+              <w:spacing w:before="0" w:after="0" w:line="240" w:lineRule="auto"/>
+              <w:jc w:val="center"/>
+              <w:rPr>
+                <w:rFonts w:ascii="굴림" w:eastAsia="굴림" w:hAnsi="굴림"/>
+                <w:sz w:val="16"/>
+                <w:szCs w:val="16"/>
+              </w:rPr>
+            </w:pPr>
+            <w:r>
+              <w:rPr>
+                <w:rFonts w:ascii="굴림" w:eastAsia="굴림" w:hAnsi="굴림"/>
+                <w:sz w:val="16"/>
+                <w:szCs w:val="16"/>
+              </w:rPr>
+              <w:t xml:space="preserve">−2.17</w:t>
+            </w:r>
+          </w:p>
+        </w:tc>
+        <w:tc>
+          <w:tcPr>
+            <w:tcW w:w="1100" w:type="dxa"/>
+            <w:tcBorders>
+              <w:top w:val="single" w:sz="3" w:space="0" w:color="000000"/>
+              <w:left w:val="single" w:sz="3" w:space="0" w:color="000000"/>
+              <w:bottom w:val="single" w:sz="3" w:space="0" w:color="000000"/>
+              <w:right w:val="single" w:sz="3" w:space="0" w:color="000000"/>
+            </w:tcBorders>
+            <w:vAlign w:val="center"/>
+          </w:tcPr>
+          <w:p>
+            <w:pPr>
+              <w:wordWrap/>
+              <w:spacing w:before="0" w:after="0" w:line="240" w:lineRule="auto"/>
+              <w:jc w:val="center"/>
+              <w:rPr>
+                <w:rFonts w:ascii="굴림" w:eastAsia="굴림" w:hAnsi="굴림"/>
+                <w:sz w:val="16"/>
+                <w:szCs w:val="16"/>
+              </w:rPr>
+            </w:pPr>
+            <w:r>
+              <w:rPr>
+                <w:rFonts w:ascii="굴림" w:eastAsia="굴림" w:hAnsi="굴림"/>
+                <w:sz w:val="16"/>
+                <w:szCs w:val="16"/>
+              </w:rPr>
+              <w:t xml:space="preserve">+3.34</w:t>
+            </w:r>
+          </w:p>
+        </w:tc>
+      </w:tr>
+      <w:tr>
+        <w:trPr>
+          <w:trHeight w:val="230"/>
+        </w:trPr>
+        <w:tc>
+          <w:tcPr>
+            <w:tcW w:w="2277" w:type="dxa"/>
+            <w:tcBorders>
+              <w:top w:val="single" w:sz="3" w:space="0" w:color="000000"/>
+              <w:left w:val="single" w:sz="3" w:space="0" w:color="000000"/>
+              <w:bottom w:val="single" w:sz="3" w:space="0" w:color="000000"/>
+              <w:right w:val="single" w:sz="3" w:space="0" w:color="000000"/>
+            </w:tcBorders>
+            <w:vAlign w:val="center"/>
+          </w:tcPr>
+          <w:p>
+            <w:pPr>
+              <w:wordWrap/>
+              <w:spacing w:before="0" w:after="0" w:line="240" w:lineRule="auto"/>
+              <w:jc w:val="left"/>
+              <w:rPr>
+                <w:rFonts w:ascii="굴림" w:eastAsia="굴림" w:hAnsi="굴림"/>
+                <w:sz w:val="16"/>
+                <w:szCs w:val="16"/>
+              </w:rPr>
+            </w:pPr>
+            <w:r>
+              <w:rPr>
+                <w:rFonts w:ascii="굴림" w:eastAsia="굴림" w:hAnsi="굴림"/>
+                <w:sz w:val="16"/>
+                <w:szCs w:val="16"/>
+              </w:rPr>
+              <w:t xml:space="preserve">가시선 상실 구간 [s]</w:t>
+            </w:r>
+          </w:p>
+        </w:tc>
+        <w:tc>
+          <w:tcPr>
+            <w:tcW w:w="1100" w:type="dxa"/>
+            <w:tcBorders>
+              <w:top w:val="single" w:sz="3" w:space="0" w:color="000000"/>
+              <w:left w:val="single" w:sz="3" w:space="0" w:color="000000"/>
+              <w:bottom w:val="single" w:sz="3" w:space="0" w:color="000000"/>
+              <w:right w:val="single" w:sz="3" w:space="0" w:color="000000"/>
+            </w:tcBorders>
+            <w:vAlign w:val="center"/>
+          </w:tcPr>
+          <w:p>
+            <w:pPr>
+              <w:wordWrap/>
+              <w:spacing w:before="0" w:after="0" w:line="240" w:lineRule="auto"/>
+              <w:jc w:val="center"/>
+              <w:rPr>
+                <w:rFonts w:ascii="굴림" w:eastAsia="굴림" w:hAnsi="굴림"/>
+                <w:sz w:val="16"/>
+                <w:szCs w:val="16"/>
+              </w:rPr>
+            </w:pPr>
+            <w:r>
+              <w:rPr>
+                <w:rFonts w:ascii="굴림" w:eastAsia="굴림" w:hAnsi="굴림"/>
+                <w:sz w:val="16"/>
+                <w:szCs w:val="16"/>
+              </w:rPr>
+              <w:t xml:space="preserve">14.96–16.52</w:t>
+            </w:r>
+          </w:p>
+        </w:tc>
+        <w:tc>
+          <w:tcPr>
+            <w:tcW w:w="1100" w:type="dxa"/>
+            <w:tcBorders>
+              <w:top w:val="single" w:sz="3" w:space="0" w:color="000000"/>
+              <w:left w:val="single" w:sz="3" w:space="0" w:color="000000"/>
+              <w:bottom w:val="single" w:sz="3" w:space="0" w:color="000000"/>
+              <w:right w:val="single" w:sz="3" w:space="0" w:color="000000"/>
+            </w:tcBorders>
+            <w:vAlign w:val="center"/>
+          </w:tcPr>
+          <w:p>
+            <w:pPr>
+              <w:wordWrap/>
+              <w:spacing w:before="0" w:after="0" w:line="240" w:lineRule="auto"/>
+              <w:jc w:val="center"/>
+              <w:rPr>
+                <w:rFonts w:ascii="굴림" w:eastAsia="굴림" w:hAnsi="굴림"/>
+                <w:sz w:val="16"/>
+                <w:szCs w:val="16"/>
+              </w:rPr>
+            </w:pPr>
+            <w:r>
+              <w:rPr>
+                <w:rFonts w:ascii="굴림" w:eastAsia="굴림" w:hAnsi="굴림"/>
+                <w:sz w:val="16"/>
+                <w:szCs w:val="16"/>
+              </w:rPr>
+              <w:t xml:space="preserve">없음</w:t>
+            </w:r>
+          </w:p>
+        </w:tc>
+      </w:tr>
+      <w:tr>
+        <w:trPr>
+          <w:trHeight w:val="230"/>
+        </w:trPr>
+        <w:tc>
+          <w:tcPr>
+            <w:tcW w:w="2277" w:type="dxa"/>
+            <w:tcBorders>
+              <w:top w:val="single" w:sz="3" w:space="0" w:color="000000"/>
+              <w:left w:val="single" w:sz="3" w:space="0" w:color="000000"/>
+              <w:bottom w:val="single" w:sz="3" w:space="0" w:color="000000"/>
+              <w:right w:val="single" w:sz="3" w:space="0" w:color="000000"/>
+            </w:tcBorders>
+            <w:vAlign w:val="center"/>
+          </w:tcPr>
+          <w:p>
+            <w:pPr>
+              <w:wordWrap/>
+              <w:spacing w:before="0" w:after="0" w:line="240" w:lineRule="auto"/>
+              <w:jc w:val="left"/>
+              <w:rPr>
+                <w:rFonts w:ascii="굴림" w:eastAsia="굴림" w:hAnsi="굴림"/>
+                <w:sz w:val="16"/>
+                <w:szCs w:val="16"/>
+              </w:rPr>
+            </w:pPr>
+            <w:r>
+              <w:rPr>
+                <w:rFonts w:ascii="굴림" w:eastAsia="굴림" w:hAnsi="굴림"/>
+                <w:sz w:val="16"/>
+                <w:szCs w:val="16"/>
+              </w:rPr>
+              <w:t xml:space="preserve">최대 횡방향 편차 [m]</w:t>
+            </w:r>
+          </w:p>
+        </w:tc>
+        <w:tc>
+          <w:tcPr>
+            <w:tcW w:w="1100" w:type="dxa"/>
+            <w:tcBorders>
+              <w:top w:val="single" w:sz="3" w:space="0" w:color="000000"/>
+              <w:left w:val="single" w:sz="3" w:space="0" w:color="000000"/>
+              <w:bottom w:val="single" w:sz="3" w:space="0" w:color="000000"/>
+              <w:right w:val="single" w:sz="3" w:space="0" w:color="000000"/>
+            </w:tcBorders>
+            <w:vAlign w:val="center"/>
+          </w:tcPr>
+          <w:p>
+            <w:pPr>
+              <w:wordWrap/>
+              <w:spacing w:before="0" w:after="0" w:line="240" w:lineRule="auto"/>
+              <w:jc w:val="center"/>
+              <w:rPr>
+                <w:rFonts w:ascii="굴림" w:eastAsia="굴림" w:hAnsi="굴림"/>
+                <w:sz w:val="16"/>
+                <w:szCs w:val="16"/>
+              </w:rPr>
+            </w:pPr>
+            <w:r>
+              <w:rPr>
+                <w:rFonts w:ascii="굴림" w:eastAsia="굴림" w:hAnsi="굴림"/>
+                <w:sz w:val="16"/>
+                <w:szCs w:val="16"/>
+              </w:rPr>
+              <w:t xml:space="preserve">—</w:t>
+            </w:r>
+          </w:p>
+        </w:tc>
+        <w:tc>
+          <w:tcPr>
+            <w:tcW w:w="1100" w:type="dxa"/>
+            <w:tcBorders>
+              <w:top w:val="single" w:sz="3" w:space="0" w:color="000000"/>
+              <w:left w:val="single" w:sz="3" w:space="0" w:color="000000"/>
+              <w:bottom w:val="single" w:sz="3" w:space="0" w:color="000000"/>
+              <w:right w:val="single" w:sz="3" w:space="0" w:color="000000"/>
+            </w:tcBorders>
+            <w:vAlign w:val="center"/>
+          </w:tcPr>
+          <w:p>
+            <w:pPr>
+              <w:wordWrap/>
+              <w:spacing w:before="0" w:after="0" w:line="240" w:lineRule="auto"/>
+              <w:jc w:val="center"/>
+              <w:rPr>
+                <w:rFonts w:ascii="굴림" w:eastAsia="굴림" w:hAnsi="굴림"/>
+                <w:sz w:val="16"/>
+                <w:szCs w:val="16"/>
+              </w:rPr>
+            </w:pPr>
+            <w:r>
+              <w:rPr>
+                <w:rFonts w:ascii="굴림" w:eastAsia="굴림" w:hAnsi="굴림"/>
+                <w:sz w:val="16"/>
+                <w:szCs w:val="16"/>
+              </w:rPr>
+              <w:t xml:space="preserve">0.55</w:t>
+            </w:r>
+          </w:p>
+        </w:tc>
+      </w:tr>
+      <w:tr>
+        <w:trPr>
+          <w:trHeight w:val="230"/>
+        </w:trPr>
+        <w:tc>
+          <w:tcPr>
+            <w:tcW w:w="2277" w:type="dxa"/>
+            <w:tcBorders>
+              <w:top w:val="single" w:sz="3" w:space="0" w:color="000000"/>
+              <w:left w:val="single" w:sz="3" w:space="0" w:color="000000"/>
+              <w:bottom w:val="single" w:sz="3" w:space="0" w:color="000000"/>
+              <w:right w:val="single" w:sz="3" w:space="0" w:color="000000"/>
+            </w:tcBorders>
+            <w:vAlign w:val="center"/>
+          </w:tcPr>
+          <w:p>
+            <w:pPr>
+              <w:wordWrap/>
+              <w:spacing w:before="0" w:after="0" w:line="240" w:lineRule="auto"/>
+              <w:jc w:val="left"/>
+              <w:rPr>
+                <w:rFonts w:ascii="굴림" w:eastAsia="굴림" w:hAnsi="굴림"/>
+                <w:sz w:val="16"/>
+                <w:szCs w:val="16"/>
+              </w:rPr>
+            </w:pPr>
+            <w:r>
+              <w:rPr>
+                <w:rFonts w:ascii="굴림" w:eastAsia="굴림" w:hAnsi="굴림"/>
+                <w:sz w:val="16"/>
+                <w:szCs w:val="16"/>
+              </w:rPr>
+              <w:t xml:space="preserve">위반량 / 여유 변수</w:t>
+            </w:r>
+          </w:p>
+        </w:tc>
+        <w:tc>
+          <w:tcPr>
+            <w:tcW w:w="1100" w:type="dxa"/>
+            <w:tcBorders>
+              <w:top w:val="single" w:sz="3" w:space="0" w:color="000000"/>
+              <w:left w:val="single" w:sz="3" w:space="0" w:color="000000"/>
+              <w:bottom w:val="single" w:sz="3" w:space="0" w:color="000000"/>
+              <w:right w:val="single" w:sz="3" w:space="0" w:color="000000"/>
+            </w:tcBorders>
+            <w:vAlign w:val="center"/>
+          </w:tcPr>
+          <w:p>
+            <w:pPr>
+              <w:wordWrap/>
+              <w:spacing w:before="0" w:after="0" w:line="240" w:lineRule="auto"/>
+              <w:jc w:val="center"/>
+              <w:rPr>
+                <w:rFonts w:ascii="굴림" w:eastAsia="굴림" w:hAnsi="굴림"/>
+                <w:sz w:val="16"/>
+                <w:szCs w:val="16"/>
+              </w:rPr>
+            </w:pPr>
+            <w:r>
+              <w:rPr>
+                <w:rFonts w:ascii="굴림" w:eastAsia="굴림" w:hAnsi="굴림"/>
+                <w:sz w:val="16"/>
+                <w:szCs w:val="16"/>
+              </w:rPr>
+              <w:t xml:space="preserve">—</w:t>
+            </w:r>
+          </w:p>
+        </w:tc>
+        <w:tc>
+          <w:tcPr>
+            <w:tcW w:w="1100" w:type="dxa"/>
+            <w:tcBorders>
+              <w:top w:val="single" w:sz="3" w:space="0" w:color="000000"/>
+              <w:left w:val="single" w:sz="3" w:space="0" w:color="000000"/>
+              <w:bottom w:val="single" w:sz="3" w:space="0" w:color="000000"/>
+              <w:right w:val="single" w:sz="3" w:space="0" w:color="000000"/>
+            </w:tcBorders>
+            <w:vAlign w:val="center"/>
+          </w:tcPr>
+          <w:p>
+            <w:pPr>
+              <w:wordWrap/>
+              <w:spacing w:before="0" w:after="0" w:line="240" w:lineRule="auto"/>
+              <w:jc w:val="center"/>
+              <w:rPr>
+                <w:rFonts w:ascii="굴림" w:eastAsia="굴림" w:hAnsi="굴림"/>
+                <w:sz w:val="16"/>
+                <w:szCs w:val="16"/>
+              </w:rPr>
+            </w:pPr>
+            <w:r>
+              <w:rPr>
+                <w:rFonts w:ascii="굴림" w:eastAsia="굴림" w:hAnsi="굴림"/>
+                <w:sz w:val="16"/>
+                <w:szCs w:val="16"/>
+              </w:rPr>
+              <w:t xml:space="preserve">0 / 0</w:t>
+            </w:r>
+          </w:p>
+        </w:tc>
+      </w:tr>
+      <w:tr>
+        <w:trPr>
+          <w:trHeight w:val="230"/>
+        </w:trPr>
+        <w:tc>
+          <w:tcPr>
+            <w:tcW w:w="2277" w:type="dxa"/>
+            <w:tcBorders>
+              <w:top w:val="single" w:sz="3" w:space="0" w:color="000000"/>
+              <w:left w:val="single" w:sz="3" w:space="0" w:color="000000"/>
+              <w:bottom w:val="single" w:sz="3" w:space="0" w:color="000000"/>
+              <w:right w:val="single" w:sz="3" w:space="0" w:color="000000"/>
+            </w:tcBorders>
+            <w:vAlign w:val="center"/>
+          </w:tcPr>
+          <w:p>
+            <w:pPr>
+              <w:wordWrap/>
+              <w:spacing w:before="0" w:after="0" w:line="240" w:lineRule="auto"/>
+              <w:jc w:val="left"/>
+              <w:rPr>
+                <w:rFonts w:ascii="굴림" w:eastAsia="굴림" w:hAnsi="굴림"/>
+                <w:sz w:val="16"/>
+                <w:szCs w:val="16"/>
+              </w:rPr>
+            </w:pPr>
+            <w:r>
+              <w:rPr>
+                <w:rFonts w:ascii="굴림" w:eastAsia="굴림" w:hAnsi="굴림"/>
+                <w:sz w:val="16"/>
+                <w:szCs w:val="16"/>
+              </w:rPr>
+              <w:t xml:space="preserve">반복 횟수 / 계산 시간 [s]</w:t>
+            </w:r>
+          </w:p>
+        </w:tc>
+        <w:tc>
+          <w:tcPr>
+            <w:tcW w:w="1100" w:type="dxa"/>
+            <w:tcBorders>
+              <w:top w:val="single" w:sz="3" w:space="0" w:color="000000"/>
+              <w:left w:val="single" w:sz="3" w:space="0" w:color="000000"/>
+              <w:bottom w:val="single" w:sz="3" w:space="0" w:color="000000"/>
+              <w:right w:val="single" w:sz="3" w:space="0" w:color="000000"/>
+            </w:tcBorders>
+            <w:vAlign w:val="center"/>
+          </w:tcPr>
+          <w:p>
+            <w:pPr>
+              <w:wordWrap/>
+              <w:spacing w:before="0" w:after="0" w:line="240" w:lineRule="auto"/>
+              <w:jc w:val="center"/>
+              <w:rPr>
+                <w:rFonts w:ascii="굴림" w:eastAsia="굴림" w:hAnsi="굴림"/>
+                <w:sz w:val="16"/>
+                <w:szCs w:val="16"/>
+              </w:rPr>
+            </w:pPr>
+            <w:r>
+              <w:rPr>
+                <w:rFonts w:ascii="굴림" w:eastAsia="굴림" w:hAnsi="굴림"/>
+                <w:sz w:val="16"/>
+                <w:szCs w:val="16"/>
+              </w:rPr>
+              <w:t xml:space="preserve">—</w:t>
+            </w:r>
+          </w:p>
+        </w:tc>
+        <w:tc>
+          <w:tcPr>
+            <w:tcW w:w="1100" w:type="dxa"/>
+            <w:tcBorders>
+              <w:top w:val="single" w:sz="3" w:space="0" w:color="000000"/>
+              <w:left w:val="single" w:sz="3" w:space="0" w:color="000000"/>
+              <w:bottom w:val="single" w:sz="3" w:space="0" w:color="000000"/>
+              <w:right w:val="single" w:sz="3" w:space="0" w:color="000000"/>
+            </w:tcBorders>
+            <w:vAlign w:val="center"/>
+          </w:tcPr>
+          <w:p>
+            <w:pPr>
+              <w:wordWrap/>
+              <w:spacing w:before="0" w:after="0" w:line="240" w:lineRule="auto"/>
+              <w:jc w:val="center"/>
+              <w:rPr>
+                <w:rFonts w:ascii="굴림" w:eastAsia="굴림" w:hAnsi="굴림"/>
+                <w:sz w:val="16"/>
+                <w:szCs w:val="16"/>
+              </w:rPr>
+            </w:pPr>
+            <w:r>
+              <w:rPr>
+                <w:rFonts w:ascii="굴림" w:eastAsia="굴림" w:hAnsi="굴림"/>
+                <w:sz w:val="16"/>
+                <w:szCs w:val="16"/>
+              </w:rPr>
+              <w:t xml:space="preserve">16 / 0.47</w:t>
+            </w:r>
+          </w:p>
+        </w:tc>
+      </w:tr>
+      <w:tr>
+        <w:trPr>
+          <w:trHeight w:val="230"/>
+        </w:trPr>
+        <w:tc>
+          <w:tcPr>
+            <w:tcW w:w="2277" w:type="dxa"/>
+            <w:tcBorders>
+              <w:top w:val="single" w:sz="3" w:space="0" w:color="000000"/>
+              <w:left w:val="single" w:sz="3" w:space="0" w:color="000000"/>
+              <w:bottom w:val="single" w:sz="3" w:space="0" w:color="000000"/>
+              <w:right w:val="single" w:sz="3" w:space="0" w:color="000000"/>
+            </w:tcBorders>
+            <w:vAlign w:val="center"/>
+          </w:tcPr>
+          <w:p>
+            <w:pPr>
+              <w:wordWrap/>
+              <w:spacing w:before="0" w:after="0" w:line="240" w:lineRule="auto"/>
+              <w:jc w:val="left"/>
+              <w:rPr>
+                <w:rFonts w:ascii="굴림" w:eastAsia="굴림" w:hAnsi="굴림"/>
+                <w:sz w:val="16"/>
+                <w:szCs w:val="16"/>
+              </w:rPr>
+            </w:pPr>
+            <w:r>
+              <w:rPr>
+                <w:rFonts w:ascii="굴림" w:eastAsia="굴림" w:hAnsi="굴림"/>
+                <w:sz w:val="16"/>
+                <w:szCs w:val="16"/>
+              </w:rPr>
+              <w:t xml:space="preserve">기준 시각 배분으로 비행 시 최소 여유 [m]</w:t>
+            </w:r>
+          </w:p>
+        </w:tc>
+        <w:tc>
+          <w:tcPr>
+            <w:tcW w:w="1100" w:type="dxa"/>
+            <w:tcBorders>
+              <w:top w:val="single" w:sz="3" w:space="0" w:color="000000"/>
+              <w:left w:val="single" w:sz="3" w:space="0" w:color="000000"/>
+              <w:bottom w:val="single" w:sz="3" w:space="0" w:color="000000"/>
+              <w:right w:val="single" w:sz="3" w:space="0" w:color="000000"/>
+            </w:tcBorders>
+            <w:vAlign w:val="center"/>
+          </w:tcPr>
+          <w:p>
+            <w:pPr>
+              <w:wordWrap/>
+              <w:spacing w:before="0" w:after="0" w:line="240" w:lineRule="auto"/>
+              <w:jc w:val="center"/>
+              <w:rPr>
+                <w:rFonts w:ascii="굴림" w:eastAsia="굴림" w:hAnsi="굴림"/>
+                <w:sz w:val="16"/>
+                <w:szCs w:val="16"/>
+              </w:rPr>
+            </w:pPr>
+            <w:r>
+              <w:rPr>
+                <w:rFonts w:ascii="굴림" w:eastAsia="굴림" w:hAnsi="굴림"/>
+                <w:sz w:val="16"/>
+                <w:szCs w:val="16"/>
+              </w:rPr>
+              <w:t xml:space="preserve">—</w:t>
+            </w:r>
+          </w:p>
+        </w:tc>
+        <w:tc>
+          <w:tcPr>
+            <w:tcW w:w="1100" w:type="dxa"/>
+            <w:tcBorders>
+              <w:top w:val="single" w:sz="3" w:space="0" w:color="000000"/>
+              <w:left w:val="single" w:sz="3" w:space="0" w:color="000000"/>
+              <w:bottom w:val="single" w:sz="3" w:space="0" w:color="000000"/>
+              <w:right w:val="single" w:sz="3" w:space="0" w:color="000000"/>
+            </w:tcBorders>
+            <w:vAlign w:val="center"/>
+          </w:tcPr>
+          <w:p>
+            <w:pPr>
+              <w:wordWrap/>
+              <w:spacing w:before="0" w:after="0" w:line="240" w:lineRule="auto"/>
+              <w:jc w:val="center"/>
+              <w:rPr>
+                <w:rFonts w:ascii="굴림" w:eastAsia="굴림" w:hAnsi="굴림"/>
+                <w:sz w:val="16"/>
+                <w:szCs w:val="16"/>
+              </w:rPr>
+            </w:pPr>
+            <w:r>
+              <w:rPr>
+                <w:rFonts w:ascii="굴림" w:eastAsia="굴림" w:hAnsi="굴림"/>
+                <w:sz w:val="16"/>
+                <w:szCs w:val="16"/>
+              </w:rPr>
+              <w:t xml:space="preserve">−1.69</w:t>
+            </w:r>
+          </w:p>
+        </w:tc>
+      </w:tr>
+    </w:tbl>
     <w:p>
       <w:pPr>
         <w:pStyle w:val="ad"/>
@@ -439,7 +2830,7 @@
         <w:pStyle w:val="ad"/>
       </w:pPr>
       <w:r>
-        <w:t xml:space="preserve">Fig. 1 Scene at t = 15.7 s (left) and sight margin vs time (right).</w:t>
+        <w:t xml:space="preserve">Fig. 2 Scene at t = 15.7 s (left) and sight margin vs time (right).</w:t>
       </w:r>
     </w:p>
     <w:p>
@@ -458,7 +2849,7 @@
         <w:pStyle w:val="ab"/>
       </w:pPr>
       <w:r>
-        <w:t xml:space="preserve">클리핑된 KOZ 볼륨의 지지 반공간을 SCP 반복마다 다시 세워, 분해와 시간 배분을 미리 정하지 않고 장애물과 그 그림자를 하나의 최적화로 피하였다.</w:t>
+        <w:t xml:space="preserve">본 논문은 이동 장애물의 KOZ를 시공간에서 하나의 관으로 두고, 분할구간의 무게중심 둘레의 구로 잘라낸 부분에 대한 지지 반공간을 SCP 반복마다 다시 세우는 정식화를 제시하였다. 자유 공간의 볼록 분해와 시간 배분을 미리 정하지 않으므로, 관이 휘거나 굽어 감싸는 경우에도 회피 조건은 근접 구간마다 반공간 하나로 표현된다. 지상국을 점광원으로 두면 장애물과 그 그림자가 하나의 KOZ가 되어, 가시선 제약이 별도의 정식화 없이 같은 구성으로 처리된다. 선회 장애물의 그림자가 회랑을 쓸고 지나가는 시나리오에서 제안 기법은 경로를 바꾸지 않고 통과 시점을 늦추어 가시선을 유지하였으며, 반환된 궤적은 재검증에서 제약을 만족하였다.</w:t>
       </w:r>
     </w:p>
     <w:p>
@@ -466,7 +2857,7 @@
         <w:pStyle w:val="ab"/>
       </w:pPr>
       <w:r>
-        <w:t xml:space="preserve">해는 초기값에 의존하는 국소해이며, 장애물의 운동은 알려져 있다고 가정한다.</w:t>
+        <w:t xml:space="preserve">얻는 해는 초기값에 의존하는 국소해이며, 장애물의 운동은 알려져 있다고 가정한다. 리프팅된 KOZ의 시간 방향 두께가 낳는 보수성은 도착 시각을 하한보다 늦추므로, 시간 축 척도의 선택과 장애물 운동의 불확실성을 반영한 확률적 KOZ, receding horizon 구성으로의 확장을 향후 과제로 둔다.</w:t>
       </w:r>
     </w:p>
     <w:p>
@@ -521,42 +2912,6 @@
       </w:pPr>
       <w:r>
         <w:t xml:space="preserve">2)Osburn, M. D., Peterson, C. K., and Salmon, J. L., “Systematic Constraint Formulation and Collision-Free Trajectory Planning Using Space-Time Graphs of Convex Sets,” arXiv:2508.10203, 2025.</w:t>
-      </w:r>
-    </w:p>
-    <w:p>
-      <w:pPr>
-        <w:pStyle w:val="ae"/>
-        <w:rPr>
-          <w:sz w:val="18"/>
-          <w:szCs w:val="18"/>
-        </w:rPr>
-      </w:pPr>
-      <w:r>
-        <w:t xml:space="preserve">3)Tordesillas, J., and How, J. P., “MADER: Trajectory Planner in Multi-Agent and Dynamic Environments,” IEEE Trans. Robotics, 38(1), 2022.</w:t>
-      </w:r>
-    </w:p>
-    <w:p>
-      <w:pPr>
-        <w:pStyle w:val="ae"/>
-        <w:rPr>
-          <w:sz w:val="18"/>
-          <w:szCs w:val="18"/>
-        </w:rPr>
-      </w:pPr>
-      <w:r>
-        <w:t xml:space="preserve">4)Zhang, W., Yadmellat, P., and Gao, Z., “A Sufficient Condition for Convex Hull Property in General Convex Spatio-Temporal Corridors,” arXiv:2110.00065, 2021.</w:t>
-      </w:r>
-    </w:p>
-    <w:p>
-      <w:pPr>
-        <w:pStyle w:val="ae"/>
-        <w:rPr>
-          <w:sz w:val="18"/>
-          <w:szCs w:val="18"/>
-        </w:rPr>
-      </w:pPr>
-      <w:r>
-        <w:t xml:space="preserve">5)Mao, Y., Szmuk, M., and Açıkmeşe, B., “Successive Convexification of Non-Convex Optimal Control Problems and Its Convergence Properties,” Proc. IEEE CDC, 2016.</w:t>
       </w:r>
     </w:p>
     <w:sectPr>

</xml_diff>

<commit_message>
paper(ksas): scope half-space claim to segment, fix center-surface definition, degree N
- eq (2) claim now covers the subdivision segment, not the whole curve
- center surface defined without self-reference (shadow cast by the centerline)
- curve degree symbol is N in 2.1 and Table 1; t_n and normal vector n stay lowercase
- prior static-sphere work cited as ref 3; refs 1-2 shortened to et al.
</commit_message>
<xml_diff>
--- a/paper/ksas_2026_fall/manuscript.docx
+++ b/paper/ksas_2026_fall/manuscript.docx
@@ -244,7 +244,16 @@
         <w:pStyle w:val="ab"/>
       </w:pPr>
       <w:r>
-        <w:t xml:space="preserve">본 논문은 분해도 시간 배분도 미리 정하지 않는다. 장애물의 볼록 외부 근사를 고정된 시간 구간이 아니라 같은 리프팅된 공간에서 현재 반복점 둘레의 구 위에 순차 볼록 계획법(sequential convex programming, SCP) 반복마다 다시 세우므로, 통과 시각을 미리 정하지 않아도 근사가 정의된다. 이동 장애물의 keep-out zone(KOZ)은 리프팅된 공간에서 휘어진 관이 되지만 구로 잘라낸 부분의 supporting half-space(지지 반공간)만 세우므로 관이 볼록일 필요가 없으며, 관이 굽어 감싸는 경우와 지상국에서 본 그림자까지 같은 구성으로 다룬다.</w:t>
+        <w:t xml:space="preserve">본 논문은 분해도 시간 배분도 미리 정하지 않는다. 장애물의 볼록 외부 근사를 고정된 시간 구간이 아니라 같은 리프팅된 공간에서 현재 반복점 둘레의 구 위에 순차 볼록 계획법(sequential convex programming, SCP) 반복마다 다시 세우므로, 통과 시각을 미리 정하지 않아도 근사가 정의된다. 이동 장애물의 keep-out zone(KOZ)은 리프팅된 공간에서 휘어진 관이 되지만 구로 잘라낸 부분의 supporting half-space(지지 반공간)만 세우므로 관이 볼록일 필요가 없으며, 관이 굽어 감싸는 경우와 지상국에서 본 그림자까지 같은 구성으로 다룬다. 이는 정적 구 장애물에 대한 선행 연구</w:t>
+      </w:r>
+      <w:r>
+        <w:rPr>
+          <w:vertAlign w:val="superscript"/>
+        </w:rPr>
+        <w:t xml:space="preserve">(3)</w:t>
+      </w:r>
+      <w:r>
+        <w:t xml:space="preserve">의 확장이다.</w:t>
       </w:r>
     </w:p>
     <w:p>
@@ -271,7 +280,7 @@
         <w:pStyle w:val="ab"/>
       </w:pPr>
       <w:r>
-        <w:t xml:space="preserve">시간을 네 번째 좌표로 더해 공간 3차원을 4차원으로 리프팅하면 등속으로 움직이는 구형 KOZ는 리프팅된 공간에서 기울어진 정적인 관, 곧 중심선 위의 각 점을 중심으로 하는 반지름 rₘ의 구를 합친 집합이 된다. 장애물이 정적이므로 볼록 껍질 성질을 충돌 조건에 바로 쓸 수 있다. 리프팅된 공간의 거리는 1 s를 1 m로 환산한다. 결정 변수는 공간 좌표 xᵢ와 시간 좌표 tᵢ를 함께 가진 n차 곡선의 제어점 Qᵢ = (xᵢ, tᵢ), i = 0, …, n이며, De Casteljau 분할로 얻은 분할구간이 제약을 부과하는 단위이다.</w:t>
+        <w:t xml:space="preserve">시간을 네 번째 좌표로 더해 공간 3차원을 4차원으로 리프팅하면 등속으로 움직이는 구형 KOZ는 리프팅된 공간에서 기울어진 정적인 관, 곧 중심선 위의 각 점을 중심으로 하는 반지름 rₘ의 구를 합친 집합이 된다. 장애물이 정적이므로 볼록 껍질 성질을 충돌 조건에 바로 쓸 수 있다. 리프팅된 공간의 거리는 1 s를 1 m로 환산한다. 결정 변수는 공간 좌표 xᵢ와 시간 좌표 tᵢ를 함께 가진 N차 곡선의 제어점 Qᵢ = (xᵢ, tᵢ), i = 0, …, n이며, De Casteljau 분할로 얻은 분할구간이 제약을 부과하는 단위이다.</w:t>
       </w:r>
     </w:p>
     <w:p>
@@ -347,7 +356,7 @@
         <w:pStyle w:val="ab"/>
       </w:pPr>
       <w:r>
-        <w:t xml:space="preserve">식 (2)에서 b가 L의 지지값이므로 L은 반공간 밖에 남고, 같은 반공간을 모든 제어점에 부과하면 볼록 껍질 성질에 의해 곡선 전체가 반공간 안에 놓인다. 관이 굽어 c를 감싸면 평면 하나로는 부족하지만, 극대점에서 자르면 근접 구간마다 반공간이 하나씩 생겨 그 사이의 틈이 허용 영역이 된다. 최적화 문제는 다음과 같다.</w:t>
+        <w:t xml:space="preserve">식 (2)에서 b가 L의 지지값이므로 L은 반공간 밖에 남고, 같은 반공간을 분할구간의 모든 제어점에 부과하면 볼록 껍질 성질에 의해 그 분할구간 전체가 반공간 안에 놓인다. 관이 굽어 c를 감싸면 평면 하나로는 부족하지만, 극대점에서 자르면 근접 구간마다 반공간이 하나씩 생겨 그 사이의 틈이 허용 영역이 된다. 최적화 문제는 다음과 같다.</w:t>
       </w:r>
     </w:p>
     <w:p>
@@ -407,7 +416,7 @@
         <w:pStyle w:val="ab"/>
       </w:pPr>
       <w:r>
-        <w:t xml:space="preserve">지상국을 점광원으로 두면 장애물의 KOZ는 장애물 구와 그 뒤쪽 그림자를 합친 하나의 집합이다. 중심선은 점광원에 대한 중심선의 그림자인 중심 곡면이 된다. 그림자가 회전하여 비볼록이 된 이 집합에 2.1절과 2.2절의 구성을 중심선 대신 중심 곡면으로 그대로 적용한다. 이를 차폐 제약이라 한다.</w:t>
+        <w:t xml:space="preserve">지상국을 점광원으로 두면 장애물의 KOZ는 장애물 구와 그 뒤쪽 그림자를 합친 하나의 집합이다. 중심선이 점광원에 대해 드리우는 그림자는 곡면을 이루며, 이를 중심 곡면이라 한다. 그림자가 회전하여 비볼록이 된 이 집합에 2.1절과 2.2절의 구성을 중심선 대신 중심 곡면으로 그대로 적용한다. 이를 차폐 제약이라 한다.</w:t>
       </w:r>
     </w:p>
     <w:p>
@@ -837,7 +846,7 @@
                 <w:sz w:val="14"/>
                 <w:szCs w:val="14"/>
               </w:rPr>
-              <w:t xml:space="preserve">n</w:t>
+              <w:t xml:space="preserve">N</w:t>
             </w:r>
           </w:p>
         </w:tc>
@@ -3067,7 +3076,7 @@
         <w:pStyle w:val="ab"/>
       </w:pPr>
       <w:r>
-        <w:t xml:space="preserve">결과는 Table 2와 같다. 차폐 제약이 없는 기준 실행은 속도 상한으로 곧장 통과하여 그림자에 든 동안 가시선을 잃고(Fig. 2), 차폐 제약을 부과한 실행은 같은 경로를 따르되 도착을 늦추어 그림자가 지나간 뒤에 교차 지점을 통과한다. 두 실행의 경로는 공간에서 겹치고 통과 시점만 다르며, 제약을 부과한 실행의 경로를 기준 실행의 시각 배분으로 비행하면 가시선을 잃는다. 그림자만 피해 회랑 축을 따라 도달할 수 있는 시각의 하한은 43.0 s이며, 차이 3.6 s는 리프팅된 KOZ의 시간 방향 두께(시간 축 척도)가 낳는 보수성이다.</w:t>
+        <w:t xml:space="preserve">결과는 Table 2와 같다. 차폐 제약이 없는 기준 실행은 속도 상한으로 곧장 통과하여 그림자에 든 동안 가시선을 잃고(Fig. 2), 차폐 제약을 부과한 실행은 같은 경로를 따르되 도착을 늦추어 그림자가 지나간 뒤에 교차 지점을 통과한다. 두 실행의 경로는 겹치고 통과 시점만 다르며, 제약을 부과한 실행의 경로를 기준 실행의 시각 배분으로 비행하면 가시선을 잃는다. 그림자만 피해 회랑 축을 따라 도달 가능한 시각의 하한은 43.0 s이며, 차이 3.6 s는 리프팅된 KOZ의 시간 방향 두께가 낳는 보수성이다.</w:t>
       </w:r>
     </w:p>
     <w:p>
@@ -3138,7 +3147,7 @@
         <w:pStyle w:val="ab"/>
       </w:pPr>
       <w:r>
-        <w:t xml:space="preserve">본 논문은 이동 장애물의 KOZ를 시공간에서 하나의 관으로 두고, 분할구간의 무게중심 둘레의 구로 잘라낸 부분에 대한 지지 반공간을 SCP 반복마다 다시 세우는 정식화를 제시하였다. 자유 공간의 볼록 분해와 시간 배분을 미리 정하지 않으므로, 관이 휘거나 굽어 감싸는 경우에도 회피 조건은 근접 구간마다 반공간 하나로 표현된다. 지상국을 점광원으로 두면 장애물과 그 그림자가 하나의 KOZ가 되어, 가시선 제약이 별도의 정식화 없이 같은 구성으로 처리된다. 선회 장애물의 그림자가 회랑을 쓸고 지나가는 시나리오에서 제안 기법은 경로를 바꾸지 않고 통과 시점을 늦추어 가시선을 유지하였으며, 반환된 궤적은 재검증에서 제약을 만족하였다.</w:t>
+        <w:t xml:space="preserve">본 논문은 이동 장애물의 KOZ를 시공간에서 하나의 관으로 두고, 분할구간의 무게중심 둘레의 구로 잘라낸 부분에 대한 지지 반공간을 SCP 반복마다 다시 세우는 정식화를 제시하였다. 자유 공간의 볼록 분해와 시간 배분을 미리 정하지 않으므로, 관이 휘거나 굽어 감싸는 경우에도 회피 조건은 근접 구간마다 반공간 하나로 표현된다. 지상국을 점광원으로 두면 장애물과 그 그림자가 하나의 KOZ가 되어, 가시선 제약이 같은 구성으로 처리된다. 선회 장애물의 그림자가 회랑을 쓸고 지나가는 시나리오에서 제안 기법은 경로를 바꾸지 않고 통과 시점을 늦추어 가시선을 유지하였으며, 반환된 궤적은 재검증에서 제약을 만족하였다.</w:t>
       </w:r>
     </w:p>
     <w:p>
@@ -3146,7 +3155,7 @@
         <w:pStyle w:val="ab"/>
       </w:pPr>
       <w:r>
-        <w:t xml:space="preserve">얻는 해는 초기값에 의존하는 국소해이며, 장애물의 운동은 알려져 있다고 가정한다. 리프팅된 KOZ의 시간 방향 두께가 낳는 보수성은 도착 시각을 하한보다 늦추므로, 시간 축 척도의 선택과 장애물 운동의 불확실성을 반영한 확률적 KOZ, receding horizon 구성으로의 확장을 향후 과제로 둔다.</w:t>
+        <w:t xml:space="preserve">얻는 해는 초기값에 의존하는 국소해이며, 장애물의 운동은 알려져 있다고 가정한다. 리프팅된 KOZ의 시간 방향 두께는 도착을 하한보다 늦추므로, 시간 축 척도의 선택과 장애물 운동의 불확실성을 반영한 확률적 KOZ, receding horizon 구성을 향후 과제로 둔다.</w:t>
       </w:r>
     </w:p>
     <w:p>
@@ -3188,7 +3197,7 @@
         </w:rPr>
       </w:pPr>
       <w:r>
-        <w:t xml:space="preserve">1)Marcucci, T., Petersen, M., von Wrangel, D., and Tedrake, R., “Motion Planning around Obstacles with Convex Optimization,” Science Robotics, 8(84), 2023.</w:t>
+        <w:t xml:space="preserve">1)Marcucci, T., et al., “Motion Planning around Obstacles with Convex Optimization,” Science Robotics, 8(84), 2023.</w:t>
       </w:r>
     </w:p>
     <w:p>
@@ -3200,7 +3209,19 @@
         </w:rPr>
       </w:pPr>
       <w:r>
-        <w:t xml:space="preserve">2)Osburn, M. D., Peterson, C. K., and Salmon, J. L., “Systematic Constraint Formulation and Collision-Free Trajectory Planning Using Space-Time Graphs of Convex Sets,” arXiv:2508.10203, 2025.</w:t>
+        <w:t xml:space="preserve">2)Osburn, M. D., et al., “Systematic Constraint Formulation and Collision-Free Trajectory Planning Using Space-Time Graphs of Convex Sets,” arXiv:2508.10203, 2025.</w:t>
+      </w:r>
+    </w:p>
+    <w:p>
+      <w:pPr>
+        <w:pStyle w:val="ae"/>
+        <w:rPr>
+          <w:sz w:val="18"/>
+          <w:szCs w:val="18"/>
+        </w:rPr>
+      </w:pPr>
+      <w:r>
+        <w:t xml:space="preserve">3)Jeong, H.-Y., and Lee, S., “Orbital Transfer Trajectory Design Method Using Bézier Curves,” Proc. KSAS Fall Conference, 2025.</w:t>
       </w:r>
     </w:p>
     <w:sectPr>

</xml_diff>